<commit_message>
docs: refine overview (drop disclaimer + 5.2, fix tables)
Made-with: Cursor
</commit_message>
<xml_diff>
--- a/docs/Incepedia-Overview.docx
+++ b/docs/Incepedia-Overview.docx
@@ -74,30 +74,6 @@
       </w:r>
     </w:p>
     <w:p>
-      <w:pPr>
-        <w:pStyle w:val="BlockText"/>
-      </w:pPr>
-      <w:r>
-        <w:t xml:space="preserve">本文件由 agent 从历史对话中</w:t>
-      </w:r>
-      <w:r>
-        <w:rPr>
-          <w:bCs/>
-          <w:b/>
-        </w:rPr>
-        <w:t xml:space="preserve">原封不动</w:t>
-      </w:r>
-      <w:r>
-        <w:t xml:space="preserve">抽取拼接,按汇报逻辑重新组织。</w:t>
-      </w:r>
-      <w:r>
-        <w:t xml:space="preserve"> </w:t>
-      </w:r>
-      <w:r>
-        <w:t xml:space="preserve">每节标题下方的内容均为对话原文。</w:t>
-      </w:r>
-    </w:p>
-    <w:p>
       <w:r>
         <w:pict>
           <v:rect style="width:0;height:1.5pt" o:hralign="center" o:hrstd="t" o:hr="t"/>
@@ -112,14 +88,6 @@
       </w:pPr>
       <w:r>
         <w:t xml:space="preserve">1. 当前 Cosmopedia 的局限性</w:t>
-      </w:r>
-    </w:p>
-    <w:p>
-      <w:pPr>
-        <w:pStyle w:val="FirstParagraph"/>
-      </w:pPr>
-      <w:r>
-        <w:t xml:space="preserve">(以下文字摘自《Cosmopedia 全貌》调研第 1.5 节)</w:t>
       </w:r>
     </w:p>
     <w:p>
@@ -417,330 +385,6 @@
       </w:pPr>
       <w:r>
         <w:t xml:space="preserve">2.3 三阶段路线图</w:t>
-      </w:r>
-    </w:p>
-    <w:tbl>
-      <w:tblPr>
-        <w:tblStyle w:val="Table"/>
-        <w:tblW w:type="pct" w:w="5000"/>
-        <w:tblLook w:firstRow="1" w:lastRow="0" w:firstColumn="0" w:lastColumn="0" w:noHBand="0" w:noVBand="0" w:val="0020"/>
-        <w:jc w:val="start"/>
-      </w:tblPr>
-      <w:tblGrid>
-        <w:gridCol w:w="1980"/>
-        <w:gridCol w:w="1980"/>
-        <w:gridCol w:w="1980"/>
-        <w:gridCol w:w="1980"/>
-      </w:tblGrid>
-      <w:tr>
-        <w:trPr>
-          <w:tblHeader w:val="true"/>
-        </w:trPr>
-        <w:tc>
-          <w:tcPr/>
-          <w:p>
-            <w:pPr>
-              <w:pStyle w:val="Compact"/>
-              <w:jc w:val="left"/>
-            </w:pPr>
-            <w:r>
-              <w:t xml:space="preserve">阶段</w:t>
-            </w:r>
-          </w:p>
-        </w:tc>
-        <w:tc>
-          <w:tcPr/>
-          <w:p>
-            <w:pPr>
-              <w:pStyle w:val="Compact"/>
-              <w:jc w:val="left"/>
-            </w:pPr>
-            <w:r>
-              <w:t xml:space="preserve">时长</w:t>
-            </w:r>
-          </w:p>
-        </w:tc>
-        <w:tc>
-          <w:tcPr/>
-          <w:p>
-            <w:pPr>
-              <w:pStyle w:val="Compact"/>
-              <w:jc w:val="left"/>
-            </w:pPr>
-            <w:r>
-              <w:t xml:space="preserve">目标</w:t>
-            </w:r>
-          </w:p>
-        </w:tc>
-        <w:tc>
-          <w:tcPr/>
-          <w:p>
-            <w:pPr>
-              <w:pStyle w:val="Compact"/>
-              <w:jc w:val="left"/>
-            </w:pPr>
-            <w:r>
-              <w:t xml:space="preserve">成功标准</w:t>
-            </w:r>
-          </w:p>
-        </w:tc>
-      </w:tr>
-      <w:tr>
-        <w:tc>
-          <w:tcPr/>
-          <w:p>
-            <w:pPr>
-              <w:pStyle w:val="Compact"/>
-              <w:jc w:val="left"/>
-            </w:pPr>
-            <w:r>
-              <w:rPr>
-                <w:bCs/>
-                <w:b/>
-              </w:rPr>
-              <w:t xml:space="preserve">P1 · 复现</w:t>
-            </w:r>
-          </w:p>
-        </w:tc>
-        <w:tc>
-          <w:tcPr/>
-          <w:p>
-            <w:pPr>
-              <w:pStyle w:val="Compact"/>
-              <w:jc w:val="left"/>
-            </w:pPr>
-            <w:r>
-              <w:t xml:space="preserve">2–3 周</w:t>
-            </w:r>
-          </w:p>
-        </w:tc>
-        <w:tc>
-          <w:tcPr/>
-          <w:p>
-            <w:pPr>
-              <w:pStyle w:val="Compact"/>
-              <w:jc w:val="left"/>
-            </w:pPr>
-            <w:r>
-              <w:t xml:space="preserve">复现 Cosmopedia v2 在 Track 2 + Cosmopedia v1 在 Track 1 的基线</w:t>
-            </w:r>
-          </w:p>
-        </w:tc>
-        <w:tc>
-          <w:tcPr/>
-          <w:p>
-            <w:pPr>
-              <w:pStyle w:val="Compact"/>
-              <w:jc w:val="left"/>
-            </w:pPr>
-            <w:r>
-              <w:t xml:space="preserve">分数对齐公开数字 ±0.5pp</w:t>
-            </w:r>
-          </w:p>
-        </w:tc>
-      </w:tr>
-      <w:tr>
-        <w:tc>
-          <w:tcPr/>
-          <w:p>
-            <w:pPr>
-              <w:pStyle w:val="Compact"/>
-              <w:jc w:val="left"/>
-            </w:pPr>
-            <w:r>
-              <w:rPr>
-                <w:bCs/>
-                <w:b/>
-              </w:rPr>
-              <w:t xml:space="preserve">P2 · PoC</w:t>
-            </w:r>
-          </w:p>
-        </w:tc>
-        <w:tc>
-          <w:tcPr/>
-          <w:p>
-            <w:pPr>
-              <w:pStyle w:val="Compact"/>
-              <w:jc w:val="left"/>
-            </w:pPr>
-            <w:r>
-              <w:t xml:space="preserve">4–6 周</w:t>
-            </w:r>
-          </w:p>
-        </w:tc>
-        <w:tc>
-          <w:tcPr/>
-          <w:p>
-            <w:pPr>
-              <w:pStyle w:val="Compact"/>
-              <w:jc w:val="left"/>
-            </w:pPr>
-            <w:r>
-              <w:t xml:space="preserve">3B token Incepedia v0.1</w:t>
-            </w:r>
-          </w:p>
-        </w:tc>
-        <w:tc>
-          <w:tcPr/>
-          <w:p>
-            <w:pPr>
-              <w:pStyle w:val="Compact"/>
-              <w:jc w:val="left"/>
-            </w:pPr>
-            <w:r>
-              <w:t xml:space="preserve">两轨均持平或超越 Cosmopedia</w:t>
-            </w:r>
-          </w:p>
-        </w:tc>
-      </w:tr>
-      <w:tr>
-        <w:tc>
-          <w:tcPr/>
-          <w:p>
-            <w:pPr>
-              <w:pStyle w:val="Compact"/>
-              <w:jc w:val="left"/>
-            </w:pPr>
-            <w:r>
-              <w:rPr>
-                <w:bCs/>
-                <w:b/>
-              </w:rPr>
-              <w:t xml:space="preserve">P3 · 迭代+扩容</w:t>
-            </w:r>
-          </w:p>
-        </w:tc>
-        <w:tc>
-          <w:tcPr/>
-          <w:p>
-            <w:pPr>
-              <w:pStyle w:val="Compact"/>
-              <w:jc w:val="left"/>
-            </w:pPr>
-            <w:r>
-              <w:t xml:space="preserve">2–3 月</w:t>
-            </w:r>
-          </w:p>
-        </w:tc>
-        <w:tc>
-          <w:tcPr/>
-          <w:p>
-            <w:pPr>
-              <w:pStyle w:val="Compact"/>
-              <w:jc w:val="left"/>
-            </w:pPr>
-            <w:r>
-              <w:t xml:space="preserve">10B–30B token Incepedia v1.0</w:t>
-            </w:r>
-          </w:p>
-        </w:tc>
-        <w:tc>
-          <w:tcPr/>
-          <w:p>
-            <w:pPr>
-              <w:pStyle w:val="Compact"/>
-              <w:jc w:val="left"/>
-            </w:pPr>
-            <w:r>
-              <w:t xml:space="preserve">两轨显著超越,逼近 SmolLM2</w:t>
-            </w:r>
-          </w:p>
-        </w:tc>
-      </w:tr>
-    </w:tbl>
-    <w:p>
-      <w:r>
-        <w:pict>
-          <v:rect style="width:0;height:1.5pt" o:hralign="center" o:hrstd="t" o:hr="t"/>
-        </w:pict>
-      </w:r>
-    </w:p>
-    <w:bookmarkEnd w:id="24"/>
-    <w:bookmarkEnd w:id="25"/>
-    <w:bookmarkStart w:id="26" w:name="incepedia-执行方案总体战略"/>
-    <w:p>
-      <w:pPr>
-        <w:pStyle w:val="Heading1"/>
-      </w:pPr>
-      <w:r>
-        <w:t xml:space="preserve">3. Incepedia 执行方案总体战略</w:t>
-      </w:r>
-    </w:p>
-    <w:p>
-      <w:pPr>
-        <w:pStyle w:val="BlockText"/>
-      </w:pPr>
-      <w:r>
-        <w:t xml:space="preserve">总体战略:</w:t>
-      </w:r>
-      <w:r>
-        <w:rPr>
-          <w:bCs/>
-          <w:b/>
-        </w:rPr>
-        <w:t xml:space="preserve">复现 → 替换 → 闭环</w:t>
-      </w:r>
-      <w:r>
-        <w:t xml:space="preserve">,科学方法论 =</w:t>
-      </w:r>
-      <w:r>
-        <w:t xml:space="preserve"> </w:t>
-      </w:r>
-      <w:r>
-        <w:t xml:space="preserve">“</w:t>
-      </w:r>
-      <w:r>
-        <w:t xml:space="preserve">只动一个变量,看分数变化</w:t>
-      </w:r>
-      <w:r>
-        <w:t xml:space="preserve">”</w:t>
-      </w:r>
-      <w:r>
-        <w:t xml:space="preserve">。</w:t>
-      </w:r>
-    </w:p>
-    <w:p>
-      <w:r>
-        <w:pict>
-          <v:rect style="width:0;height:1.5pt" o:hralign="center" o:hrstd="t" o:hr="t"/>
-        </w:pict>
-      </w:r>
-    </w:p>
-    <w:bookmarkEnd w:id="26"/>
-    <w:bookmarkStart w:id="29" w:name="第一步-百分百复现-cosmopedia-的训练评测管线原文-3.1.1"/>
-    <w:p>
-      <w:pPr>
-        <w:pStyle w:val="Heading1"/>
-      </w:pPr>
-      <w:r>
-        <w:t xml:space="preserve">4. 第一步 · 百分百复现 Cosmopedia 的训练‑评测管线(原文 §3.1.1)</w:t>
-      </w:r>
-    </w:p>
-    <w:p>
-      <w:pPr>
-        <w:pStyle w:val="FirstParagraph"/>
-      </w:pPr>
-      <w:r>
-        <w:t xml:space="preserve">目标:</w:t>
-      </w:r>
-      <w:r>
-        <w:rPr>
-          <w:bCs/>
-          <w:b/>
-        </w:rPr>
-        <w:t xml:space="preserve">搭一个”无新意但 100% 一致”的 reference pipeline</w:t>
-      </w:r>
-      <w:r>
-        <w:t xml:space="preserve">,后续所有实验都跑在它之上,排除非数据因素。</w:t>
-      </w:r>
-    </w:p>
-    <w:bookmarkStart w:id="27" w:name="Xa3bf52df37fc4912eb5043f7b443d16f489c21e"/>
-    <w:p>
-      <w:pPr>
-        <w:pStyle w:val="Heading2"/>
-      </w:pPr>
-      <w:r>
-        <w:t xml:space="preserve">4.1 锁定 reference 配方(强烈建议直接对齐 SmolLM/Cosmo‑v2 的 ablation 设置,而不是 v1 的 6‑epoch 训练)</w:t>
       </w:r>
     </w:p>
     <w:tbl>
@@ -767,31 +411,31 @@
               <w:jc w:val="left"/>
             </w:pPr>
             <w:r>
-              <w:t xml:space="preserve">项</w:t>
-            </w:r>
-          </w:p>
-        </w:tc>
-        <w:tc>
-          <w:tcPr/>
-          <w:p>
-            <w:pPr>
-              <w:pStyle w:val="Compact"/>
-              <w:jc w:val="left"/>
-            </w:pPr>
-            <w:r>
-              <w:t xml:space="preserve">选择</w:t>
-            </w:r>
-          </w:p>
-        </w:tc>
-        <w:tc>
-          <w:tcPr/>
-          <w:p>
-            <w:pPr>
-              <w:pStyle w:val="Compact"/>
-              <w:jc w:val="left"/>
-            </w:pPr>
-            <w:r>
-              <w:t xml:space="preserve">理由</w:t>
+              <w:t xml:space="preserve">阶段</w:t>
+            </w:r>
+          </w:p>
+        </w:tc>
+        <w:tc>
+          <w:tcPr/>
+          <w:p>
+            <w:pPr>
+              <w:pStyle w:val="Compact"/>
+              <w:jc w:val="left"/>
+            </w:pPr>
+            <w:r>
+              <w:t xml:space="preserve">目标</w:t>
+            </w:r>
+          </w:p>
+        </w:tc>
+        <w:tc>
+          <w:tcPr/>
+          <w:p>
+            <w:pPr>
+              <w:pStyle w:val="Compact"/>
+              <w:jc w:val="left"/>
+            </w:pPr>
+            <w:r>
+              <w:t xml:space="preserve">成功标准</w:t>
             </w:r>
           </w:p>
         </w:tc>
@@ -805,121 +449,35 @@
               <w:jc w:val="left"/>
             </w:pPr>
             <w:r>
-              <w:t xml:space="preserve">训练框架</w:t>
-            </w:r>
-          </w:p>
-        </w:tc>
-        <w:tc>
-          <w:tcPr/>
-          <w:p>
-            <w:pPr>
-              <w:pStyle w:val="Compact"/>
-              <w:jc w:val="left"/>
-            </w:pPr>
-            <w:r>
               <w:rPr>
-                <w:rStyle w:val="VerbatimChar"/>
-              </w:rPr>
-              <w:t xml:space="preserve">nanotron</w:t>
-            </w:r>
-          </w:p>
-        </w:tc>
-        <w:tc>
-          <w:tcPr/>
-          <w:p>
-            <w:pPr>
-              <w:pStyle w:val="Compact"/>
-              <w:jc w:val="left"/>
-            </w:pPr>
-            <w:r>
-              <w:t xml:space="preserve">Cosmopedia/SmolLM 官方栈,checkpoint 可分叉</w:t>
-            </w:r>
-          </w:p>
-        </w:tc>
-      </w:tr>
-      <w:tr>
-        <w:tc>
-          <w:tcPr/>
-          <w:p>
-            <w:pPr>
-              <w:pStyle w:val="Compact"/>
-              <w:jc w:val="left"/>
-            </w:pPr>
-            <w:r>
-              <w:t xml:space="preserve">模型</w:t>
-            </w:r>
-          </w:p>
-        </w:tc>
-        <w:tc>
-          <w:tcPr/>
-          <w:p>
-            <w:pPr>
-              <w:pStyle w:val="Compact"/>
-              <w:jc w:val="left"/>
-            </w:pPr>
-            <w:r>
-              <w:t xml:space="preserve">Llama2‑1.82B(等同 FineWeb ablation 模型)</w:t>
-            </w:r>
-          </w:p>
-        </w:tc>
-        <w:tc>
-          <w:tcPr/>
-          <w:p>
-            <w:pPr>
-              <w:pStyle w:val="Compact"/>
-              <w:jc w:val="left"/>
-            </w:pPr>
-            <w:r>
-              <w:t xml:space="preserve">行业事实基线;cosmo‑1b 同档;成本合理</w:t>
-            </w:r>
-          </w:p>
-        </w:tc>
-      </w:tr>
-      <w:tr>
-        <w:tc>
-          <w:tcPr/>
-          <w:p>
-            <w:pPr>
-              <w:pStyle w:val="Compact"/>
-              <w:jc w:val="left"/>
-            </w:pPr>
-            <w:r>
-              <w:t xml:space="preserve">Tokenizer</w:t>
-            </w:r>
-          </w:p>
-        </w:tc>
-        <w:tc>
-          <w:tcPr/>
-          <w:p>
-            <w:pPr>
-              <w:pStyle w:val="Compact"/>
-              <w:jc w:val="left"/>
-            </w:pPr>
-            <w:r>
-              <w:rPr>
-                <w:rStyle w:val="VerbatimChar"/>
                 <w:bCs/>
                 <w:b/>
               </w:rPr>
-              <w:t xml:space="preserve">mistralai/Mistral‑7B‑v0.1</w:t>
-            </w:r>
-            <w:r>
-              <w:t xml:space="preserve"> </w:t>
-            </w:r>
-            <w:r>
-              <w:t xml:space="preserve">的 tokenizer(v1)或 SmolLM 自有 tokenizer(v2)</w:t>
-            </w:r>
-          </w:p>
-        </w:tc>
-        <w:tc>
-          <w:tcPr/>
-          <w:p>
-            <w:pPr>
-              <w:pStyle w:val="Compact"/>
-              <w:jc w:val="left"/>
-            </w:pPr>
-            <w:r>
-              <w:t xml:space="preserve">与目标 baseline 完全一致</w:t>
+              <w:t xml:space="preserve">P1 · 复现</w:t>
+            </w:r>
+          </w:p>
+        </w:tc>
+        <w:tc>
+          <w:tcPr/>
+          <w:p>
+            <w:pPr>
+              <w:pStyle w:val="Compact"/>
+              <w:jc w:val="left"/>
+            </w:pPr>
+            <w:r>
+              <w:t xml:space="preserve">复现 Cosmopedia v2 在 Track 2 + Cosmopedia v1 在 Track 1 的基线</w:t>
+            </w:r>
+          </w:p>
+        </w:tc>
+        <w:tc>
+          <w:tcPr/>
+          <w:p>
+            <w:pPr>
+              <w:pStyle w:val="Compact"/>
+              <w:jc w:val="left"/>
+            </w:pPr>
+            <w:r>
+              <w:t xml:space="preserve">分数对齐公开数字 ±0.5pp</w:t>
             </w:r>
           </w:p>
         </w:tc>
@@ -933,31 +491,35 @@
               <w:jc w:val="left"/>
             </w:pPr>
             <w:r>
-              <w:t xml:space="preserve">Token 量</w:t>
-            </w:r>
-          </w:p>
-        </w:tc>
-        <w:tc>
-          <w:tcPr/>
-          <w:p>
-            <w:pPr>
-              <w:pStyle w:val="Compact"/>
-              <w:jc w:val="left"/>
-            </w:pPr>
-            <w:r>
-              <w:t xml:space="preserve">30B(快速 ablation)+ 100B(中验证)+ 350B(终验)</w:t>
-            </w:r>
-          </w:p>
-        </w:tc>
-        <w:tc>
-          <w:tcPr/>
-          <w:p>
-            <w:pPr>
-              <w:pStyle w:val="Compact"/>
-              <w:jc w:val="left"/>
-            </w:pPr>
-            <w:r>
-              <w:t xml:space="preserve">三档分别对应 ~$几k/几万/几十万的算力预算</w:t>
+              <w:rPr>
+                <w:bCs/>
+                <w:b/>
+              </w:rPr>
+              <w:t xml:space="preserve">P2 · PoC</w:t>
+            </w:r>
+          </w:p>
+        </w:tc>
+        <w:tc>
+          <w:tcPr/>
+          <w:p>
+            <w:pPr>
+              <w:pStyle w:val="Compact"/>
+              <w:jc w:val="left"/>
+            </w:pPr>
+            <w:r>
+              <w:t xml:space="preserve">3B token Incepedia v0.1</w:t>
+            </w:r>
+          </w:p>
+        </w:tc>
+        <w:tc>
+          <w:tcPr/>
+          <w:p>
+            <w:pPr>
+              <w:pStyle w:val="Compact"/>
+              <w:jc w:val="left"/>
+            </w:pPr>
+            <w:r>
+              <w:t xml:space="preserve">两轨均持平或超越 Cosmopedia</w:t>
             </w:r>
           </w:p>
         </w:tc>
@@ -971,551 +533,40 @@
               <w:jc w:val="left"/>
             </w:pPr>
             <w:r>
-              <w:t xml:space="preserve">Seq len / GBS</w:t>
-            </w:r>
-          </w:p>
-        </w:tc>
-        <w:tc>
-          <w:tcPr/>
-          <w:p>
-            <w:pPr>
-              <w:pStyle w:val="Compact"/>
-              <w:jc w:val="left"/>
-            </w:pPr>
-            <w:r>
-              <w:t xml:space="preserve">2048 / 1.3M tokens</w:t>
-            </w:r>
-          </w:p>
-        </w:tc>
-        <w:tc>
-          <w:tcPr/>
-          <w:p>
-            <w:pPr>
-              <w:pStyle w:val="Compact"/>
-              <w:jc w:val="left"/>
-            </w:pPr>
-            <w:r>
-              <w:t xml:space="preserve">与 Cosmo‑1B、SmolLM 一致</w:t>
-            </w:r>
-          </w:p>
-        </w:tc>
-      </w:tr>
-      <w:tr>
-        <w:tc>
-          <w:tcPr/>
-          <w:p>
-            <w:pPr>
-              <w:pStyle w:val="Compact"/>
-              <w:jc w:val="left"/>
-            </w:pPr>
-            <w:r>
-              <w:t xml:space="preserve">LR</w:t>
-            </w:r>
-          </w:p>
-        </w:tc>
-        <w:tc>
-          <w:tcPr/>
-          <w:p>
-            <w:pPr>
-              <w:pStyle w:val="Compact"/>
-              <w:jc w:val="left"/>
-            </w:pPr>
-            <w:r>
-              <w:t xml:space="preserve">3e‑4 cosine(完全复现 v1)+ 备选 trapezoidal(v2 风格,可在 cooldown 阶段做配方实验)</w:t>
-            </w:r>
-          </w:p>
-        </w:tc>
-        <w:tc>
-          <w:tcPr/>
-          <w:p>
-            <w:pPr>
-              <w:pStyle w:val="Compact"/>
-              <w:jc w:val="left"/>
-            </w:pPr>
-            <w:r>
-              <w:t xml:space="preserve">trapezoidal 更适合 ablation,不需要重训整段</w:t>
-            </w:r>
-          </w:p>
-        </w:tc>
-      </w:tr>
-      <w:tr>
-        <w:tc>
-          <w:tcPr/>
-          <w:p>
-            <w:pPr>
-              <w:pStyle w:val="Compact"/>
-              <w:jc w:val="left"/>
-            </w:pPr>
-            <w:r>
-              <w:t xml:space="preserve">Seeds</w:t>
-            </w:r>
-          </w:p>
-        </w:tc>
-        <w:tc>
-          <w:tcPr/>
-          <w:p>
-            <w:pPr>
-              <w:pStyle w:val="Compact"/>
-              <w:jc w:val="left"/>
-            </w:pPr>
-            <w:r>
-              <w:t xml:space="preserve">至少 2 个(42, 1337)</w:t>
-            </w:r>
-          </w:p>
-        </w:tc>
-        <w:tc>
-          <w:tcPr/>
-          <w:p>
-            <w:pPr>
-              <w:pStyle w:val="Compact"/>
-              <w:jc w:val="left"/>
-            </w:pPr>
-            <w:r>
-              <w:t xml:space="preserve">行业标准</w:t>
-            </w:r>
-          </w:p>
-        </w:tc>
-      </w:tr>
-      <w:tr>
-        <w:tc>
-          <w:tcPr/>
-          <w:p>
-            <w:pPr>
-              <w:pStyle w:val="Compact"/>
-              <w:jc w:val="left"/>
-            </w:pPr>
-            <w:r>
-              <w:t xml:space="preserve">Eval</w:t>
-            </w:r>
-          </w:p>
-        </w:tc>
-        <w:tc>
-          <w:tcPr/>
-          <w:p>
-            <w:pPr>
-              <w:pStyle w:val="Compact"/>
-              <w:jc w:val="left"/>
-            </w:pPr>
-            <w:r>
               <w:rPr>
-                <w:rStyle w:val="VerbatimChar"/>
+                <w:bCs/>
+                <w:b/>
               </w:rPr>
-              <w:t xml:space="preserve">lighteval</w:t>
-            </w:r>
-            <w:r>
-              <w:t xml:space="preserve"> </w:t>
-            </w:r>
-            <w:r>
-              <w:t xml:space="preserve">+</w:t>
-            </w:r>
-            <w:r>
-              <w:t xml:space="preserve"> </w:t>
-            </w:r>
-            <w:r>
-              <w:rPr>
-                <w:rStyle w:val="VerbatimChar"/>
-              </w:rPr>
-              <w:t xml:space="preserve">cosmopedia/evaluation/lighteval_tasks.py</w:t>
-            </w:r>
-            <w:r>
-              <w:t xml:space="preserve"> </w:t>
-            </w:r>
-            <w:r>
-              <w:t xml:space="preserve">完全照搬</w:t>
-            </w:r>
-          </w:p>
-        </w:tc>
-        <w:tc>
-          <w:tcPr/>
-          <w:p>
-            <w:pPr>
-              <w:pStyle w:val="Compact"/>
-              <w:jc w:val="left"/>
-            </w:pPr>
-            <w:r>
-              <w:t xml:space="preserve">评测脚本零修改</w:t>
+              <w:t xml:space="preserve">P3 · 迭代+扩容</w:t>
+            </w:r>
+          </w:p>
+        </w:tc>
+        <w:tc>
+          <w:tcPr/>
+          <w:p>
+            <w:pPr>
+              <w:pStyle w:val="Compact"/>
+              <w:jc w:val="left"/>
+            </w:pPr>
+            <w:r>
+              <w:t xml:space="preserve">10B–30B token Incepedia v1.0</w:t>
+            </w:r>
+          </w:p>
+        </w:tc>
+        <w:tc>
+          <w:tcPr/>
+          <w:p>
+            <w:pPr>
+              <w:pStyle w:val="Compact"/>
+              <w:jc w:val="left"/>
+            </w:pPr>
+            <w:r>
+              <w:t xml:space="preserve">两轨显著超越,逼近 SmolLM2</w:t>
             </w:r>
           </w:p>
         </w:tc>
       </w:tr>
     </w:tbl>
-    <w:bookmarkEnd w:id="27"/>
-    <w:bookmarkStart w:id="28" w:name="落地-checklist按顺序"/>
-    <w:p>
-      <w:pPr>
-        <w:pStyle w:val="Heading2"/>
-      </w:pPr>
-      <w:r>
-        <w:t xml:space="preserve">4.2 落地 checklist(按顺序)</w:t>
-      </w:r>
-    </w:p>
-    <w:p>
-      <w:pPr>
-        <w:numPr>
-          <w:ilvl w:val="0"/>
-          <w:numId w:val="1003"/>
-        </w:numPr>
-        <w:pStyle w:val="Compact"/>
-      </w:pPr>
-      <w:r>
-        <w:rPr>
-          <w:rStyle w:val="VerbatimChar"/>
-        </w:rPr>
-        <w:t xml:space="preserve">git clone</w:t>
-      </w:r>
-      <w:r>
-        <w:t xml:space="preserve"> </w:t>
-      </w:r>
-      <w:r>
-        <w:t xml:space="preserve">三件套到</w:t>
-      </w:r>
-      <w:r>
-        <w:t xml:space="preserve"> </w:t>
-      </w:r>
-      <w:r>
-        <w:rPr>
-          <w:rStyle w:val="VerbatimChar"/>
-        </w:rPr>
-        <w:t xml:space="preserve">Incepedia/</w:t>
-      </w:r>
-      <w:r>
-        <w:t xml:space="preserve"> </w:t>
-      </w:r>
-      <w:r>
-        <w:t xml:space="preserve">仓库:</w:t>
-      </w:r>
-      <w:r>
-        <w:rPr>
-          <w:rStyle w:val="VerbatimChar"/>
-        </w:rPr>
-        <w:t xml:space="preserve">nanotron</w:t>
-      </w:r>
-      <w:r>
-        <w:t xml:space="preserve">、</w:t>
-      </w:r>
-      <w:r>
-        <w:rPr>
-          <w:rStyle w:val="VerbatimChar"/>
-        </w:rPr>
-        <w:t xml:space="preserve">lighteval</w:t>
-      </w:r>
-      <w:r>
-        <w:t xml:space="preserve">、</w:t>
-      </w:r>
-      <w:r>
-        <w:rPr>
-          <w:rStyle w:val="VerbatimChar"/>
-        </w:rPr>
-        <w:t xml:space="preserve">huggingface/cosmopedia</w:t>
-      </w:r>
-      <w:r>
-        <w:t xml:space="preserve">(取 prompts/eval/decontamination 目录)。</w:t>
-      </w:r>
-    </w:p>
-    <w:p>
-      <w:pPr>
-        <w:numPr>
-          <w:ilvl w:val="0"/>
-          <w:numId w:val="1003"/>
-        </w:numPr>
-        <w:pStyle w:val="Compact"/>
-      </w:pPr>
-      <w:r>
-        <w:t xml:space="preserve">复刻数据预处理:用</w:t>
-      </w:r>
-      <w:r>
-        <w:t xml:space="preserve"> </w:t>
-      </w:r>
-      <w:r>
-        <w:rPr>
-          <w:rStyle w:val="VerbatimChar"/>
-        </w:rPr>
-        <w:t xml:space="preserve">datatrove</w:t>
-      </w:r>
-      <w:r>
-        <w:t xml:space="preserve"> </w:t>
-      </w:r>
-      <w:r>
-        <w:t xml:space="preserve">做 tokenization →</w:t>
-      </w:r>
-      <w:r>
-        <w:t xml:space="preserve"> </w:t>
-      </w:r>
-      <w:r>
-        <w:rPr>
-          <w:rStyle w:val="VerbatimChar"/>
-        </w:rPr>
-        <w:t xml:space="preserve">nanotron</w:t>
-      </w:r>
-      <w:r>
-        <w:t xml:space="preserve"> </w:t>
-      </w:r>
-      <w:r>
-        <w:t xml:space="preserve">shard 格式。</w:t>
-      </w:r>
-    </w:p>
-    <w:p>
-      <w:pPr>
-        <w:numPr>
-          <w:ilvl w:val="0"/>
-          <w:numId w:val="1003"/>
-        </w:numPr>
-        <w:pStyle w:val="Compact"/>
-      </w:pPr>
-      <w:r>
-        <w:rPr>
-          <w:bCs/>
-          <w:b/>
-        </w:rPr>
-        <w:t xml:space="preserve">冒烟基线 1</w:t>
-      </w:r>
-      <w:r>
-        <w:t xml:space="preserve">:用</w:t>
-      </w:r>
-      <w:r>
-        <w:t xml:space="preserve"> </w:t>
-      </w:r>
-      <w:r>
-        <w:rPr>
-          <w:bCs/>
-          <w:b/>
-        </w:rPr>
-        <w:t xml:space="preserve">公开的</w:t>
-      </w:r>
-      <w:r>
-        <w:rPr>
-          <w:bCs/>
-          <w:b/>
-        </w:rPr>
-        <w:t xml:space="preserve"> </w:t>
-      </w:r>
-      <w:r>
-        <w:rPr>
-          <w:rStyle w:val="VerbatimChar"/>
-          <w:bCs/>
-          <w:b/>
-        </w:rPr>
-        <w:t xml:space="preserve">cosmopedia‑v2</w:t>
-      </w:r>
-      <w:r>
-        <w:t xml:space="preserve"> </w:t>
-      </w:r>
-      <w:r>
-        <w:t xml:space="preserve">全量训 30B tokens × 2 seeds → 在 lighteval 早信号组上得到 reference 分数,与 SmolLM blog 中 Mixture11 的数字对齐(±0.5pp 以内才算对得上)。</w:t>
-      </w:r>
-    </w:p>
-    <w:p>
-      <w:pPr>
-        <w:numPr>
-          <w:ilvl w:val="0"/>
-          <w:numId w:val="1003"/>
-        </w:numPr>
-        <w:pStyle w:val="Compact"/>
-      </w:pPr>
-      <w:r>
-        <w:rPr>
-          <w:bCs/>
-          <w:b/>
-        </w:rPr>
-        <w:t xml:space="preserve">冒烟基线 2</w:t>
-      </w:r>
-      <w:r>
-        <w:t xml:space="preserve">:同样设置训</w:t>
-      </w:r>
-      <w:r>
-        <w:t xml:space="preserve"> </w:t>
-      </w:r>
-      <w:r>
-        <w:rPr>
-          <w:rStyle w:val="VerbatimChar"/>
-        </w:rPr>
-        <w:t xml:space="preserve">FineWeb-Edu</w:t>
-      </w:r>
-      <w:r>
-        <w:t xml:space="preserve"> </w:t>
-      </w:r>
-      <w:r>
-        <w:t xml:space="preserve">30B → 对齐</w:t>
-      </w:r>
-      <w:r>
-        <w:t xml:space="preserve"> </w:t>
-      </w:r>
-      <w:r>
-        <w:rPr>
-          <w:rStyle w:val="VerbatimChar"/>
-        </w:rPr>
-        <w:t xml:space="preserve">HuggingFaceFW/ablation-model-fineweb-edu</w:t>
-      </w:r>
-      <w:r>
-        <w:t xml:space="preserve"> </w:t>
-      </w:r>
-      <w:r>
-        <w:t xml:space="preserve">数字。</w:t>
-      </w:r>
-    </w:p>
-    <w:p>
-      <w:pPr>
-        <w:numPr>
-          <w:ilvl w:val="1"/>
-          <w:numId w:val="1004"/>
-        </w:numPr>
-        <w:pStyle w:val="Compact"/>
-      </w:pPr>
-      <w:r>
-        <w:t xml:space="preserve">这两个对齐过了,你的 reference 管线才能宣告”可信”。</w:t>
-      </w:r>
-    </w:p>
-    <w:p>
-      <w:pPr>
-        <w:numPr>
-          <w:ilvl w:val="0"/>
-          <w:numId w:val="1003"/>
-        </w:numPr>
-        <w:pStyle w:val="Compact"/>
-      </w:pPr>
-      <w:r>
-        <w:rPr>
-          <w:bCs/>
-          <w:b/>
-        </w:rPr>
-        <w:t xml:space="preserve">Checkpoint 策略</w:t>
-      </w:r>
-      <w:r>
-        <w:t xml:space="preserve">:</w:t>
-      </w:r>
-      <w:r>
-        <w:rPr>
-          <w:rStyle w:val="VerbatimChar"/>
-        </w:rPr>
-        <w:t xml:space="preserve">nanotron</w:t>
-      </w:r>
-      <w:r>
-        <w:t xml:space="preserve"> </w:t>
-      </w:r>
-      <w:r>
-        <w:t xml:space="preserve">默认每 N 步存一份;</w:t>
-      </w:r>
-      <w:r>
-        <w:rPr>
-          <w:bCs/>
-          <w:b/>
-        </w:rPr>
-        <w:t xml:space="preserve">强制每 2B token 存一次,并在 6/12/18/24/30B 五个节点上各做 lighteval</w:t>
-      </w:r>
-      <w:r>
-        <w:t xml:space="preserve">——这就是后续所有 Incepedia 分叉实验的”早期信号 dashboard”。</w:t>
-      </w:r>
-    </w:p>
-    <w:p>
-      <w:pPr>
-        <w:numPr>
-          <w:ilvl w:val="0"/>
-          <w:numId w:val="1003"/>
-        </w:numPr>
-        <w:pStyle w:val="Compact"/>
-      </w:pPr>
-      <w:r>
-        <w:rPr>
-          <w:bCs/>
-          <w:b/>
-        </w:rPr>
-        <w:t xml:space="preserve">去污染</w:t>
-      </w:r>
-      <w:r>
-        <w:t xml:space="preserve">:用</w:t>
-      </w:r>
-      <w:r>
-        <w:t xml:space="preserve"> </w:t>
-      </w:r>
-      <w:r>
-        <w:rPr>
-          <w:rStyle w:val="VerbatimChar"/>
-        </w:rPr>
-        <w:t xml:space="preserve">cosmopedia/decontamination</w:t>
-      </w:r>
-      <w:r>
-        <w:t xml:space="preserve"> </w:t>
-      </w:r>
-      <w:r>
-        <w:t xml:space="preserve">跑 10‑gram + difflib,</w:t>
-      </w:r>
-      <w:r>
-        <w:rPr>
-          <w:bCs/>
-          <w:b/>
-        </w:rPr>
-        <w:t xml:space="preserve">针对你最终所有评测集</w:t>
-      </w:r>
-      <w:r>
-        <w:t xml:space="preserve">(含 GSM8k、MMLU‑Pro、HumanEval 的输入)。</w:t>
-      </w:r>
-    </w:p>
-    <w:p>
-      <w:pPr>
-        <w:numPr>
-          <w:ilvl w:val="0"/>
-          <w:numId w:val="1003"/>
-        </w:numPr>
-        <w:pStyle w:val="Compact"/>
-      </w:pPr>
-      <w:r>
-        <w:rPr>
-          <w:bCs/>
-          <w:b/>
-        </w:rPr>
-        <w:t xml:space="preserve">WandB / MLflow</w:t>
-      </w:r>
-      <w:r>
-        <w:t xml:space="preserve">:loss、grad norm、token throughput、每 2B token 的所有 lighteval 分数都进同一面板,后面方便对比。</w:t>
-      </w:r>
-    </w:p>
-    <w:p>
-      <w:pPr>
-        <w:pStyle w:val="BlockText"/>
-      </w:pPr>
-      <w:r>
-        <w:rPr>
-          <w:bCs/>
-          <w:b/>
-        </w:rPr>
-        <w:t xml:space="preserve">对你”checkpoint 分叉”诉求的关键提醒</w:t>
-      </w:r>
-      <w:r>
-        <w:t xml:space="preserve">:</w:t>
-      </w:r>
-      <w:r>
-        <w:rPr>
-          <w:rStyle w:val="VerbatimChar"/>
-        </w:rPr>
-        <w:t xml:space="preserve">nanotron</w:t>
-      </w:r>
-      <w:r>
-        <w:t xml:space="preserve"> </w:t>
-      </w:r>
-      <w:r>
-        <w:t xml:space="preserve">存的是优化器+权重的 full state,可以 resume。</w:t>
-      </w:r>
-      <w:r>
-        <w:rPr>
-          <w:bCs/>
-          <w:b/>
-        </w:rPr>
-        <w:t xml:space="preserve">所以一定要用 trapezoidal+cooldown,而不是 cosine</w:t>
-      </w:r>
-      <w:r>
-        <w:t xml:space="preserve">——cosine 一旦动末端 LR 就回不了头;trapezoidal 的 cooldown 是单独阶段,可以从同一个”主干 checkpoint”上</w:t>
-      </w:r>
-      <w:r>
-        <w:rPr>
-          <w:bCs/>
-          <w:b/>
-        </w:rPr>
-        <w:t xml:space="preserve">多次分叉做不同 cooldown 实验</w:t>
-      </w:r>
-      <w:r>
-        <w:t xml:space="preserve">(SmolLM 团队就是这么省算力的,见 Hägele et al. 2024)。</w:t>
-      </w:r>
-    </w:p>
     <w:p>
       <w:r>
         <w:pict>
@@ -1523,32 +574,92 @@
         </w:pict>
       </w:r>
     </w:p>
-    <w:bookmarkEnd w:id="28"/>
-    <w:bookmarkEnd w:id="29"/>
-    <w:bookmarkStart w:id="33" w:name="第二步-生成-incepedia原文-3.2.1"/>
+    <w:bookmarkEnd w:id="24"/>
+    <w:bookmarkEnd w:id="25"/>
+    <w:bookmarkStart w:id="26" w:name="incepedia-执行方案总体战略"/>
     <w:p>
       <w:pPr>
         <w:pStyle w:val="Heading1"/>
       </w:pPr>
       <w:r>
-        <w:t xml:space="preserve">5. 第二步 · 生成 Incepedia(原文 §3.2.1)</w:t>
-      </w:r>
-    </w:p>
-    <w:bookmarkStart w:id="30" w:name="大方向吸取-cosmopedia-的教训-20252026-最新经验"/>
+        <w:t xml:space="preserve">3. Incepedia 执行方案总体战略</w:t>
+      </w:r>
+    </w:p>
+    <w:p>
+      <w:pPr>
+        <w:pStyle w:val="BlockText"/>
+      </w:pPr>
+      <w:r>
+        <w:t xml:space="preserve">总体战略:</w:t>
+      </w:r>
+      <w:r>
+        <w:rPr>
+          <w:bCs/>
+          <w:b/>
+        </w:rPr>
+        <w:t xml:space="preserve">复现 → 替换 → 闭环</w:t>
+      </w:r>
+      <w:r>
+        <w:t xml:space="preserve">,科学方法论 =</w:t>
+      </w:r>
+      <w:r>
+        <w:t xml:space="preserve"> </w:t>
+      </w:r>
+      <w:r>
+        <w:t xml:space="preserve">“</w:t>
+      </w:r>
+      <w:r>
+        <w:t xml:space="preserve">只动一个变量,看分数变化</w:t>
+      </w:r>
+      <w:r>
+        <w:t xml:space="preserve">”</w:t>
+      </w:r>
+      <w:r>
+        <w:t xml:space="preserve">。</w:t>
+      </w:r>
+    </w:p>
+    <w:p>
+      <w:r>
+        <w:pict>
+          <v:rect style="width:0;height:1.5pt" o:hralign="center" o:hrstd="t" o:hr="t"/>
+        </w:pict>
+      </w:r>
+    </w:p>
+    <w:bookmarkEnd w:id="26"/>
+    <w:bookmarkStart w:id="29" w:name="第一步-百分百复现-cosmopedia-的训练评测管线"/>
+    <w:p>
+      <w:pPr>
+        <w:pStyle w:val="Heading1"/>
+      </w:pPr>
+      <w:r>
+        <w:t xml:space="preserve">4. 第一步 · 百分百复现 Cosmopedia 的训练‑评测管线</w:t>
+      </w:r>
+    </w:p>
+    <w:p>
+      <w:pPr>
+        <w:pStyle w:val="FirstParagraph"/>
+      </w:pPr>
+      <w:r>
+        <w:t xml:space="preserve">目标:</w:t>
+      </w:r>
+      <w:r>
+        <w:rPr>
+          <w:bCs/>
+          <w:b/>
+        </w:rPr>
+        <w:t xml:space="preserve">搭一个”无新意但 100% 一致”的 reference pipeline</w:t>
+      </w:r>
+      <w:r>
+        <w:t xml:space="preserve">,后续所有实验都跑在它之上,排除非数据因素。</w:t>
+      </w:r>
+    </w:p>
+    <w:bookmarkStart w:id="27" w:name="Xa3bf52df37fc4912eb5043f7b443d16f489c21e"/>
     <w:p>
       <w:pPr>
         <w:pStyle w:val="Heading2"/>
       </w:pPr>
       <w:r>
-        <w:t xml:space="preserve">5.1 大方向(吸取 Cosmopedia 的教训 + 2025‑2026 最新经验)</w:t>
-      </w:r>
-    </w:p>
-    <w:p>
-      <w:pPr>
-        <w:pStyle w:val="FirstParagraph"/>
-      </w:pPr>
-      <w:r>
-        <w:t xml:space="preserve">把 Cosmopedia v2 当骨架,在 4 个维度做超越:</w:t>
+        <w:t xml:space="preserve">4.1 锁定 reference 配方(强烈建议直接对齐 SmolLM/Cosmo‑v2 的 ablation 设置,而不是 v1 的 6‑epoch 训练)</w:t>
       </w:r>
     </w:p>
     <w:tbl>
@@ -1575,6 +686,814 @@
               <w:jc w:val="left"/>
             </w:pPr>
             <w:r>
+              <w:t xml:space="preserve">项</w:t>
+            </w:r>
+          </w:p>
+        </w:tc>
+        <w:tc>
+          <w:tcPr/>
+          <w:p>
+            <w:pPr>
+              <w:pStyle w:val="Compact"/>
+              <w:jc w:val="left"/>
+            </w:pPr>
+            <w:r>
+              <w:t xml:space="preserve">选择</w:t>
+            </w:r>
+          </w:p>
+        </w:tc>
+        <w:tc>
+          <w:tcPr/>
+          <w:p>
+            <w:pPr>
+              <w:pStyle w:val="Compact"/>
+              <w:jc w:val="left"/>
+            </w:pPr>
+            <w:r>
+              <w:t xml:space="preserve">理由</w:t>
+            </w:r>
+          </w:p>
+        </w:tc>
+      </w:tr>
+      <w:tr>
+        <w:tc>
+          <w:tcPr/>
+          <w:p>
+            <w:pPr>
+              <w:pStyle w:val="Compact"/>
+              <w:jc w:val="left"/>
+            </w:pPr>
+            <w:r>
+              <w:t xml:space="preserve">训练框架</w:t>
+            </w:r>
+          </w:p>
+        </w:tc>
+        <w:tc>
+          <w:tcPr/>
+          <w:p>
+            <w:pPr>
+              <w:pStyle w:val="Compact"/>
+              <w:jc w:val="left"/>
+            </w:pPr>
+            <w:r>
+              <w:rPr>
+                <w:rStyle w:val="VerbatimChar"/>
+              </w:rPr>
+              <w:t xml:space="preserve">nanotron</w:t>
+            </w:r>
+          </w:p>
+        </w:tc>
+        <w:tc>
+          <w:tcPr/>
+          <w:p>
+            <w:pPr>
+              <w:pStyle w:val="Compact"/>
+              <w:jc w:val="left"/>
+            </w:pPr>
+            <w:r>
+              <w:t xml:space="preserve">Cosmopedia/SmolLM 官方栈,checkpoint 可分叉</w:t>
+            </w:r>
+          </w:p>
+        </w:tc>
+      </w:tr>
+      <w:tr>
+        <w:tc>
+          <w:tcPr/>
+          <w:p>
+            <w:pPr>
+              <w:pStyle w:val="Compact"/>
+              <w:jc w:val="left"/>
+            </w:pPr>
+            <w:r>
+              <w:t xml:space="preserve">模型</w:t>
+            </w:r>
+          </w:p>
+        </w:tc>
+        <w:tc>
+          <w:tcPr/>
+          <w:p>
+            <w:pPr>
+              <w:pStyle w:val="Compact"/>
+              <w:jc w:val="left"/>
+            </w:pPr>
+            <w:r>
+              <w:t xml:space="preserve">Llama2‑1.82B(等同 FineWeb ablation 模型)</w:t>
+            </w:r>
+          </w:p>
+        </w:tc>
+        <w:tc>
+          <w:tcPr/>
+          <w:p>
+            <w:pPr>
+              <w:pStyle w:val="Compact"/>
+              <w:jc w:val="left"/>
+            </w:pPr>
+            <w:r>
+              <w:t xml:space="preserve">行业事实基线;cosmo‑1b 同档;成本合理</w:t>
+            </w:r>
+          </w:p>
+        </w:tc>
+      </w:tr>
+      <w:tr>
+        <w:tc>
+          <w:tcPr/>
+          <w:p>
+            <w:pPr>
+              <w:pStyle w:val="Compact"/>
+              <w:jc w:val="left"/>
+            </w:pPr>
+            <w:r>
+              <w:t xml:space="preserve">Tokenizer</w:t>
+            </w:r>
+          </w:p>
+        </w:tc>
+        <w:tc>
+          <w:tcPr/>
+          <w:p>
+            <w:pPr>
+              <w:pStyle w:val="Compact"/>
+              <w:jc w:val="left"/>
+            </w:pPr>
+            <w:r>
+              <w:rPr>
+                <w:rStyle w:val="VerbatimChar"/>
+                <w:bCs/>
+                <w:b/>
+              </w:rPr>
+              <w:t xml:space="preserve">mistralai/Mistral‑7B‑v0.1</w:t>
+            </w:r>
+            <w:r>
+              <w:t xml:space="preserve"> </w:t>
+            </w:r>
+            <w:r>
+              <w:t xml:space="preserve">的 tokenizer(v1)或 SmolLM 自有 tokenizer(v2)</w:t>
+            </w:r>
+          </w:p>
+        </w:tc>
+        <w:tc>
+          <w:tcPr/>
+          <w:p>
+            <w:pPr>
+              <w:pStyle w:val="Compact"/>
+              <w:jc w:val="left"/>
+            </w:pPr>
+            <w:r>
+              <w:t xml:space="preserve">与目标 baseline 完全一致</w:t>
+            </w:r>
+          </w:p>
+        </w:tc>
+      </w:tr>
+      <w:tr>
+        <w:tc>
+          <w:tcPr/>
+          <w:p>
+            <w:pPr>
+              <w:pStyle w:val="Compact"/>
+              <w:jc w:val="left"/>
+            </w:pPr>
+            <w:r>
+              <w:t xml:space="preserve">Token 量</w:t>
+            </w:r>
+          </w:p>
+        </w:tc>
+        <w:tc>
+          <w:tcPr/>
+          <w:p>
+            <w:pPr>
+              <w:pStyle w:val="Compact"/>
+              <w:jc w:val="left"/>
+            </w:pPr>
+            <w:r>
+              <w:t xml:space="preserve">30B(快速 ablation)+ 100B(中验证)+ 350B(终验)</w:t>
+            </w:r>
+          </w:p>
+        </w:tc>
+        <w:tc>
+          <w:tcPr/>
+          <w:p>
+            <w:pPr>
+              <w:pStyle w:val="Compact"/>
+              <w:jc w:val="left"/>
+            </w:pPr>
+            <w:r>
+              <w:t xml:space="preserve">三档分别对应 ~$几k/几万/几十万的算力预算</w:t>
+            </w:r>
+          </w:p>
+        </w:tc>
+      </w:tr>
+      <w:tr>
+        <w:tc>
+          <w:tcPr/>
+          <w:p>
+            <w:pPr>
+              <w:pStyle w:val="Compact"/>
+              <w:jc w:val="left"/>
+            </w:pPr>
+            <w:r>
+              <w:t xml:space="preserve">Seq len / GBS</w:t>
+            </w:r>
+          </w:p>
+        </w:tc>
+        <w:tc>
+          <w:tcPr/>
+          <w:p>
+            <w:pPr>
+              <w:pStyle w:val="Compact"/>
+              <w:jc w:val="left"/>
+            </w:pPr>
+            <w:r>
+              <w:t xml:space="preserve">2048 / 1.3M tokens</w:t>
+            </w:r>
+          </w:p>
+        </w:tc>
+        <w:tc>
+          <w:tcPr/>
+          <w:p>
+            <w:pPr>
+              <w:pStyle w:val="Compact"/>
+              <w:jc w:val="left"/>
+            </w:pPr>
+            <w:r>
+              <w:t xml:space="preserve">与 Cosmo‑1B、SmolLM 一致</w:t>
+            </w:r>
+          </w:p>
+        </w:tc>
+      </w:tr>
+      <w:tr>
+        <w:tc>
+          <w:tcPr/>
+          <w:p>
+            <w:pPr>
+              <w:pStyle w:val="Compact"/>
+              <w:jc w:val="left"/>
+            </w:pPr>
+            <w:r>
+              <w:t xml:space="preserve">LR</w:t>
+            </w:r>
+          </w:p>
+        </w:tc>
+        <w:tc>
+          <w:tcPr/>
+          <w:p>
+            <w:pPr>
+              <w:pStyle w:val="Compact"/>
+              <w:jc w:val="left"/>
+            </w:pPr>
+            <w:r>
+              <w:t xml:space="preserve">3e‑4 cosine(完全复现 v1)+ 备选 trapezoidal(v2 风格,可在 cooldown 阶段做配方实验)</w:t>
+            </w:r>
+          </w:p>
+        </w:tc>
+        <w:tc>
+          <w:tcPr/>
+          <w:p>
+            <w:pPr>
+              <w:pStyle w:val="Compact"/>
+              <w:jc w:val="left"/>
+            </w:pPr>
+            <w:r>
+              <w:t xml:space="preserve">trapezoidal 更适合 ablation,不需要重训整段</w:t>
+            </w:r>
+          </w:p>
+        </w:tc>
+      </w:tr>
+      <w:tr>
+        <w:tc>
+          <w:tcPr/>
+          <w:p>
+            <w:pPr>
+              <w:pStyle w:val="Compact"/>
+              <w:jc w:val="left"/>
+            </w:pPr>
+            <w:r>
+              <w:t xml:space="preserve">Seeds</w:t>
+            </w:r>
+          </w:p>
+        </w:tc>
+        <w:tc>
+          <w:tcPr/>
+          <w:p>
+            <w:pPr>
+              <w:pStyle w:val="Compact"/>
+              <w:jc w:val="left"/>
+            </w:pPr>
+            <w:r>
+              <w:t xml:space="preserve">至少 2 个(42, 1337)</w:t>
+            </w:r>
+          </w:p>
+        </w:tc>
+        <w:tc>
+          <w:tcPr/>
+          <w:p>
+            <w:pPr>
+              <w:pStyle w:val="Compact"/>
+              <w:jc w:val="left"/>
+            </w:pPr>
+            <w:r>
+              <w:t xml:space="preserve">行业标准</w:t>
+            </w:r>
+          </w:p>
+        </w:tc>
+      </w:tr>
+      <w:tr>
+        <w:tc>
+          <w:tcPr/>
+          <w:p>
+            <w:pPr>
+              <w:pStyle w:val="Compact"/>
+              <w:jc w:val="left"/>
+            </w:pPr>
+            <w:r>
+              <w:t xml:space="preserve">Eval</w:t>
+            </w:r>
+          </w:p>
+        </w:tc>
+        <w:tc>
+          <w:tcPr/>
+          <w:p>
+            <w:pPr>
+              <w:pStyle w:val="Compact"/>
+              <w:jc w:val="left"/>
+            </w:pPr>
+            <w:r>
+              <w:rPr>
+                <w:rStyle w:val="VerbatimChar"/>
+              </w:rPr>
+              <w:t xml:space="preserve">lighteval</w:t>
+            </w:r>
+            <w:r>
+              <w:t xml:space="preserve"> </w:t>
+            </w:r>
+            <w:r>
+              <w:t xml:space="preserve">+</w:t>
+            </w:r>
+            <w:r>
+              <w:t xml:space="preserve"> </w:t>
+            </w:r>
+            <w:r>
+              <w:rPr>
+                <w:rStyle w:val="VerbatimChar"/>
+              </w:rPr>
+              <w:t xml:space="preserve">cosmopedia/evaluation/lighteval_tasks.py</w:t>
+            </w:r>
+            <w:r>
+              <w:t xml:space="preserve"> </w:t>
+            </w:r>
+            <w:r>
+              <w:t xml:space="preserve">完全照搬</w:t>
+            </w:r>
+          </w:p>
+        </w:tc>
+        <w:tc>
+          <w:tcPr/>
+          <w:p>
+            <w:pPr>
+              <w:pStyle w:val="Compact"/>
+              <w:jc w:val="left"/>
+            </w:pPr>
+            <w:r>
+              <w:t xml:space="preserve">评测脚本零修改</w:t>
+            </w:r>
+          </w:p>
+        </w:tc>
+      </w:tr>
+    </w:tbl>
+    <w:bookmarkEnd w:id="27"/>
+    <w:bookmarkStart w:id="28" w:name="落地-checklist按顺序"/>
+    <w:p>
+      <w:pPr>
+        <w:pStyle w:val="Heading2"/>
+      </w:pPr>
+      <w:r>
+        <w:t xml:space="preserve">4.2 落地 checklist(按顺序)</w:t>
+      </w:r>
+    </w:p>
+    <w:p>
+      <w:pPr>
+        <w:numPr>
+          <w:ilvl w:val="0"/>
+          <w:numId w:val="1003"/>
+        </w:numPr>
+        <w:pStyle w:val="Compact"/>
+      </w:pPr>
+      <w:r>
+        <w:rPr>
+          <w:rStyle w:val="VerbatimChar"/>
+        </w:rPr>
+        <w:t xml:space="preserve">git clone</w:t>
+      </w:r>
+      <w:r>
+        <w:t xml:space="preserve"> </w:t>
+      </w:r>
+      <w:r>
+        <w:t xml:space="preserve">三件套到</w:t>
+      </w:r>
+      <w:r>
+        <w:t xml:space="preserve"> </w:t>
+      </w:r>
+      <w:r>
+        <w:rPr>
+          <w:rStyle w:val="VerbatimChar"/>
+        </w:rPr>
+        <w:t xml:space="preserve">Incepedia/</w:t>
+      </w:r>
+      <w:r>
+        <w:t xml:space="preserve"> </w:t>
+      </w:r>
+      <w:r>
+        <w:t xml:space="preserve">仓库:</w:t>
+      </w:r>
+      <w:r>
+        <w:rPr>
+          <w:rStyle w:val="VerbatimChar"/>
+        </w:rPr>
+        <w:t xml:space="preserve">nanotron</w:t>
+      </w:r>
+      <w:r>
+        <w:t xml:space="preserve">、</w:t>
+      </w:r>
+      <w:r>
+        <w:rPr>
+          <w:rStyle w:val="VerbatimChar"/>
+        </w:rPr>
+        <w:t xml:space="preserve">lighteval</w:t>
+      </w:r>
+      <w:r>
+        <w:t xml:space="preserve">、</w:t>
+      </w:r>
+      <w:r>
+        <w:rPr>
+          <w:rStyle w:val="VerbatimChar"/>
+        </w:rPr>
+        <w:t xml:space="preserve">huggingface/cosmopedia</w:t>
+      </w:r>
+      <w:r>
+        <w:t xml:space="preserve">(取 prompts/eval/decontamination 目录)。</w:t>
+      </w:r>
+    </w:p>
+    <w:p>
+      <w:pPr>
+        <w:numPr>
+          <w:ilvl w:val="0"/>
+          <w:numId w:val="1003"/>
+        </w:numPr>
+        <w:pStyle w:val="Compact"/>
+      </w:pPr>
+      <w:r>
+        <w:t xml:space="preserve">复刻数据预处理:用</w:t>
+      </w:r>
+      <w:r>
+        <w:t xml:space="preserve"> </w:t>
+      </w:r>
+      <w:r>
+        <w:rPr>
+          <w:rStyle w:val="VerbatimChar"/>
+        </w:rPr>
+        <w:t xml:space="preserve">datatrove</w:t>
+      </w:r>
+      <w:r>
+        <w:t xml:space="preserve"> </w:t>
+      </w:r>
+      <w:r>
+        <w:t xml:space="preserve">做 tokenization →</w:t>
+      </w:r>
+      <w:r>
+        <w:t xml:space="preserve"> </w:t>
+      </w:r>
+      <w:r>
+        <w:rPr>
+          <w:rStyle w:val="VerbatimChar"/>
+        </w:rPr>
+        <w:t xml:space="preserve">nanotron</w:t>
+      </w:r>
+      <w:r>
+        <w:t xml:space="preserve"> </w:t>
+      </w:r>
+      <w:r>
+        <w:t xml:space="preserve">shard 格式。</w:t>
+      </w:r>
+    </w:p>
+    <w:p>
+      <w:pPr>
+        <w:numPr>
+          <w:ilvl w:val="0"/>
+          <w:numId w:val="1003"/>
+        </w:numPr>
+        <w:pStyle w:val="Compact"/>
+      </w:pPr>
+      <w:r>
+        <w:rPr>
+          <w:bCs/>
+          <w:b/>
+        </w:rPr>
+        <w:t xml:space="preserve">冒烟基线 1</w:t>
+      </w:r>
+      <w:r>
+        <w:t xml:space="preserve">:用</w:t>
+      </w:r>
+      <w:r>
+        <w:t xml:space="preserve"> </w:t>
+      </w:r>
+      <w:r>
+        <w:rPr>
+          <w:bCs/>
+          <w:b/>
+        </w:rPr>
+        <w:t xml:space="preserve">公开的</w:t>
+      </w:r>
+      <w:r>
+        <w:rPr>
+          <w:bCs/>
+          <w:b/>
+        </w:rPr>
+        <w:t xml:space="preserve"> </w:t>
+      </w:r>
+      <w:r>
+        <w:rPr>
+          <w:rStyle w:val="VerbatimChar"/>
+          <w:bCs/>
+          <w:b/>
+        </w:rPr>
+        <w:t xml:space="preserve">cosmopedia‑v2</w:t>
+      </w:r>
+      <w:r>
+        <w:t xml:space="preserve"> </w:t>
+      </w:r>
+      <w:r>
+        <w:t xml:space="preserve">全量训 30B tokens × 2 seeds → 在 lighteval 早信号组上得到 reference 分数,与 SmolLM blog 中 Mixture11 的数字对齐(±0.5pp 以内才算对得上)。</w:t>
+      </w:r>
+    </w:p>
+    <w:p>
+      <w:pPr>
+        <w:numPr>
+          <w:ilvl w:val="0"/>
+          <w:numId w:val="1003"/>
+        </w:numPr>
+        <w:pStyle w:val="Compact"/>
+      </w:pPr>
+      <w:r>
+        <w:rPr>
+          <w:bCs/>
+          <w:b/>
+        </w:rPr>
+        <w:t xml:space="preserve">冒烟基线 2</w:t>
+      </w:r>
+      <w:r>
+        <w:t xml:space="preserve">:同样设置训</w:t>
+      </w:r>
+      <w:r>
+        <w:t xml:space="preserve"> </w:t>
+      </w:r>
+      <w:r>
+        <w:rPr>
+          <w:rStyle w:val="VerbatimChar"/>
+        </w:rPr>
+        <w:t xml:space="preserve">FineWeb-Edu</w:t>
+      </w:r>
+      <w:r>
+        <w:t xml:space="preserve"> </w:t>
+      </w:r>
+      <w:r>
+        <w:t xml:space="preserve">30B → 对齐</w:t>
+      </w:r>
+      <w:r>
+        <w:t xml:space="preserve"> </w:t>
+      </w:r>
+      <w:r>
+        <w:rPr>
+          <w:rStyle w:val="VerbatimChar"/>
+        </w:rPr>
+        <w:t xml:space="preserve">HuggingFaceFW/ablation-model-fineweb-edu</w:t>
+      </w:r>
+      <w:r>
+        <w:t xml:space="preserve"> </w:t>
+      </w:r>
+      <w:r>
+        <w:t xml:space="preserve">数字。</w:t>
+      </w:r>
+    </w:p>
+    <w:p>
+      <w:pPr>
+        <w:numPr>
+          <w:ilvl w:val="1"/>
+          <w:numId w:val="1004"/>
+        </w:numPr>
+        <w:pStyle w:val="Compact"/>
+      </w:pPr>
+      <w:r>
+        <w:t xml:space="preserve">这两个对齐过了,reference 管线才能宣告”可信”。</w:t>
+      </w:r>
+    </w:p>
+    <w:p>
+      <w:pPr>
+        <w:numPr>
+          <w:ilvl w:val="0"/>
+          <w:numId w:val="1003"/>
+        </w:numPr>
+        <w:pStyle w:val="Compact"/>
+      </w:pPr>
+      <w:r>
+        <w:rPr>
+          <w:bCs/>
+          <w:b/>
+        </w:rPr>
+        <w:t xml:space="preserve">Checkpoint 策略</w:t>
+      </w:r>
+      <w:r>
+        <w:t xml:space="preserve">:</w:t>
+      </w:r>
+      <w:r>
+        <w:rPr>
+          <w:rStyle w:val="VerbatimChar"/>
+        </w:rPr>
+        <w:t xml:space="preserve">nanotron</w:t>
+      </w:r>
+      <w:r>
+        <w:t xml:space="preserve"> </w:t>
+      </w:r>
+      <w:r>
+        <w:t xml:space="preserve">默认每 N 步存一份;</w:t>
+      </w:r>
+      <w:r>
+        <w:rPr>
+          <w:bCs/>
+          <w:b/>
+        </w:rPr>
+        <w:t xml:space="preserve">强制每 2B token 存一次,并在 6/12/18/24/30B 五个节点上各做 lighteval</w:t>
+      </w:r>
+      <w:r>
+        <w:t xml:space="preserve">——这就是后续所有 Incepedia 分叉实验的”早期信号 dashboard”。</w:t>
+      </w:r>
+    </w:p>
+    <w:p>
+      <w:pPr>
+        <w:numPr>
+          <w:ilvl w:val="0"/>
+          <w:numId w:val="1003"/>
+        </w:numPr>
+        <w:pStyle w:val="Compact"/>
+      </w:pPr>
+      <w:r>
+        <w:rPr>
+          <w:bCs/>
+          <w:b/>
+        </w:rPr>
+        <w:t xml:space="preserve">去污染</w:t>
+      </w:r>
+      <w:r>
+        <w:t xml:space="preserve">:用</w:t>
+      </w:r>
+      <w:r>
+        <w:t xml:space="preserve"> </w:t>
+      </w:r>
+      <w:r>
+        <w:rPr>
+          <w:rStyle w:val="VerbatimChar"/>
+        </w:rPr>
+        <w:t xml:space="preserve">cosmopedia/decontamination</w:t>
+      </w:r>
+      <w:r>
+        <w:t xml:space="preserve"> </w:t>
+      </w:r>
+      <w:r>
+        <w:t xml:space="preserve">跑 10‑gram + difflib,</w:t>
+      </w:r>
+      <w:r>
+        <w:rPr>
+          <w:bCs/>
+          <w:b/>
+        </w:rPr>
+        <w:t xml:space="preserve">针对最终所有评测集</w:t>
+      </w:r>
+      <w:r>
+        <w:t xml:space="preserve">(含 GSM8k、MMLU‑Pro、HumanEval 的输入)。</w:t>
+      </w:r>
+    </w:p>
+    <w:p>
+      <w:pPr>
+        <w:numPr>
+          <w:ilvl w:val="0"/>
+          <w:numId w:val="1003"/>
+        </w:numPr>
+        <w:pStyle w:val="Compact"/>
+      </w:pPr>
+      <w:r>
+        <w:rPr>
+          <w:bCs/>
+          <w:b/>
+        </w:rPr>
+        <w:t xml:space="preserve">WandB / MLflow</w:t>
+      </w:r>
+      <w:r>
+        <w:t xml:space="preserve">:loss、grad norm、token throughput、每 2B token 的所有 lighteval 分数都进同一面板,后面方便对比。</w:t>
+      </w:r>
+    </w:p>
+    <w:p>
+      <w:pPr>
+        <w:pStyle w:val="BlockText"/>
+      </w:pPr>
+      <w:r>
+        <w:rPr>
+          <w:bCs/>
+          <w:b/>
+        </w:rPr>
+        <w:t xml:space="preserve">关于”checkpoint 分叉”诉求的关键提醒</w:t>
+      </w:r>
+      <w:r>
+        <w:t xml:space="preserve">:</w:t>
+      </w:r>
+      <w:r>
+        <w:rPr>
+          <w:rStyle w:val="VerbatimChar"/>
+        </w:rPr>
+        <w:t xml:space="preserve">nanotron</w:t>
+      </w:r>
+      <w:r>
+        <w:t xml:space="preserve"> </w:t>
+      </w:r>
+      <w:r>
+        <w:t xml:space="preserve">存的是优化器+权重的 full state,可以 resume。</w:t>
+      </w:r>
+      <w:r>
+        <w:rPr>
+          <w:bCs/>
+          <w:b/>
+        </w:rPr>
+        <w:t xml:space="preserve">所以一定要用 trapezoidal+cooldown,而不是 cosine</w:t>
+      </w:r>
+      <w:r>
+        <w:t xml:space="preserve">——cosine 一旦动末端 LR 就回不了头;trapezoidal 的 cooldown 是单独阶段,可以从同一个”主干 checkpoint”上</w:t>
+      </w:r>
+      <w:r>
+        <w:rPr>
+          <w:bCs/>
+          <w:b/>
+        </w:rPr>
+        <w:t xml:space="preserve">多次分叉做不同 cooldown 实验</w:t>
+      </w:r>
+      <w:r>
+        <w:t xml:space="preserve">(SmolLM 团队就是这么省算力的,见 Hägele et al. 2024)。</w:t>
+      </w:r>
+    </w:p>
+    <w:p>
+      <w:r>
+        <w:pict>
+          <v:rect style="width:0;height:1.5pt" o:hralign="center" o:hrstd="t" o:hr="t"/>
+        </w:pict>
+      </w:r>
+    </w:p>
+    <w:bookmarkEnd w:id="28"/>
+    <w:bookmarkEnd w:id="29"/>
+    <w:bookmarkStart w:id="32" w:name="第二步-生成-incepedia"/>
+    <w:p>
+      <w:pPr>
+        <w:pStyle w:val="Heading1"/>
+      </w:pPr>
+      <w:r>
+        <w:t xml:space="preserve">5. 第二步 · 生成 Incepedia</w:t>
+      </w:r>
+    </w:p>
+    <w:bookmarkStart w:id="30" w:name="大方向吸取-cosmopedia-的教训-20252026-最新经验"/>
+    <w:p>
+      <w:pPr>
+        <w:pStyle w:val="Heading2"/>
+      </w:pPr>
+      <w:r>
+        <w:t xml:space="preserve">5.1 大方向(吸取 Cosmopedia 的教训 + 2025‑2026 最新经验)</w:t>
+      </w:r>
+    </w:p>
+    <w:p>
+      <w:pPr>
+        <w:pStyle w:val="FirstParagraph"/>
+      </w:pPr>
+      <w:r>
+        <w:t xml:space="preserve">把 Cosmopedia v2 当骨架,在 4 个维度做超越:</w:t>
+      </w:r>
+    </w:p>
+    <w:tbl>
+      <w:tblPr>
+        <w:tblStyle w:val="Table"/>
+        <w:tblW w:type="pct" w:w="5000"/>
+        <w:tblLook w:firstRow="1" w:lastRow="0" w:firstColumn="0" w:lastColumn="0" w:noHBand="0" w:noVBand="0" w:val="0020"/>
+        <w:jc w:val="start"/>
+      </w:tblPr>
+      <w:tblGrid>
+        <w:gridCol w:w="2640"/>
+        <w:gridCol w:w="2640"/>
+        <w:gridCol w:w="2640"/>
+      </w:tblGrid>
+      <w:tr>
+        <w:trPr>
+          <w:tblHeader w:val="true"/>
+        </w:trPr>
+        <w:tc>
+          <w:tcPr/>
+          <w:p>
+            <w:pPr>
+              <w:pStyle w:val="Compact"/>
+              <w:jc w:val="left"/>
+            </w:pPr>
+            <w:r>
               <w:t xml:space="preserve">维度</w:t>
             </w:r>
           </w:p>
@@ -2046,197 +1965,13 @@
       </w:tr>
     </w:tbl>
     <w:bookmarkEnd w:id="30"/>
-    <w:bookmarkStart w:id="31" w:name="用-openrouter-的具体工程方案"/>
+    <w:bookmarkStart w:id="31" w:name="质量控制与去重"/>
     <w:p>
       <w:pPr>
         <w:pStyle w:val="Heading2"/>
       </w:pPr>
       <w:r>
-        <w:t xml:space="preserve">5.2 用 OpenRouter 的具体工程方案</w:t>
-      </w:r>
-    </w:p>
-    <w:p>
-      <w:pPr>
-        <w:pStyle w:val="FirstParagraph"/>
-      </w:pPr>
-      <w:r>
-        <w:rPr>
-          <w:bCs/>
-          <w:b/>
-        </w:rPr>
-        <w:t xml:space="preserve">生成 pipeline(替换</w:t>
-      </w:r>
-      <w:r>
-        <w:rPr>
-          <w:bCs/>
-          <w:b/>
-        </w:rPr>
-        <w:t xml:space="preserve"> </w:t>
-      </w:r>
-      <w:r>
-        <w:rPr>
-          <w:rStyle w:val="VerbatimChar"/>
-          <w:bCs/>
-          <w:b/>
-        </w:rPr>
-        <w:t xml:space="preserve">llm-swarm</w:t>
-      </w:r>
-      <w:r>
-        <w:rPr>
-          <w:bCs/>
-          <w:b/>
-        </w:rPr>
-        <w:t xml:space="preserve"> </w:t>
-      </w:r>
-      <w:r>
-        <w:rPr>
-          <w:bCs/>
-          <w:b/>
-        </w:rPr>
-        <w:t xml:space="preserve">为 OpenRouter‑native):</w:t>
-      </w:r>
-    </w:p>
-    <w:p>
-      <w:pPr>
-        <w:pStyle w:val="SourceCode"/>
-      </w:pPr>
-      <w:r>
-        <w:rPr>
-          <w:rStyle w:val="VerbatimChar"/>
-        </w:rPr>
-        <w:t xml:space="preserve">prompts.parquet (prompt, topic, audience, format, seed, generator_pool)</w:t>
-      </w:r>
-      <w:r>
-        <w:br/>
-      </w:r>
-      <w:r>
-        <w:rPr>
-          <w:rStyle w:val="VerbatimChar"/>
-        </w:rPr>
-        <w:t xml:space="preserve">        │</w:t>
-      </w:r>
-      <w:r>
-        <w:br/>
-      </w:r>
-      <w:r>
-        <w:rPr>
-          <w:rStyle w:val="VerbatimChar"/>
-        </w:rPr>
-        <w:t xml:space="preserve">        ▼</w:t>
-      </w:r>
-      <w:r>
-        <w:br/>
-      </w:r>
-      <w:r>
-        <w:rPr>
-          <w:rStyle w:val="VerbatimChar"/>
-        </w:rPr>
-        <w:t xml:space="preserve">[ OpenRouter 异步批量调用器 ]   ← 自写,~300 行 Python</w:t>
-      </w:r>
-      <w:r>
-        <w:br/>
-      </w:r>
-      <w:r>
-        <w:rPr>
-          <w:rStyle w:val="VerbatimChar"/>
-        </w:rPr>
-        <w:t xml:space="preserve">   - asyncio + aiohttp,并发 200–500 req</w:t>
-      </w:r>
-      <w:r>
-        <w:br/>
-      </w:r>
-      <w:r>
-        <w:rPr>
-          <w:rStyle w:val="VerbatimChar"/>
-        </w:rPr>
-        <w:t xml:space="preserve">   - 内置重试/限流/路由(按价格/可用性自动 fallback)</w:t>
-      </w:r>
-      <w:r>
-        <w:br/>
-      </w:r>
-      <w:r>
-        <w:rPr>
-          <w:rStyle w:val="VerbatimChar"/>
-        </w:rPr>
-        <w:t xml:space="preserve">   - 每个 prompt 随机抽 generator_pool 中 1 个模型</w:t>
-      </w:r>
-      <w:r>
-        <w:br/>
-      </w:r>
-      <w:r>
-        <w:rPr>
-          <w:rStyle w:val="VerbatimChar"/>
-        </w:rPr>
-        <w:t xml:space="preserve">   - 检查最小长度、停用词、boilerplate(可直接搬 cosmopedia/generation/boilerplate_cleanup.py)</w:t>
-      </w:r>
-      <w:r>
-        <w:br/>
-      </w:r>
-      <w:r>
-        <w:rPr>
-          <w:rStyle w:val="VerbatimChar"/>
-        </w:rPr>
-        <w:t xml:space="preserve">        │</w:t>
-      </w:r>
-      <w:r>
-        <w:br/>
-      </w:r>
-      <w:r>
-        <w:rPr>
-          <w:rStyle w:val="VerbatimChar"/>
-        </w:rPr>
-        <w:t xml:space="preserve">        ▼</w:t>
-      </w:r>
-      <w:r>
-        <w:br/>
-      </w:r>
-      <w:r>
-        <w:rPr>
-          <w:rStyle w:val="VerbatimChar"/>
-        </w:rPr>
-        <w:t xml:space="preserve">[ datatrove pipeline ]  →  language ID + dedup + decontamination + tokenization</w:t>
-      </w:r>
-      <w:r>
-        <w:br/>
-      </w:r>
-      <w:r>
-        <w:rPr>
-          <w:rStyle w:val="VerbatimChar"/>
-        </w:rPr>
-        <w:t xml:space="preserve">        │</w:t>
-      </w:r>
-      <w:r>
-        <w:br/>
-      </w:r>
-      <w:r>
-        <w:rPr>
-          <w:rStyle w:val="VerbatimChar"/>
-        </w:rPr>
-        <w:t xml:space="preserve">        ▼</w:t>
-      </w:r>
-      <w:r>
-        <w:br/>
-      </w:r>
-      <w:r>
-        <w:rPr>
-          <w:rStyle w:val="VerbatimChar"/>
-        </w:rPr>
-        <w:t xml:space="preserve">[ HF dataset shards ]</w:t>
-      </w:r>
-    </w:p>
-    <w:p>
-      <w:pPr>
-        <w:pStyle w:val="FirstParagraph"/>
-      </w:pPr>
-      <w:r>
-        <w:rPr>
-          <w:bCs/>
-          <w:b/>
-        </w:rPr>
-        <w:t xml:space="preserve">Prompt 工程的关键改进</w:t>
-      </w:r>
-      <w:r>
-        <w:t xml:space="preserve">(每条都是 Cosmopedia 留下的明显 gap):</w:t>
+        <w:t xml:space="preserve">5.2 质量控制与去重</w:t>
       </w:r>
     </w:p>
     <w:p>
@@ -2252,82 +1987,19 @@
           <w:bCs/>
           <w:b/>
         </w:rPr>
-        <w:t xml:space="preserve">强制 seed‑grounding</w:t>
-      </w:r>
-      <w:r>
-        <w:t xml:space="preserve">:prompt 模板里写</w:t>
-      </w:r>
-      <w:r>
-        <w:t xml:space="preserve"> </w:t>
-      </w:r>
-      <w:r>
-        <w:rPr>
-          <w:iCs/>
-          <w:i/>
-        </w:rPr>
-        <w:t xml:space="preserve">“</w:t>
-      </w:r>
-      <w:r>
-        <w:rPr>
-          <w:iCs/>
-          <w:i/>
-        </w:rPr>
-        <w:t xml:space="preserve">All factual claims MUST be derivable from the seed text or general knowledge; if uncertain, write</w:t>
-      </w:r>
-      <w:r>
-        <w:rPr>
-          <w:iCs/>
-          <w:i/>
-        </w:rPr>
-        <w:t xml:space="preserve"> </w:t>
-      </w:r>
-      <w:r>
-        <w:rPr>
-          <w:iCs/>
-          <w:i/>
-        </w:rPr>
-        <w:t xml:space="preserve">‘</w:t>
-      </w:r>
-      <w:r>
-        <w:rPr>
-          <w:iCs/>
-          <w:i/>
-        </w:rPr>
-        <w:t xml:space="preserve">I am not sure</w:t>
-      </w:r>
-      <w:r>
-        <w:rPr>
-          <w:iCs/>
-          <w:i/>
-        </w:rPr>
-        <w:t xml:space="preserve">’</w:t>
-      </w:r>
-      <w:r>
-        <w:rPr>
-          <w:iCs/>
-          <w:i/>
-        </w:rPr>
-        <w:t xml:space="preserve"> </w:t>
-      </w:r>
-      <w:r>
-        <w:rPr>
-          <w:iCs/>
-          <w:i/>
-        </w:rPr>
-        <w:t xml:space="preserve">instead of guessing.</w:t>
-      </w:r>
-      <w:r>
-        <w:rPr>
-          <w:iCs/>
-          <w:i/>
-        </w:rPr>
-        <w:t xml:space="preserve">”</w:t>
-      </w:r>
-      <w:r>
-        <w:t xml:space="preserve"> </w:t>
-      </w:r>
-      <w:r>
-        <w:t xml:space="preserve">— 直接降低 Mixtral 时代的幻觉。</w:t>
+        <w:t xml:space="preserve">MinHash dedup</w:t>
+      </w:r>
+      <w:r>
+        <w:t xml:space="preserve">(</w:t>
+      </w:r>
+      <w:r>
+        <w:rPr>
+          <w:rStyle w:val="VerbatimChar"/>
+        </w:rPr>
+        <w:t xml:space="preserve">datatrove</w:t>
+      </w:r>
+      <w:r>
+        <w:t xml:space="preserve">,与 Cosmopedia 同参数:n‑gram=5,阈值 0.7)</w:t>
       </w:r>
     </w:p>
     <w:p>
@@ -2343,26 +2015,17 @@
           <w:bCs/>
           <w:b/>
         </w:rPr>
-        <w:t xml:space="preserve">难度分层</w:t>
-      </w:r>
-      <w:r>
-        <w:t xml:space="preserve">:每个 topic 生成 5 档(elementary / middle / high‑school / college / expert),后续 ablation 看</w:t>
-      </w:r>
-      <w:r>
-        <w:t xml:space="preserve"> </w:t>
+        <w:t xml:space="preserve">Embedding‑level near‑dup</w:t>
+      </w:r>
+      <w:r>
+        <w:t xml:space="preserve">(BGE‑small / nomic‑embed,阈值 cos&gt;0.92):</w:t>
       </w:r>
       <w:r>
         <w:rPr>
           <w:bCs/>
           <w:b/>
         </w:rPr>
-        <w:t xml:space="preserve">课程式课程顺序(curriculum)</w:t>
-      </w:r>
-      <w:r>
-        <w:t xml:space="preserve"> </w:t>
-      </w:r>
-      <w:r>
-        <w:t xml:space="preserve">是否带来增益。</w:t>
+        <w:t xml:space="preserve">Cosmopedia 没做,这是关键超越点之一</w:t>
       </w:r>
     </w:p>
     <w:p>
@@ -2378,10 +2041,25 @@
           <w:bCs/>
           <w:b/>
         </w:rPr>
-        <w:t xml:space="preserve">多 agent 自批改</w:t>
-      </w:r>
-      <w:r>
-        <w:t xml:space="preserve">:对 50% 高价值 topic(STEM/code),先用 Llama‑3.3‑70B 生成 → 用 Claude‑3.5 做 critic 打分 → 低分重写。Phi‑4 报告显示这步带来非平凡增益。</w:t>
+        <w:t xml:space="preserve">Quality classifier</w:t>
+      </w:r>
+      <w:r>
+        <w:t xml:space="preserve">:复用</w:t>
+      </w:r>
+      <w:r>
+        <w:t xml:space="preserve"> </w:t>
+      </w:r>
+      <w:r>
+        <w:rPr>
+          <w:rStyle w:val="VerbatimChar"/>
+        </w:rPr>
+        <w:t xml:space="preserve">HuggingFaceFW/fineweb-edu-classifier</w:t>
+      </w:r>
+      <w:r>
+        <w:t xml:space="preserve"> </w:t>
+      </w:r>
+      <w:r>
+        <w:t xml:space="preserve">给每条打分,只保留 score≥3 → 这是 FineWeb‑Edu 提分的核心 trick</w:t>
       </w:r>
     </w:p>
     <w:p>
@@ -2397,39 +2075,35 @@
           <w:bCs/>
           <w:b/>
         </w:rPr>
-        <w:t xml:space="preserve">Instruction reversal</w:t>
-      </w:r>
-      <w:r>
-        <w:t xml:space="preserve">:从 web 段落反推可能的指令/问题,生成”伪 SFT 风格”段落混进 pretrain(Phi‑4 用过)。</w:t>
-      </w:r>
-    </w:p>
-    <w:p>
-      <w:pPr>
-        <w:numPr>
-          <w:ilvl w:val="0"/>
-          <w:numId w:val="1005"/>
-        </w:numPr>
-        <w:pStyle w:val="Compact"/>
-      </w:pPr>
+        <w:t xml:space="preserve">Decontamination</w:t>
+      </w:r>
+      <w:r>
+        <w:t xml:space="preserve">:沿用 cosmopedia 的 10‑gram + 0.5 ratio,</w:t>
+      </w:r>
       <w:r>
         <w:rPr>
           <w:bCs/>
           <w:b/>
         </w:rPr>
-        <w:t xml:space="preserve">风格反单调化</w:t>
-      </w:r>
-      <w:r>
-        <w:t xml:space="preserve">:Cosmopedia 的”Once upon a time”问题 → 维护一个”禁用开头”列表,每代每千条采样回放检查模式。</w:t>
+        <w:t xml:space="preserve">新增对 GSM8k/MATH/HumanEval/MBPP 的覆盖</w:t>
+      </w:r>
+    </w:p>
+    <w:p>
+      <w:r>
+        <w:pict>
+          <v:rect style="width:0;height:1.5pt" o:hralign="center" o:hrstd="t" o:hr="t"/>
+        </w:pict>
       </w:r>
     </w:p>
     <w:bookmarkEnd w:id="31"/>
-    <w:bookmarkStart w:id="32" w:name="质量控制与去重"/>
-    <w:p>
-      <w:pPr>
-        <w:pStyle w:val="Heading2"/>
-      </w:pPr>
-      <w:r>
-        <w:t xml:space="preserve">5.3 质量控制与去重</w:t>
+    <w:bookmarkEnd w:id="32"/>
+    <w:bookmarkStart w:id="33" w:name="关于量级是不是定-10b"/>
+    <w:p>
+      <w:pPr>
+        <w:pStyle w:val="Heading1"/>
+      </w:pPr>
+      <w:r>
+        <w:t xml:space="preserve">6. 关于”量级是不是定 10B”</w:t>
       </w:r>
     </w:p>
     <w:p>
@@ -2438,26 +2112,69 @@
           <w:ilvl w:val="0"/>
           <w:numId w:val="1006"/>
         </w:numPr>
-        <w:pStyle w:val="Compact"/>
       </w:pPr>
       <w:r>
         <w:rPr>
           <w:bCs/>
           <w:b/>
         </w:rPr>
-        <w:t xml:space="preserve">MinHash dedup</w:t>
-      </w:r>
-      <w:r>
-        <w:t xml:space="preserve">(</w:t>
+        <w:t xml:space="preserve">解耦”数据集 size”和”训练消耗 token 数”</w:t>
+      </w:r>
+      <w:r>
+        <w:t xml:space="preserve">——这是评估合成数据最容易踩的坑。</w:t>
+      </w:r>
+    </w:p>
+    <w:p>
+      <w:pPr>
+        <w:numPr>
+          <w:ilvl w:val="1"/>
+          <w:numId w:val="1007"/>
+        </w:numPr>
+        <w:pStyle w:val="Compact"/>
+      </w:pPr>
+      <w:r>
+        <w:t xml:space="preserve">一个 5B 的高密度数据集,跑 6 epoch ≈ 30B 训练 token,可能比 30B 数据集跑 1 epoch 更优(Phi‑4 报告:</w:t>
+      </w:r>
+      <w:r>
+        <w:rPr>
+          <w:bCs/>
+          <w:b/>
+        </w:rPr>
+        <w:t xml:space="preserve">12 epoch 合成数据 &gt; 1 epoch 更多 unique web token</w:t>
+      </w:r>
+      <w:r>
+        <w:t xml:space="preserve">)。</w:t>
+      </w:r>
+    </w:p>
+    <w:p>
+      <w:pPr>
+        <w:numPr>
+          <w:ilvl w:val="1"/>
+          <w:numId w:val="1007"/>
+        </w:numPr>
+        <w:pStyle w:val="Compact"/>
+      </w:pPr>
+      <w:r>
+        <w:t xml:space="preserve">因此”截断实验”应该是</w:t>
+      </w:r>
+      <w:r>
+        <w:rPr>
+          <w:bCs/>
+          <w:b/>
+        </w:rPr>
+        <w:t xml:space="preserve">两个轴的网格</w:t>
+      </w:r>
+      <w:r>
+        <w:t xml:space="preserve">:</w:t>
       </w:r>
       <w:r>
         <w:rPr>
           <w:rStyle w:val="VerbatimChar"/>
         </w:rPr>
-        <w:t xml:space="preserve">datatrove</w:t>
-      </w:r>
-      <w:r>
-        <w:t xml:space="preserve">,与 Cosmopedia 同参数:n‑gram=5,阈值 0.7)</w:t>
+        <w:t xml:space="preserve">{数据集 size: 1, 3, 5, 10, 15, 30B} × {训练 token: 30B, 100B}</w:t>
+      </w:r>
+      <w:r>
+        <w:t xml:space="preserve">,而不是单轴。</w:t>
       </w:r>
     </w:p>
     <w:p>
@@ -2466,24 +2183,49 @@
           <w:ilvl w:val="0"/>
           <w:numId w:val="1006"/>
         </w:numPr>
-        <w:pStyle w:val="Compact"/>
       </w:pPr>
       <w:r>
         <w:rPr>
           <w:bCs/>
           <w:b/>
         </w:rPr>
-        <w:t xml:space="preserve">Embedding‑level near‑dup</w:t>
-      </w:r>
-      <w:r>
-        <w:t xml:space="preserve">(BGE‑small / nomic‑embed,阈值 cos&gt;0.92):</w:t>
+        <w:t xml:space="preserve">定一个”涌现监测器”</w:t>
+      </w:r>
+      <w:r>
+        <w:t xml:space="preserve">:每次 ablation 都画</w:t>
+      </w:r>
+      <w:r>
+        <w:t xml:space="preserve"> </w:t>
+      </w:r>
+      <w:r>
+        <w:rPr>
+          <w:iCs/>
+          <w:i/>
+        </w:rPr>
+        <w:t xml:space="preserve">训练 token vs 各 benchmark</w:t>
+      </w:r>
+      <w:r>
+        <w:t xml:space="preserve">。</w:t>
       </w:r>
       <w:r>
         <w:rPr>
           <w:bCs/>
           <w:b/>
         </w:rPr>
-        <w:t xml:space="preserve">Cosmopedia 没做,这是你的关键超越点之一</w:t>
+        <w:t xml:space="preserve">涌现的标志是某个 benchmark 在某 token 数突然非线性跃升</w:t>
+      </w:r>
+      <w:r>
+        <w:t xml:space="preserve">。一旦观察到,</w:t>
+      </w:r>
+      <w:r>
+        <w:rPr>
+          <w:bCs/>
+          <w:b/>
+        </w:rPr>
+        <w:t xml:space="preserve">马上在那个区间加密采样</w:t>
+      </w:r>
+      <w:r>
+        <w:t xml:space="preserve">(比如 25–35B 之间每 2B 存 ckpt)。</w:t>
       </w:r>
     </w:p>
     <w:p>
@@ -2492,109 +2234,16 @@
           <w:ilvl w:val="0"/>
           <w:numId w:val="1006"/>
         </w:numPr>
-        <w:pStyle w:val="Compact"/>
       </w:pPr>
       <w:r>
         <w:rPr>
           <w:bCs/>
           <w:b/>
         </w:rPr>
-        <w:t xml:space="preserve">Quality classifier</w:t>
-      </w:r>
-      <w:r>
-        <w:t xml:space="preserve">:复用</w:t>
-      </w:r>
-      <w:r>
-        <w:t xml:space="preserve"> </w:t>
-      </w:r>
-      <w:r>
-        <w:rPr>
-          <w:rStyle w:val="VerbatimChar"/>
-        </w:rPr>
-        <w:t xml:space="preserve">HuggingFaceFW/fineweb-edu-classifier</w:t>
-      </w:r>
-      <w:r>
-        <w:t xml:space="preserve"> </w:t>
-      </w:r>
-      <w:r>
-        <w:t xml:space="preserve">给每条打分,只保留 score≥3 → 这是 FineWeb‑Edu 提分的核心 trick</w:t>
-      </w:r>
-    </w:p>
-    <w:p>
-      <w:pPr>
-        <w:numPr>
-          <w:ilvl w:val="0"/>
-          <w:numId w:val="1006"/>
-        </w:numPr>
-        <w:pStyle w:val="Compact"/>
-      </w:pPr>
-      <w:r>
-        <w:rPr>
-          <w:bCs/>
-          <w:b/>
-        </w:rPr>
-        <w:t xml:space="preserve">Decontamination</w:t>
-      </w:r>
-      <w:r>
-        <w:t xml:space="preserve">:沿用 cosmopedia 的 10‑gram + 0.5 ratio,</w:t>
-      </w:r>
-      <w:r>
-        <w:rPr>
-          <w:bCs/>
-          <w:b/>
-        </w:rPr>
-        <w:t xml:space="preserve">新增对 GSM8k/MATH/HumanEval/MBPP 的覆盖</w:t>
-      </w:r>
-    </w:p>
-    <w:p>
-      <w:r>
-        <w:pict>
-          <v:rect style="width:0;height:1.5pt" o:hralign="center" o:hrstd="t" o:hr="t"/>
-        </w:pict>
-      </w:r>
-    </w:p>
-    <w:bookmarkEnd w:id="32"/>
-    <w:bookmarkEnd w:id="33"/>
-    <w:bookmarkStart w:id="34" w:name="关于量级是不是定-10b我的看法原文-3.4"/>
-    <w:p>
-      <w:pPr>
-        <w:pStyle w:val="Heading1"/>
-      </w:pPr>
-      <w:r>
-        <w:t xml:space="preserve">6. 关于”量级是不是定 10B”——我的看法(原文 §3.4)</w:t>
-      </w:r>
-    </w:p>
-    <w:p>
-      <w:pPr>
-        <w:pStyle w:val="FirstParagraph"/>
-      </w:pPr>
-      <w:r>
-        <w:rPr>
-          <w:bCs/>
-          <w:b/>
-        </w:rPr>
-        <w:t xml:space="preserve">你直觉是对的:不要锁死 10B</w:t>
-      </w:r>
-      <w:r>
-        <w:t xml:space="preserve">。我的建议比你的”3/5/8/10/15B 截断”更进一步:</w:t>
-      </w:r>
-    </w:p>
-    <w:p>
-      <w:pPr>
-        <w:numPr>
-          <w:ilvl w:val="0"/>
-          <w:numId w:val="1007"/>
-        </w:numPr>
-      </w:pPr>
-      <w:r>
-        <w:rPr>
-          <w:bCs/>
-          <w:b/>
-        </w:rPr>
-        <w:t xml:space="preserve">解耦”数据集 size”和”训练消耗 token 数”</w:t>
-      </w:r>
-      <w:r>
-        <w:t xml:space="preserve">——这是评估合成数据最容易踩的坑。</w:t>
+        <w:t xml:space="preserve">优先级建议</w:t>
+      </w:r>
+      <w:r>
+        <w:t xml:space="preserve">:</w:t>
       </w:r>
     </w:p>
     <w:p>
@@ -2606,17 +2255,30 @@
         <w:pStyle w:val="Compact"/>
       </w:pPr>
       <w:r>
-        <w:t xml:space="preserve">一个 5B 的高密度数据集,跑 6 epoch ≈ 30B 训练 token,可能比 30B 数据集跑 1 epoch 更优(Phi‑4 报告:</w:t>
+        <w:t xml:space="preserve">第一阶段(2–4 周):先做到</w:t>
+      </w:r>
+      <w:r>
+        <w:t xml:space="preserve"> </w:t>
       </w:r>
       <w:r>
         <w:rPr>
           <w:bCs/>
           <w:b/>
         </w:rPr>
-        <w:t xml:space="preserve">12 epoch 合成数据 &gt; 1 epoch 更多 unique web token</w:t>
-      </w:r>
-      <w:r>
-        <w:t xml:space="preserve">)。</w:t>
+        <w:t xml:space="preserve">3B 高质量 Incepedia</w:t>
+      </w:r>
+      <w:r>
+        <w:t xml:space="preserve">,跑 30B token ablation,</w:t>
+      </w:r>
+      <w:r>
+        <w:rPr>
+          <w:bCs/>
+          <w:b/>
+        </w:rPr>
+        <w:t xml:space="preserve">和 Cosmopedia‑v2 同设置打成平手或更好</w:t>
+      </w:r>
+      <w:r>
+        <w:t xml:space="preserve">——这是 PoC,先证明”方法论有效”。</w:t>
       </w:r>
     </w:p>
     <w:p>
@@ -2628,33 +2290,52 @@
         <w:pStyle w:val="Compact"/>
       </w:pPr>
       <w:r>
-        <w:t xml:space="preserve">因此你的”截断实验”应该是</w:t>
+        <w:t xml:space="preserve">第二阶段(1–2 月):扩到 10B + 多领域配比 ablation,目标是</w:t>
+      </w:r>
+      <w:r>
+        <w:t xml:space="preserve"> </w:t>
       </w:r>
       <w:r>
         <w:rPr>
           <w:bCs/>
           <w:b/>
         </w:rPr>
-        <w:t xml:space="preserve">两个轴的网格</w:t>
-      </w:r>
-      <w:r>
-        <w:t xml:space="preserve">:</w:t>
-      </w:r>
-      <w:r>
-        <w:rPr>
-          <w:rStyle w:val="VerbatimChar"/>
-        </w:rPr>
-        <w:t xml:space="preserve">{数据集 size: 1, 3, 5, 10, 15, 30B} × {训练 token: 30B, 100B}</w:t>
-      </w:r>
-      <w:r>
-        <w:t xml:space="preserve">,而不是单轴。</w:t>
+        <w:t xml:space="preserve">MMLU/GSM8k 显著超过 Cosmopedia‑v2</w:t>
+      </w:r>
+      <w:r>
+        <w:t xml:space="preserve">。</w:t>
+      </w:r>
+    </w:p>
+    <w:p>
+      <w:pPr>
+        <w:numPr>
+          <w:ilvl w:val="1"/>
+          <w:numId w:val="1008"/>
+        </w:numPr>
+        <w:pStyle w:val="Compact"/>
+      </w:pPr>
+      <w:r>
+        <w:t xml:space="preserve">第三阶段:扩到 30B + 与 FineWeb‑Edu 混合,目标超过</w:t>
+      </w:r>
+      <w:r>
+        <w:t xml:space="preserve"> </w:t>
+      </w:r>
+      <w:r>
+        <w:rPr>
+          <w:bCs/>
+          <w:b/>
+        </w:rPr>
+        <w:t xml:space="preserve">SmolLM2 公开数字</w:t>
+      </w:r>
+      <w:r>
+        <w:t xml:space="preserve">。</w:t>
       </w:r>
     </w:p>
     <w:p>
       <w:pPr>
         <w:numPr>
           <w:ilvl w:val="0"/>
-          <w:numId w:val="1007"/>
+          <w:numId w:val="1006"/>
         </w:numPr>
       </w:pPr>
       <w:r>
@@ -2662,370 +2343,216 @@
           <w:bCs/>
           <w:b/>
         </w:rPr>
-        <w:t xml:space="preserve">定一个”涌现监测器”</w:t>
-      </w:r>
-      <w:r>
-        <w:t xml:space="preserve">:每次 ablation 都画</w:t>
+        <w:t xml:space="preserve">量级的”科学截断点”</w:t>
+      </w:r>
+      <w:r>
+        <w:t xml:space="preserve">怎么找:训练 loss 在 valid set 上的</w:t>
       </w:r>
       <w:r>
         <w:t xml:space="preserve"> </w:t>
-      </w:r>
-      <w:r>
-        <w:rPr>
-          <w:iCs/>
-          <w:i/>
-        </w:rPr>
-        <w:t xml:space="preserve">训练 token vs 各 benchmark</w:t>
-      </w:r>
-      <w:r>
-        <w:t xml:space="preserve">。</w:t>
       </w:r>
       <w:r>
         <w:rPr>
           <w:bCs/>
           <w:b/>
         </w:rPr>
-        <w:t xml:space="preserve">涌现的标志是某个 benchmark 在某 token 数突然非线性跃升</w:t>
-      </w:r>
-      <w:r>
-        <w:t xml:space="preserve">。一旦观察到,</w:t>
+        <w:t xml:space="preserve">per‑domain perplexity</w:t>
+      </w:r>
+      <w:r>
+        <w:t xml:space="preserve"> </w:t>
+      </w:r>
+      <w:r>
+        <w:t xml:space="preserve">曲线 + benchmark 分数曲线,</w:t>
       </w:r>
       <w:r>
         <w:rPr>
           <w:bCs/>
           <w:b/>
         </w:rPr>
-        <w:t xml:space="preserve">马上在那个区间加密采样</w:t>
-      </w:r>
-      <w:r>
-        <w:t xml:space="preserve">(比如 25–35B 之间每 2B 存 ckpt)。</w:t>
+        <w:t xml:space="preserve">两者同时 plateau</w:t>
+      </w:r>
+      <w:r>
+        <w:t xml:space="preserve"> </w:t>
+      </w:r>
+      <w:r>
+        <w:t xml:space="preserve">的点就是该尺寸的”够了”信号。</w:t>
+      </w:r>
+    </w:p>
+    <w:p>
+      <w:r>
+        <w:pict>
+          <v:rect style="width:0;height:1.5pt" o:hralign="center" o:hrstd="t" o:hr="t"/>
+        </w:pict>
+      </w:r>
+    </w:p>
+    <w:bookmarkEnd w:id="33"/>
+    <w:bookmarkStart w:id="38" w:name="什么是-ablation-training怎么用到-incepedia-生成里"/>
+    <w:p>
+      <w:pPr>
+        <w:pStyle w:val="Heading1"/>
+      </w:pPr>
+      <w:r>
+        <w:t xml:space="preserve">7. 什么是 Ablation Training?怎么用到 Incepedia 生成里</w:t>
+      </w:r>
+    </w:p>
+    <w:bookmarkStart w:id="34" w:name="严格定义"/>
+    <w:p>
+      <w:pPr>
+        <w:pStyle w:val="Heading2"/>
+      </w:pPr>
+      <w:r>
+        <w:t xml:space="preserve">7.1 严格定义</w:t>
+      </w:r>
+    </w:p>
+    <w:p>
+      <w:pPr>
+        <w:pStyle w:val="FirstParagraph"/>
+      </w:pPr>
+      <w:r>
+        <w:rPr>
+          <w:bCs/>
+          <w:b/>
+        </w:rPr>
+        <w:t xml:space="preserve">Ablation Training =</w:t>
+      </w:r>
+      <w:r>
+        <w:rPr>
+          <w:bCs/>
+          <w:b/>
+        </w:rPr>
+        <w:t xml:space="preserve"> </w:t>
+      </w:r>
+      <w:r>
+        <w:rPr>
+          <w:bCs/>
+          <w:b/>
+        </w:rPr>
+        <w:t xml:space="preserve">“</w:t>
+      </w:r>
+      <w:r>
+        <w:rPr>
+          <w:bCs/>
+          <w:b/>
+        </w:rPr>
+        <w:t xml:space="preserve">控制变量法</w:t>
+      </w:r>
+      <w:r>
+        <w:rPr>
+          <w:bCs/>
+          <w:b/>
+        </w:rPr>
+        <w:t xml:space="preserve">”</w:t>
+      </w:r>
+      <w:r>
+        <w:rPr>
+          <w:bCs/>
+          <w:b/>
+        </w:rPr>
+        <w:t xml:space="preserve">在数据集/训练 pipeline 上的应用。</w:t>
+      </w:r>
+      <w:r>
+        <w:t xml:space="preserve"> </w:t>
+      </w:r>
+      <w:r>
+        <w:t xml:space="preserve">固定除一个变量外的所有东西(模型架构、初始化 seed、tokenizer、token 总数、超参、评测脚本),</w:t>
+      </w:r>
+      <w:r>
+        <w:rPr>
+          <w:bCs/>
+          <w:b/>
+        </w:rPr>
+        <w:t xml:space="preserve">只动要研究的那一个变量</w:t>
+      </w:r>
+      <w:r>
+        <w:t xml:space="preserve">,看下游模型 benchmark 的差异。</w:t>
+      </w:r>
+    </w:p>
+    <w:bookmarkEnd w:id="34"/>
+    <w:bookmarkStart w:id="35" w:name="它和训完一个模型测一下的本质区别"/>
+    <w:p>
+      <w:pPr>
+        <w:pStyle w:val="Heading2"/>
+      </w:pPr>
+      <w:r>
+        <w:t xml:space="preserve">7.2 它和”训完一个模型测一下”的本质区别</w:t>
       </w:r>
     </w:p>
     <w:p>
       <w:pPr>
         <w:numPr>
           <w:ilvl w:val="0"/>
-          <w:numId w:val="1007"/>
-        </w:numPr>
-      </w:pPr>
-      <w:r>
-        <w:rPr>
-          <w:bCs/>
-          <w:b/>
-        </w:rPr>
-        <w:t xml:space="preserve">优先级建议</w:t>
-      </w:r>
-      <w:r>
-        <w:t xml:space="preserve">:</w:t>
-      </w:r>
-    </w:p>
-    <w:p>
-      <w:pPr>
-        <w:numPr>
-          <w:ilvl w:val="1"/>
           <w:numId w:val="1009"/>
         </w:numPr>
         <w:pStyle w:val="Compact"/>
       </w:pPr>
       <w:r>
-        <w:t xml:space="preserve">第一阶段(2–4 周):先做到</w:t>
-      </w:r>
-      <w:r>
-        <w:t xml:space="preserve"> </w:t>
+        <w:t xml:space="preserve">单次训练得到的是</w:t>
       </w:r>
       <w:r>
         <w:rPr>
           <w:bCs/>
           <w:b/>
         </w:rPr>
-        <w:t xml:space="preserve">3B 高质量 Incepedia</w:t>
-      </w:r>
-      <w:r>
-        <w:t xml:space="preserve">,跑 30B token ablation,</w:t>
-      </w:r>
-      <w:r>
-        <w:rPr>
-          <w:bCs/>
-          <w:b/>
-        </w:rPr>
-        <w:t xml:space="preserve">和 Cosmopedia‑v2 同设置打成平手或更好</w:t>
-      </w:r>
-      <w:r>
-        <w:t xml:space="preserve">——这是 PoC,先证明”我的方法论有效”。</w:t>
+        <w:t xml:space="preserve">绝对分数</w:t>
+      </w:r>
+      <w:r>
+        <w:t xml:space="preserve">——可能是数据好,可能是 lr 好,可能是 seed 走运</w:t>
       </w:r>
     </w:p>
     <w:p>
       <w:pPr>
         <w:numPr>
-          <w:ilvl w:val="1"/>
+          <w:ilvl w:val="0"/>
           <w:numId w:val="1009"/>
         </w:numPr>
         <w:pStyle w:val="Compact"/>
       </w:pPr>
       <w:r>
-        <w:t xml:space="preserve">第二阶段(1–2 月):扩到 10B + 多领域配比 ablation,目标是</w:t>
-      </w:r>
-      <w:r>
-        <w:t xml:space="preserve"> </w:t>
+        <w:t xml:space="preserve">ablation 得到的是</w:t>
       </w:r>
       <w:r>
         <w:rPr>
           <w:bCs/>
           <w:b/>
         </w:rPr>
-        <w:t xml:space="preserve">MMLU/GSM8k 显著超过 Cosmopedia‑v2</w:t>
-      </w:r>
-      <w:r>
-        <w:t xml:space="preserve">。</w:t>
-      </w:r>
-    </w:p>
-    <w:p>
-      <w:pPr>
-        <w:numPr>
-          <w:ilvl w:val="1"/>
-          <w:numId w:val="1009"/>
-        </w:numPr>
-        <w:pStyle w:val="Compact"/>
-      </w:pPr>
-      <w:r>
-        <w:t xml:space="preserve">第三阶段:扩到 30B + 与 FineWeb‑Edu 混合,目标超过</w:t>
-      </w:r>
-      <w:r>
-        <w:t xml:space="preserve"> </w:t>
+        <w:t xml:space="preserve">因果增量</w:t>
+      </w:r>
+      <w:r>
+        <w:t xml:space="preserve">——</w:t>
+      </w:r>
+      <w:r>
+        <w:t xml:space="preserve">“</w:t>
+      </w:r>
+      <w:r>
+        <w:t xml:space="preserve">加了 persona pool,MMLU 涨了 0.6pp,可信度 95%</w:t>
+      </w:r>
+      <w:r>
+        <w:t xml:space="preserve">”</w:t>
+      </w:r>
+    </w:p>
+    <w:bookmarkEnd w:id="35"/>
+    <w:bookmarkStart w:id="36" w:name="用到-incepedia-生成的具体场景"/>
+    <w:p>
+      <w:pPr>
+        <w:pStyle w:val="Heading2"/>
+      </w:pPr>
+      <w:r>
+        <w:t xml:space="preserve">7.3 用到 Incepedia 生成的具体场景</w:t>
+      </w:r>
+    </w:p>
+    <w:p>
+      <w:pPr>
+        <w:pStyle w:val="FirstParagraph"/>
+      </w:pPr>
+      <w:r>
+        <w:t xml:space="preserve">10 个</w:t>
       </w:r>
       <w:r>
         <w:rPr>
           <w:bCs/>
           <w:b/>
         </w:rPr>
-        <w:t xml:space="preserve">SmolLM2 公开数字</w:t>
-      </w:r>
-      <w:r>
-        <w:t xml:space="preserve">。</w:t>
-      </w:r>
-    </w:p>
-    <w:p>
-      <w:pPr>
-        <w:numPr>
-          <w:ilvl w:val="0"/>
-          <w:numId w:val="1007"/>
-        </w:numPr>
-      </w:pPr>
-      <w:r>
-        <w:rPr>
-          <w:bCs/>
-          <w:b/>
-        </w:rPr>
-        <w:t xml:space="preserve">量级的”科学截断点”</w:t>
-      </w:r>
-      <w:r>
-        <w:t xml:space="preserve">怎么找:训练 loss 在 valid set 上的</w:t>
-      </w:r>
-      <w:r>
-        <w:t xml:space="preserve"> </w:t>
-      </w:r>
-      <w:r>
-        <w:rPr>
-          <w:bCs/>
-          <w:b/>
-        </w:rPr>
-        <w:t xml:space="preserve">per‑domain perplexity</w:t>
-      </w:r>
-      <w:r>
-        <w:t xml:space="preserve"> </w:t>
-      </w:r>
-      <w:r>
-        <w:t xml:space="preserve">曲线 + benchmark 分数曲线,</w:t>
-      </w:r>
-      <w:r>
-        <w:rPr>
-          <w:bCs/>
-          <w:b/>
-        </w:rPr>
-        <w:t xml:space="preserve">两者同时 plateau</w:t>
-      </w:r>
-      <w:r>
-        <w:t xml:space="preserve"> </w:t>
-      </w:r>
-      <w:r>
-        <w:t xml:space="preserve">的点就是该尺寸的”够了”信号。</w:t>
-      </w:r>
-    </w:p>
-    <w:p>
-      <w:r>
-        <w:pict>
-          <v:rect style="width:0;height:1.5pt" o:hralign="center" o:hrstd="t" o:hr="t"/>
-        </w:pict>
-      </w:r>
-    </w:p>
-    <w:bookmarkEnd w:id="34"/>
-    <w:bookmarkStart w:id="39" w:name="什么是-ablation-training怎么用到-incepedia-生成里"/>
-    <w:p>
-      <w:pPr>
-        <w:pStyle w:val="Heading1"/>
-      </w:pPr>
-      <w:r>
-        <w:t xml:space="preserve">7. 什么是 Ablation Training?怎么用到 Incepedia 生成里</w:t>
-      </w:r>
-    </w:p>
-    <w:bookmarkStart w:id="35" w:name="严格定义"/>
-    <w:p>
-      <w:pPr>
-        <w:pStyle w:val="Heading2"/>
-      </w:pPr>
-      <w:r>
-        <w:t xml:space="preserve">7.1 严格定义</w:t>
-      </w:r>
-    </w:p>
-    <w:p>
-      <w:pPr>
-        <w:pStyle w:val="FirstParagraph"/>
-      </w:pPr>
-      <w:r>
-        <w:rPr>
-          <w:bCs/>
-          <w:b/>
-        </w:rPr>
-        <w:t xml:space="preserve">Ablation Training =</w:t>
-      </w:r>
-      <w:r>
-        <w:rPr>
-          <w:bCs/>
-          <w:b/>
-        </w:rPr>
-        <w:t xml:space="preserve"> </w:t>
-      </w:r>
-      <w:r>
-        <w:rPr>
-          <w:bCs/>
-          <w:b/>
-        </w:rPr>
-        <w:t xml:space="preserve">“</w:t>
-      </w:r>
-      <w:r>
-        <w:rPr>
-          <w:bCs/>
-          <w:b/>
-        </w:rPr>
-        <w:t xml:space="preserve">控制变量法</w:t>
-      </w:r>
-      <w:r>
-        <w:rPr>
-          <w:bCs/>
-          <w:b/>
-        </w:rPr>
-        <w:t xml:space="preserve">”</w:t>
-      </w:r>
-      <w:r>
-        <w:rPr>
-          <w:bCs/>
-          <w:b/>
-        </w:rPr>
-        <w:t xml:space="preserve">在数据集/训练 pipeline 上的应用。</w:t>
-      </w:r>
-      <w:r>
-        <w:t xml:space="preserve"> </w:t>
-      </w:r>
-      <w:r>
-        <w:t xml:space="preserve">固定除一个变量外的所有东西(模型架构、初始化 seed、tokenizer、token 总数、超参、评测脚本),</w:t>
-      </w:r>
-      <w:r>
-        <w:rPr>
-          <w:bCs/>
-          <w:b/>
-        </w:rPr>
-        <w:t xml:space="preserve">只动你要研究的那一个变量</w:t>
-      </w:r>
-      <w:r>
-        <w:t xml:space="preserve">,看下游模型 benchmark 的差异。</w:t>
-      </w:r>
-    </w:p>
-    <w:bookmarkEnd w:id="35"/>
-    <w:bookmarkStart w:id="36" w:name="它和训完一个模型测一下的本质区别"/>
-    <w:p>
-      <w:pPr>
-        <w:pStyle w:val="Heading2"/>
-      </w:pPr>
-      <w:r>
-        <w:t xml:space="preserve">7.2 它和”训完一个模型测一下”的本质区别</w:t>
-      </w:r>
-    </w:p>
-    <w:p>
-      <w:pPr>
-        <w:numPr>
-          <w:ilvl w:val="0"/>
-          <w:numId w:val="1010"/>
-        </w:numPr>
-        <w:pStyle w:val="Compact"/>
-      </w:pPr>
-      <w:r>
-        <w:t xml:space="preserve">单次训练得到的是</w:t>
-      </w:r>
-      <w:r>
-        <w:rPr>
-          <w:bCs/>
-          <w:b/>
-        </w:rPr>
-        <w:t xml:space="preserve">绝对分数</w:t>
-      </w:r>
-      <w:r>
-        <w:t xml:space="preserve">——可能是数据好,可能是 lr 好,可能是 seed 走运</w:t>
-      </w:r>
-    </w:p>
-    <w:p>
-      <w:pPr>
-        <w:numPr>
-          <w:ilvl w:val="0"/>
-          <w:numId w:val="1010"/>
-        </w:numPr>
-        <w:pStyle w:val="Compact"/>
-      </w:pPr>
-      <w:r>
-        <w:t xml:space="preserve">ablation 得到的是</w:t>
-      </w:r>
-      <w:r>
-        <w:rPr>
-          <w:bCs/>
-          <w:b/>
-        </w:rPr>
-        <w:t xml:space="preserve">因果增量</w:t>
-      </w:r>
-      <w:r>
-        <w:t xml:space="preserve">——</w:t>
-      </w:r>
-      <w:r>
-        <w:t xml:space="preserve">“</w:t>
-      </w:r>
-      <w:r>
-        <w:t xml:space="preserve">加了 persona pool,MMLU 涨了 0.6pp,可信度 95%</w:t>
-      </w:r>
-      <w:r>
-        <w:t xml:space="preserve">”</w:t>
-      </w:r>
-    </w:p>
-    <w:bookmarkEnd w:id="36"/>
-    <w:bookmarkStart w:id="37" w:name="用到-incepedia-生成的具体场景"/>
-    <w:p>
-      <w:pPr>
-        <w:pStyle w:val="Heading2"/>
-      </w:pPr>
-      <w:r>
-        <w:t xml:space="preserve">7.3 用到 Incepedia 生成的具体场景</w:t>
-      </w:r>
-    </w:p>
-    <w:p>
-      <w:pPr>
-        <w:pStyle w:val="FirstParagraph"/>
-      </w:pPr>
-      <w:r>
-        <w:t xml:space="preserve">我列 10 个</w:t>
-      </w:r>
-      <w:r>
-        <w:rPr>
-          <w:bCs/>
-          <w:b/>
-        </w:rPr>
-        <w:t xml:space="preserve">当前你最该跑的 ablation 实验</w:t>
+        <w:t xml:space="preserve">当前最该跑的 ablation 实验</w:t>
       </w:r>
       <w:r>
         <w:t xml:space="preserve">(每个 30B token × 2 seed,8×H100 上 1‑2 天一组):</w:t>
@@ -3731,8 +3258,8 @@
         </w:tc>
       </w:tr>
     </w:tbl>
-    <w:bookmarkEnd w:id="37"/>
-    <w:bookmarkStart w:id="38" w:name="两个降本关键技巧"/>
+    <w:bookmarkEnd w:id="36"/>
+    <w:bookmarkStart w:id="37" w:name="两个降本关键技巧"/>
     <w:p>
       <w:pPr>
         <w:pStyle w:val="Heading2"/>
@@ -3745,7 +3272,7 @@
       <w:pPr>
         <w:numPr>
           <w:ilvl w:val="0"/>
-          <w:numId w:val="1011"/>
+          <w:numId w:val="1010"/>
         </w:numPr>
       </w:pPr>
       <w:r>
@@ -3773,7 +3300,7 @@
       <w:pPr>
         <w:numPr>
           <w:ilvl w:val="0"/>
-          <w:numId w:val="1011"/>
+          <w:numId w:val="1010"/>
         </w:numPr>
       </w:pPr>
       <w:r>
@@ -3804,9 +3331,9 @@
         </w:pict>
       </w:r>
     </w:p>
+    <w:bookmarkEnd w:id="37"/>
     <w:bookmarkEnd w:id="38"/>
-    <w:bookmarkEnd w:id="39"/>
-    <w:bookmarkStart w:id="43" w:name="当前在做的复现-cosmopedia-v2-reference-baseline"/>
+    <w:bookmarkStart w:id="42" w:name="当前在做的复现-cosmopedia-v2-reference-baseline"/>
     <w:p>
       <w:pPr>
         <w:pStyle w:val="Heading1"/>
@@ -3815,15 +3342,7 @@
         <w:t xml:space="preserve">8. 当前在做的:复现 Cosmopedia v2 reference baseline</w:t>
       </w:r>
     </w:p>
-    <w:p>
-      <w:pPr>
-        <w:pStyle w:val="FirstParagraph"/>
-      </w:pPr>
-      <w:r>
-        <w:t xml:space="preserve">(以下文字综合摘自方法论 §2.2 与 ADR 0004 的双轨协议描述)</w:t>
-      </w:r>
-    </w:p>
-    <w:bookmarkStart w:id="40" w:name="track-1-standalone独立-corpus-能力"/>
+    <w:bookmarkStart w:id="39" w:name="track-1-standalone独立-corpus-能力"/>
     <w:p>
       <w:pPr>
         <w:pStyle w:val="Heading2"/>
@@ -4009,8 +3528,8 @@
         </w:tc>
       </w:tr>
     </w:tbl>
-    <w:bookmarkEnd w:id="40"/>
-    <w:bookmarkStart w:id="41" w:name="track-2-seasoningdecay-调料能力"/>
+    <w:bookmarkEnd w:id="39"/>
+    <w:bookmarkStart w:id="40" w:name="track-2-seasoningdecay-调料能力"/>
     <w:p>
       <w:pPr>
         <w:pStyle w:val="Heading2"/>
@@ -4095,18 +3614,22 @@
           <w:p>
             <w:pPr>
               <w:pStyle w:val="Compact"/>
-            </w:pPr>
-          </w:p>
-        </w:tc>
-        <w:tc>
-          <w:tcPr/>
-          <w:p>
-            <w:pPr>
-              <w:pStyle w:val="Compact"/>
-              <w:jc w:val="left"/>
-            </w:pPr>
-            <w:r>
-              <w:t xml:space="preserve">Backbone:1.82B Llama2 × 20B tokens FineWeb‑Edu(trapezoidal LR,warmup+stable 阶段结束保存 ckpt)——</w:t>
+              <w:jc w:val="left"/>
+            </w:pPr>
+            <w:r>
+              <w:t xml:space="preserve">协议 · backbone</w:t>
+            </w:r>
+          </w:p>
+        </w:tc>
+        <w:tc>
+          <w:tcPr/>
+          <w:p>
+            <w:pPr>
+              <w:pStyle w:val="Compact"/>
+              <w:jc w:val="left"/>
+            </w:pPr>
+            <w:r>
+              <w:t xml:space="preserve">1.82B Llama2 × 20B tokens FineWeb‑Edu(trapezoidal LR,warmup+stable 阶段结束保存 ckpt)——</w:t>
             </w:r>
             <w:r>
               <w:t xml:space="preserve"> </w:t>
@@ -4127,18 +3650,22 @@
           <w:p>
             <w:pPr>
               <w:pStyle w:val="Compact"/>
-            </w:pPr>
-          </w:p>
-        </w:tc>
-        <w:tc>
-          <w:tcPr/>
-          <w:p>
-            <w:pPr>
-              <w:pStyle w:val="Compact"/>
-              <w:jc w:val="left"/>
-            </w:pPr>
-            <w:r>
-              <w:t xml:space="preserve">Fork:从 backbone ckpt 分叉,LR 从 peak 线性衰减到 0,喂 6B tokens 的测试数据集</w:t>
+              <w:jc w:val="left"/>
+            </w:pPr>
+            <w:r>
+              <w:t xml:space="preserve">协议 · fork</w:t>
+            </w:r>
+          </w:p>
+        </w:tc>
+        <w:tc>
+          <w:tcPr/>
+          <w:p>
+            <w:pPr>
+              <w:pStyle w:val="Compact"/>
+              <w:jc w:val="left"/>
+            </w:pPr>
+            <w:r>
+              <w:t xml:space="preserve">从 backbone ckpt 分叉,LR 从 peak 线性衰减到 0,喂 6B tokens 的测试数据集</w:t>
             </w:r>
           </w:p>
         </w:tc>
@@ -4228,8 +3755,8 @@
         </w:tc>
       </w:tr>
     </w:tbl>
-    <w:bookmarkEnd w:id="41"/>
-    <w:bookmarkStart w:id="42" w:name="当前阶段的具体实验单"/>
+    <w:bookmarkEnd w:id="40"/>
+    <w:bookmarkStart w:id="41" w:name="当前阶段的具体实验单"/>
     <w:p>
       <w:pPr>
         <w:pStyle w:val="Heading2"/>
@@ -5092,9 +4619,9 @@
         </w:pict>
       </w:r>
     </w:p>
+    <w:bookmarkEnd w:id="41"/>
     <w:bookmarkEnd w:id="42"/>
-    <w:bookmarkEnd w:id="43"/>
-    <w:bookmarkStart w:id="51" w:name="修正后的-step-c-决策清单c1-c16"/>
+    <w:bookmarkStart w:id="50" w:name="修正后的-step-c-决策清单c1-c16"/>
     <w:p>
       <w:pPr>
         <w:pStyle w:val="Heading1"/>
@@ -5103,7 +4630,7 @@
         <w:t xml:space="preserve">9. 修正后的 Step C 决策清单(C1 – C16)</w:t>
       </w:r>
     </w:p>
-    <w:bookmarkStart w:id="44" w:name="基础策略c1-c4"/>
+    <w:bookmarkStart w:id="43" w:name="基础策略c1-c4"/>
     <w:p>
       <w:pPr>
         <w:pStyle w:val="Heading2"/>
@@ -5386,8 +4913,8 @@
         </w:tc>
       </w:tr>
     </w:tbl>
-    <w:bookmarkEnd w:id="44"/>
-    <w:bookmarkStart w:id="45" w:name="生成器-生产线c5-c12"/>
+    <w:bookmarkEnd w:id="43"/>
+    <w:bookmarkStart w:id="44" w:name="生成器-生产线c5-c12"/>
     <w:p>
       <w:pPr>
         <w:pStyle w:val="Heading2"/>
@@ -5731,8 +5258,8 @@
         </w:tc>
       </w:tr>
     </w:tbl>
-    <w:bookmarkEnd w:id="45"/>
-    <w:bookmarkStart w:id="50" w:name="关键超越点c13-c16新增"/>
+    <w:bookmarkEnd w:id="44"/>
+    <w:bookmarkStart w:id="49" w:name="关键超越点c13-c16新增"/>
     <w:p>
       <w:pPr>
         <w:pStyle w:val="Heading2"/>
@@ -5756,13 +5283,86 @@
         <w:t xml:space="preserve">。</w:t>
       </w:r>
     </w:p>
-    <w:bookmarkStart w:id="46" w:name="c13-instruction-reversalphi-4-方法"/>
+    <w:bookmarkStart w:id="45" w:name="c13-instruction-reversalphi-4-方法"/>
     <w:p>
       <w:pPr>
         <w:pStyle w:val="Heading3"/>
       </w:pPr>
       <w:r>
         <w:t xml:space="preserve">C13 · Instruction reversal(Phi-4 方法)</w:t>
+      </w:r>
+    </w:p>
+    <w:p>
+      <w:pPr>
+        <w:numPr>
+          <w:ilvl w:val="0"/>
+          <w:numId w:val="1011"/>
+        </w:numPr>
+        <w:pStyle w:val="Compact"/>
+      </w:pPr>
+      <w:r>
+        <w:t xml:space="preserve">对每个 web 段落,让 generator 反推”这段话在回答什么问题”,生成</w:t>
+      </w:r>
+      <w:r>
+        <w:t xml:space="preserve"> </w:t>
+      </w:r>
+      <w:r>
+        <w:rPr>
+          <w:rStyle w:val="VerbatimChar"/>
+        </w:rPr>
+        <w:t xml:space="preserve">(question, answer)</w:t>
+      </w:r>
+      <w:r>
+        <w:t xml:space="preserve"> </w:t>
+      </w:r>
+      <w:r>
+        <w:t xml:space="preserve">对</w:t>
+      </w:r>
+    </w:p>
+    <w:p>
+      <w:pPr>
+        <w:numPr>
+          <w:ilvl w:val="0"/>
+          <w:numId w:val="1011"/>
+        </w:numPr>
+        <w:pStyle w:val="Compact"/>
+      </w:pPr>
+      <w:r>
+        <w:t xml:space="preserve">高质量的可以当 instruction-style pretrain 样本,也可输入到 textbook generator 做”Q&amp;A 章节”</w:t>
+      </w:r>
+    </w:p>
+    <w:p>
+      <w:pPr>
+        <w:numPr>
+          <w:ilvl w:val="0"/>
+          <w:numId w:val="1011"/>
+        </w:numPr>
+        <w:pStyle w:val="Compact"/>
+      </w:pPr>
+      <w:r>
+        <w:t xml:space="preserve">来源:Phi-4 技术报告明确列为核心方法</w:t>
+      </w:r>
+    </w:p>
+    <w:p>
+      <w:pPr>
+        <w:numPr>
+          <w:ilvl w:val="0"/>
+          <w:numId w:val="1011"/>
+        </w:numPr>
+        <w:pStyle w:val="Compact"/>
+      </w:pPr>
+      <w:r>
+        <w:t xml:space="preserve">占 Incepedia 总量 ~10–15%</w:t>
+      </w:r>
+    </w:p>
+    <w:bookmarkEnd w:id="45"/>
+    <w:bookmarkStart w:id="46" w:name="c14-风格反单调化anti-monotone"/>
+    <w:p>
+      <w:pPr>
+        <w:pStyle w:val="Heading3"/>
+      </w:pPr>
+      <w:r>
+        <w:t xml:space="preserve">C14 · 风格反单调化(anti-monotone)</w:t>
       </w:r>
     </w:p>
     <w:p>
@@ -5774,7 +5374,7 @@
         <w:pStyle w:val="Compact"/>
       </w:pPr>
       <w:r>
-        <w:t xml:space="preserve">对每个 web 段落,让 generator 反推”这段话在回答什么问题”,生成</w:t>
+        <w:t xml:space="preserve">维护</w:t>
       </w:r>
       <w:r>
         <w:t xml:space="preserve"> </w:t>
@@ -5783,13 +5383,10 @@
         <w:rPr>
           <w:rStyle w:val="VerbatimChar"/>
         </w:rPr>
-        <w:t xml:space="preserve">(question, answer)</w:t>
-      </w:r>
-      <w:r>
-        <w:t xml:space="preserve"> </w:t>
-      </w:r>
-      <w:r>
-        <w:t xml:space="preserve">对</w:t>
+        <w:t xml:space="preserve">configs/disallowed_openings.yaml</w:t>
+      </w:r>
+      <w:r>
+        <w:t xml:space="preserve">:持续扩充的”禁用开头短语”列表</w:t>
       </w:r>
     </w:p>
     <w:p>
@@ -5801,7 +5398,55 @@
         <w:pStyle w:val="Compact"/>
       </w:pPr>
       <w:r>
-        <w:t xml:space="preserve">高质量的可以当 instruction-style pretrain 样本,也可输入到 textbook generator 做”Q&amp;A 章节”</w:t>
+        <w:t xml:space="preserve">Cosmopedia 著名案例:</w:t>
+      </w:r>
+      <w:r>
+        <w:t xml:space="preserve">“</w:t>
+      </w:r>
+      <w:r>
+        <w:t xml:space="preserve">Once upon a time</w:t>
+      </w:r>
+      <w:r>
+        <w:t xml:space="preserve">”</w:t>
+      </w:r>
+      <w:r>
+        <w:t xml:space="preserve">、</w:t>
+      </w:r>
+      <w:r>
+        <w:t xml:space="preserve">“</w:t>
+      </w:r>
+      <w:r>
+        <w:t xml:space="preserve">A few years back</w:t>
+      </w:r>
+      <w:r>
+        <w:t xml:space="preserve">”</w:t>
+      </w:r>
+      <w:r>
+        <w:t xml:space="preserve">、</w:t>
+      </w:r>
+      <w:r>
+        <w:t xml:space="preserve">“</w:t>
+      </w:r>
+      <w:r>
+        <w:t xml:space="preserve">In recent years</w:t>
+      </w:r>
+      <w:r>
+        <w:t xml:space="preserve">”</w:t>
+      </w:r>
+      <w:r>
+        <w:t xml:space="preserve">、</w:t>
+      </w:r>
+      <w:r>
+        <w:t xml:space="preserve">“</w:t>
+      </w:r>
+      <w:r>
+        <w:t xml:space="preserve">It was a sunny morning</w:t>
+      </w:r>
+      <w:r>
+        <w:t xml:space="preserve">”</w:t>
+      </w:r>
+      <w:r>
+        <w:t xml:space="preserve">…</w:t>
       </w:r>
     </w:p>
     <w:p>
@@ -5813,7 +5458,28 @@
         <w:pStyle w:val="Compact"/>
       </w:pPr>
       <w:r>
-        <w:t xml:space="preserve">来源:Phi-4 技术报告明确列为核心方法</w:t>
+        <w:t xml:space="preserve">每批生成前把这个列表注入 system prompt:</w:t>
+      </w:r>
+      <w:r>
+        <w:rPr>
+          <w:iCs/>
+          <w:i/>
+        </w:rPr>
+        <w:t xml:space="preserve">“</w:t>
+      </w:r>
+      <w:r>
+        <w:rPr>
+          <w:iCs/>
+          <w:i/>
+        </w:rPr>
+        <w:t xml:space="preserve">Do not begin with any of: [list]</w:t>
+      </w:r>
+      <w:r>
+        <w:rPr>
+          <w:iCs/>
+          <w:i/>
+        </w:rPr>
+        <w:t xml:space="preserve">”</w:t>
       </w:r>
     </w:p>
     <w:p>
@@ -5825,17 +5491,29 @@
         <w:pStyle w:val="Compact"/>
       </w:pPr>
       <w:r>
-        <w:t xml:space="preserve">占 Incepedia 总量 ~10–15%</w:t>
+        <w:t xml:space="preserve">每 1000 条采样 50 条,统计开头短语 top-20,发现新的单调模式 → 自动加入禁用清单</w:t>
+      </w:r>
+    </w:p>
+    <w:p>
+      <w:pPr>
+        <w:numPr>
+          <w:ilvl w:val="0"/>
+          <w:numId w:val="1012"/>
+        </w:numPr>
+        <w:pStyle w:val="Compact"/>
+      </w:pPr>
+      <w:r>
+        <w:t xml:space="preserve">成本极低(每 1000 条 &lt;$0.1 审计),但对防塌方至关重要</w:t>
       </w:r>
     </w:p>
     <w:bookmarkEnd w:id="46"/>
-    <w:bookmarkStart w:id="47" w:name="c14-风格反单调化anti-monotone"/>
+    <w:bookmarkStart w:id="47" w:name="X8bb167a5b9582493873401e17e5011e36d8d06f"/>
     <w:p>
       <w:pPr>
         <w:pStyle w:val="Heading3"/>
       </w:pPr>
       <w:r>
-        <w:t xml:space="preserve">C14 · 风格反单调化(anti-monotone)</w:t>
+        <w:t xml:space="preserve">C15 · Web rephrasing 主路径(Nemotron / WRAP / Phi-4 路线)</w:t>
       </w:r>
     </w:p>
     <w:p>
@@ -5847,19 +5525,98 @@
         <w:pStyle w:val="Compact"/>
       </w:pPr>
       <w:r>
-        <w:t xml:space="preserve">维护</w:t>
+        <w:rPr>
+          <w:bCs/>
+          <w:b/>
+        </w:rPr>
+        <w:t xml:space="preserve">除了</w:t>
       </w:r>
       <w:r>
         <w:t xml:space="preserve"> </w:t>
       </w:r>
       <w:r>
+        <w:t xml:space="preserve">“</w:t>
+      </w:r>
+      <w:r>
+        <w:t xml:space="preserve">textbook from web seed</w:t>
+      </w:r>
+      <w:r>
+        <w:t xml:space="preserve">”</w:t>
+      </w:r>
+      <w:r>
+        <w:t xml:space="preserve">(Cosmopedia 式重建),新增 **“rephrase this web text into</w:t>
+      </w:r>
+    </w:p>
+    <w:p>
+      <w:pPr>
+        <w:numPr>
+          <w:ilvl w:val="0"/>
+          <w:numId w:val="1000"/>
+        </w:numPr>
+        <w:pStyle w:val="Compact"/>
+      </w:pPr>
+      <w:r>
+        <w:t xml:space="preserve">“**(直接改写):</w:t>
+      </w:r>
+    </w:p>
+    <w:p>
+      <w:pPr>
+        <w:numPr>
+          <w:ilvl w:val="1"/>
+          <w:numId w:val="1014"/>
+        </w:numPr>
+        <w:pStyle w:val="Compact"/>
+      </w:pPr>
+      <w:r>
         <w:rPr>
           <w:rStyle w:val="VerbatimChar"/>
         </w:rPr>
-        <w:t xml:space="preserve">configs/disallowed_openings.yaml</w:t>
-      </w:r>
-      <w:r>
-        <w:t xml:space="preserve">:持续扩充的”禁用开头短语”列表</w:t>
+        <w:t xml:space="preserve">rephrase_as_textbook_chapter</w:t>
+      </w:r>
+    </w:p>
+    <w:p>
+      <w:pPr>
+        <w:numPr>
+          <w:ilvl w:val="1"/>
+          <w:numId w:val="1014"/>
+        </w:numPr>
+        <w:pStyle w:val="Compact"/>
+      </w:pPr>
+      <w:r>
+        <w:rPr>
+          <w:rStyle w:val="VerbatimChar"/>
+        </w:rPr>
+        <w:t xml:space="preserve">rephrase_as_qa_dialogue</w:t>
+      </w:r>
+    </w:p>
+    <w:p>
+      <w:pPr>
+        <w:numPr>
+          <w:ilvl w:val="1"/>
+          <w:numId w:val="1014"/>
+        </w:numPr>
+        <w:pStyle w:val="Compact"/>
+      </w:pPr>
+      <w:r>
+        <w:rPr>
+          <w:rStyle w:val="VerbatimChar"/>
+        </w:rPr>
+        <w:t xml:space="preserve">rephrase_as_socratic_discussion</w:t>
+      </w:r>
+    </w:p>
+    <w:p>
+      <w:pPr>
+        <w:numPr>
+          <w:ilvl w:val="1"/>
+          <w:numId w:val="1014"/>
+        </w:numPr>
+        <w:pStyle w:val="Compact"/>
+      </w:pPr>
+      <w:r>
+        <w:rPr>
+          <w:rStyle w:val="VerbatimChar"/>
+        </w:rPr>
+        <w:t xml:space="preserve">rephrase_as_lecture_notes</w:t>
       </w:r>
     </w:p>
     <w:p>
@@ -5871,55 +5628,17 @@
         <w:pStyle w:val="Compact"/>
       </w:pPr>
       <w:r>
-        <w:t xml:space="preserve">Cosmopedia 著名案例:</w:t>
-      </w:r>
-      <w:r>
-        <w:t xml:space="preserve">“</w:t>
-      </w:r>
-      <w:r>
-        <w:t xml:space="preserve">Once upon a time</w:t>
-      </w:r>
-      <w:r>
-        <w:t xml:space="preserve">”</w:t>
-      </w:r>
-      <w:r>
-        <w:t xml:space="preserve">、</w:t>
-      </w:r>
-      <w:r>
-        <w:t xml:space="preserve">“</w:t>
-      </w:r>
-      <w:r>
-        <w:t xml:space="preserve">A few years back</w:t>
-      </w:r>
-      <w:r>
-        <w:t xml:space="preserve">”</w:t>
-      </w:r>
-      <w:r>
-        <w:t xml:space="preserve">、</w:t>
-      </w:r>
-      <w:r>
-        <w:t xml:space="preserve">“</w:t>
-      </w:r>
-      <w:r>
-        <w:t xml:space="preserve">In recent years</w:t>
-      </w:r>
-      <w:r>
-        <w:t xml:space="preserve">”</w:t>
-      </w:r>
-      <w:r>
-        <w:t xml:space="preserve">、</w:t>
-      </w:r>
-      <w:r>
-        <w:t xml:space="preserve">“</w:t>
-      </w:r>
-      <w:r>
-        <w:t xml:space="preserve">It was a sunny morning</w:t>
-      </w:r>
-      <w:r>
-        <w:t xml:space="preserve">”</w:t>
-      </w:r>
-      <w:r>
-        <w:t xml:space="preserve">…</w:t>
+        <w:t xml:space="preserve">这个路径</w:t>
+      </w:r>
+      <w:r>
+        <w:rPr>
+          <w:bCs/>
+          <w:b/>
+        </w:rPr>
+        <w:t xml:space="preserve">保留事实真实性</w:t>
+      </w:r>
+      <w:r>
+        <w:t xml:space="preserve">(因为是改写真实文本),大幅降低幻觉</w:t>
       </w:r>
     </w:p>
     <w:p>
@@ -5931,28 +5650,7 @@
         <w:pStyle w:val="Compact"/>
       </w:pPr>
       <w:r>
-        <w:t xml:space="preserve">每批生成前把这个列表注入 system prompt:</w:t>
-      </w:r>
-      <w:r>
-        <w:rPr>
-          <w:iCs/>
-          <w:i/>
-        </w:rPr>
-        <w:t xml:space="preserve">“</w:t>
-      </w:r>
-      <w:r>
-        <w:rPr>
-          <w:iCs/>
-          <w:i/>
-        </w:rPr>
-        <w:t xml:space="preserve">Do not begin with any of: [list]</w:t>
-      </w:r>
-      <w:r>
-        <w:rPr>
-          <w:iCs/>
-          <w:i/>
-        </w:rPr>
-        <w:t xml:space="preserve">”</w:t>
+        <w:t xml:space="preserve">Phi-4 / Nemotron-Synth / WRAP 均有证据表明 rephrasing 质量 ≥ 凭空生成</w:t>
       </w:r>
     </w:p>
     <w:p>
@@ -5964,7 +5662,11 @@
         <w:pStyle w:val="Compact"/>
       </w:pPr>
       <w:r>
-        <w:t xml:space="preserve">每 1000 条采样 50 条,统计开头短语 top-20,发现新的单调模式 → 自动加入禁用清单</w:t>
+        <w:rPr>
+          <w:bCs/>
+          <w:b/>
+        </w:rPr>
+        <w:t xml:space="preserve">和 Cosmopedia 式”seed 只当启发、内容自由发挥”的最大区别</w:t>
       </w:r>
     </w:p>
     <w:p>
@@ -5976,260 +5678,85 @@
         <w:pStyle w:val="Compact"/>
       </w:pPr>
       <w:r>
-        <w:t xml:space="preserve">成本极低(每 1000 条 &lt;$0.1 审计),但对防塌方至关重要</w:t>
+        <w:t xml:space="preserve">占 Incepedia 总量 ~40–50%(</w:t>
+      </w:r>
+      <w:r>
+        <w:rPr>
+          <w:bCs/>
+          <w:b/>
+        </w:rPr>
+        <w:t xml:space="preserve">主力路径</w:t>
+      </w:r>
+      <w:r>
+        <w:t xml:space="preserve">)</w:t>
       </w:r>
     </w:p>
     <w:bookmarkEnd w:id="47"/>
-    <w:bookmarkStart w:id="48" w:name="X8bb167a5b9582493873401e17e5011e36d8d06f"/>
+    <w:bookmarkStart w:id="48" w:name="c16-synthetic-贯穿-pretrain-全程phi-4-路线"/>
     <w:p>
       <w:pPr>
         <w:pStyle w:val="Heading3"/>
       </w:pPr>
       <w:r>
-        <w:t xml:space="preserve">C15 · Web rephrasing 主路径(Nemotron / WRAP / Phi-4 路线)</w:t>
+        <w:t xml:space="preserve">C16 · Synthetic 贯穿 pretrain 全程(Phi-4 路线)</w:t>
       </w:r>
     </w:p>
     <w:p>
       <w:pPr>
         <w:numPr>
           <w:ilvl w:val="0"/>
-          <w:numId w:val="1014"/>
-        </w:numPr>
-        <w:pStyle w:val="Compact"/>
-      </w:pPr>
-      <w:r>
-        <w:rPr>
-          <w:bCs/>
-          <w:b/>
-        </w:rPr>
-        <w:t xml:space="preserve">除了</w:t>
-      </w:r>
-      <w:r>
-        <w:t xml:space="preserve"> </w:t>
-      </w:r>
-      <w:r>
-        <w:t xml:space="preserve">“</w:t>
-      </w:r>
-      <w:r>
-        <w:t xml:space="preserve">textbook from web seed</w:t>
-      </w:r>
-      <w:r>
-        <w:t xml:space="preserve">”</w:t>
-      </w:r>
-      <w:r>
-        <w:t xml:space="preserve">(Cosmopedia 式重建),新增 **“rephrase this web text into</w:t>
-      </w:r>
-    </w:p>
-    <w:p>
-      <w:pPr>
-        <w:numPr>
-          <w:ilvl w:val="0"/>
-          <w:numId w:val="1000"/>
-        </w:numPr>
-        <w:pStyle w:val="Compact"/>
-      </w:pPr>
-      <w:r>
-        <w:t xml:space="preserve">“**(直接改写):</w:t>
-      </w:r>
-    </w:p>
-    <w:p>
-      <w:pPr>
-        <w:numPr>
-          <w:ilvl w:val="1"/>
           <w:numId w:val="1015"/>
         </w:numPr>
         <w:pStyle w:val="Compact"/>
       </w:pPr>
       <w:r>
-        <w:rPr>
-          <w:rStyle w:val="VerbatimChar"/>
-        </w:rPr>
-        <w:t xml:space="preserve">rephrase_as_textbook_chapter</w:t>
+        <w:t xml:space="preserve">这不是生成器决策,是</w:t>
+      </w:r>
+      <w:r>
+        <w:rPr>
+          <w:bCs/>
+          <w:b/>
+        </w:rPr>
+        <w:t xml:space="preserve">训练配方</w:t>
+      </w:r>
+      <w:r>
+        <w:t xml:space="preserve">决策</w:t>
       </w:r>
     </w:p>
     <w:p>
       <w:pPr>
         <w:numPr>
-          <w:ilvl w:val="1"/>
+          <w:ilvl w:val="0"/>
           <w:numId w:val="1015"/>
         </w:numPr>
         <w:pStyle w:val="Compact"/>
       </w:pPr>
       <w:r>
-        <w:rPr>
-          <w:rStyle w:val="VerbatimChar"/>
-        </w:rPr>
-        <w:t xml:space="preserve">rephrase_as_qa_dialogue</w:t>
+        <w:t xml:space="preserve">Phi-4 报告:12 epochs synthetic &gt; 1 epoch more unique web</w:t>
       </w:r>
     </w:p>
     <w:p>
       <w:pPr>
         <w:numPr>
-          <w:ilvl w:val="1"/>
+          <w:ilvl w:val="0"/>
           <w:numId w:val="1015"/>
         </w:numPr>
         <w:pStyle w:val="Compact"/>
       </w:pPr>
       <w:r>
-        <w:rPr>
-          <w:rStyle w:val="VerbatimChar"/>
-        </w:rPr>
-        <w:t xml:space="preserve">rephrase_as_socratic_discussion</w:t>
+        <w:t xml:space="preserve">含义:在”独立 corpus”场景(Track 1),Incepedia 应作为 100% 主力而非仅 cooldown;在”配料”场景(Track 2),评测其作为 decay 调料的 delta 增益</w:t>
       </w:r>
     </w:p>
     <w:p>
       <w:pPr>
         <w:numPr>
-          <w:ilvl w:val="1"/>
+          <w:ilvl w:val="0"/>
           <w:numId w:val="1015"/>
         </w:numPr>
         <w:pStyle w:val="Compact"/>
       </w:pPr>
       <w:r>
         <w:rPr>
-          <w:rStyle w:val="VerbatimChar"/>
-        </w:rPr>
-        <w:t xml:space="preserve">rephrase_as_lecture_notes</w:t>
-      </w:r>
-    </w:p>
-    <w:p>
-      <w:pPr>
-        <w:numPr>
-          <w:ilvl w:val="0"/>
-          <w:numId w:val="1014"/>
-        </w:numPr>
-        <w:pStyle w:val="Compact"/>
-      </w:pPr>
-      <w:r>
-        <w:t xml:space="preserve">这个路径</w:t>
-      </w:r>
-      <w:r>
-        <w:rPr>
-          <w:bCs/>
-          <w:b/>
-        </w:rPr>
-        <w:t xml:space="preserve">保留事实真实性</w:t>
-      </w:r>
-      <w:r>
-        <w:t xml:space="preserve">(因为是改写真实文本),大幅降低幻觉</w:t>
-      </w:r>
-    </w:p>
-    <w:p>
-      <w:pPr>
-        <w:numPr>
-          <w:ilvl w:val="0"/>
-          <w:numId w:val="1014"/>
-        </w:numPr>
-        <w:pStyle w:val="Compact"/>
-      </w:pPr>
-      <w:r>
-        <w:t xml:space="preserve">Phi-4 / Nemotron-Synth / WRAP 均有证据表明 rephrasing 质量 ≥ 凭空生成</w:t>
-      </w:r>
-    </w:p>
-    <w:p>
-      <w:pPr>
-        <w:numPr>
-          <w:ilvl w:val="0"/>
-          <w:numId w:val="1014"/>
-        </w:numPr>
-        <w:pStyle w:val="Compact"/>
-      </w:pPr>
-      <w:r>
-        <w:rPr>
-          <w:bCs/>
-          <w:b/>
-        </w:rPr>
-        <w:t xml:space="preserve">和 Cosmopedia 式”seed 只当启发、内容自由发挥”的最大区别</w:t>
-      </w:r>
-    </w:p>
-    <w:p>
-      <w:pPr>
-        <w:numPr>
-          <w:ilvl w:val="0"/>
-          <w:numId w:val="1014"/>
-        </w:numPr>
-        <w:pStyle w:val="Compact"/>
-      </w:pPr>
-      <w:r>
-        <w:t xml:space="preserve">占 Incepedia 总量 ~40–50%(</w:t>
-      </w:r>
-      <w:r>
-        <w:rPr>
-          <w:bCs/>
-          <w:b/>
-        </w:rPr>
-        <w:t xml:space="preserve">主力路径</w:t>
-      </w:r>
-      <w:r>
-        <w:t xml:space="preserve">)</w:t>
-      </w:r>
-    </w:p>
-    <w:bookmarkEnd w:id="48"/>
-    <w:bookmarkStart w:id="49" w:name="c16-synthetic-贯穿-pretrain-全程phi-4-路线"/>
-    <w:p>
-      <w:pPr>
-        <w:pStyle w:val="Heading3"/>
-      </w:pPr>
-      <w:r>
-        <w:t xml:space="preserve">C16 · Synthetic 贯穿 pretrain 全程(Phi-4 路线)</w:t>
-      </w:r>
-    </w:p>
-    <w:p>
-      <w:pPr>
-        <w:numPr>
-          <w:ilvl w:val="0"/>
-          <w:numId w:val="1016"/>
-        </w:numPr>
-        <w:pStyle w:val="Compact"/>
-      </w:pPr>
-      <w:r>
-        <w:t xml:space="preserve">这不是生成器决策,是</w:t>
-      </w:r>
-      <w:r>
-        <w:rPr>
-          <w:bCs/>
-          <w:b/>
-        </w:rPr>
-        <w:t xml:space="preserve">训练配方</w:t>
-      </w:r>
-      <w:r>
-        <w:t xml:space="preserve">决策</w:t>
-      </w:r>
-    </w:p>
-    <w:p>
-      <w:pPr>
-        <w:numPr>
-          <w:ilvl w:val="0"/>
-          <w:numId w:val="1016"/>
-        </w:numPr>
-        <w:pStyle w:val="Compact"/>
-      </w:pPr>
-      <w:r>
-        <w:t xml:space="preserve">Phi-4 报告:12 epochs synthetic &gt; 1 epoch more unique web</w:t>
-      </w:r>
-    </w:p>
-    <w:p>
-      <w:pPr>
-        <w:numPr>
-          <w:ilvl w:val="0"/>
-          <w:numId w:val="1016"/>
-        </w:numPr>
-        <w:pStyle w:val="Compact"/>
-      </w:pPr>
-      <w:r>
-        <w:t xml:space="preserve">对我们的含义:在”独立 corpus”场景(Track 1),Incepedia 应作为 100% 主力而非仅 cooldown;在”配料”场景(Track 2),评测其作为 decay 调料的 delta 增益</w:t>
-      </w:r>
-    </w:p>
-    <w:p>
-      <w:pPr>
-        <w:numPr>
-          <w:ilvl w:val="0"/>
-          <w:numId w:val="1016"/>
-        </w:numPr>
-        <w:pStyle w:val="Compact"/>
-      </w:pPr>
-      <w:r>
-        <w:rPr>
           <w:bCs/>
           <w:b/>
         </w:rPr>
@@ -6246,10 +5773,10 @@
         </w:pict>
       </w:r>
     </w:p>
+    <w:bookmarkEnd w:id="48"/>
     <w:bookmarkEnd w:id="49"/>
     <w:bookmarkEnd w:id="50"/>
-    <w:bookmarkEnd w:id="51"/>
-    <w:bookmarkStart w:id="53" w:name="为什么两条-track-互补一个都不能少"/>
+    <w:bookmarkStart w:id="52" w:name="为什么两条-track-互补一个都不能少"/>
     <w:p>
       <w:pPr>
         <w:pStyle w:val="Heading1"/>
@@ -6547,13 +6074,13 @@
           <w:bCs/>
           <w:b/>
         </w:rPr>
-        <w:t xml:space="preserve">Track 1 + Track 2 一起 = 完整覆盖 🆑 目标</w:t>
+        <w:t xml:space="preserve">Track 1 + Track 2 一起 = 完整覆盖</w:t>
       </w:r>
       <w:r>
         <w:t xml:space="preserve">(独立 corpus 与 decay 调料双场景)。少任何一个都不对等。</w:t>
       </w:r>
     </w:p>
-    <w:bookmarkStart w:id="52" w:name="协议选择规则自适应非配额"/>
+    <w:bookmarkStart w:id="51" w:name="协议选择规则自适应非配额"/>
     <w:p>
       <w:pPr>
         <w:pStyle w:val="Heading2"/>
@@ -6583,7 +6110,7 @@
       <w:pPr>
         <w:numPr>
           <w:ilvl w:val="0"/>
-          <w:numId w:val="1017"/>
+          <w:numId w:val="1016"/>
         </w:numPr>
         <w:pStyle w:val="Compact"/>
       </w:pPr>
@@ -6605,7 +6132,7 @@
       <w:pPr>
         <w:numPr>
           <w:ilvl w:val="0"/>
-          <w:numId w:val="1017"/>
+          <w:numId w:val="1016"/>
         </w:numPr>
         <w:pStyle w:val="Compact"/>
       </w:pPr>
@@ -6627,7 +6154,7 @@
       <w:pPr>
         <w:numPr>
           <w:ilvl w:val="0"/>
-          <w:numId w:val="1017"/>
+          <w:numId w:val="1016"/>
         </w:numPr>
         <w:pStyle w:val="Compact"/>
       </w:pPr>
@@ -6646,7 +6173,7 @@
       <w:pPr>
         <w:numPr>
           <w:ilvl w:val="0"/>
-          <w:numId w:val="1017"/>
+          <w:numId w:val="1016"/>
         </w:numPr>
         <w:pStyle w:val="Compact"/>
       </w:pPr>
@@ -6654,39 +6181,8 @@
         <w:t xml:space="preserve">预估自然分布:Track 1 ~15%、Track 2 ~85%(约 6 + 33 ≈ 40 次 ablation)</w:t>
       </w:r>
     </w:p>
-    <w:p>
-      <w:r>
-        <w:pict>
-          <v:rect style="width:0;height:1.5pt" o:hralign="center" o:hrstd="t" o:hr="t"/>
-        </w:pict>
-      </w:r>
-    </w:p>
-    <w:p>
-      <w:pPr>
-        <w:pStyle w:val="FirstParagraph"/>
-      </w:pPr>
-      <w:r>
-        <w:rPr>
-          <w:iCs/>
-          <w:i/>
-        </w:rPr>
-        <w:t xml:space="preserve">— 文档结束 —</w:t>
-      </w:r>
-    </w:p>
-    <w:p>
-      <w:pPr>
-        <w:pStyle w:val="BodyText"/>
-      </w:pPr>
-      <w:r>
-        <w:rPr>
-          <w:iCs/>
-          <w:i/>
-        </w:rPr>
-        <w:t xml:space="preserve">本文件由 agent 从历史对话中复制拼接,所有正文为对话原文。</w:t>
-      </w:r>
-    </w:p>
+    <w:bookmarkEnd w:id="51"/>
     <w:bookmarkEnd w:id="52"/>
-    <w:bookmarkEnd w:id="53"/>
     <w:sectPr/>
   </w:body>
 </w:document>
@@ -7024,6 +6520,9 @@
     <w:abstractNumId w:val="991"/>
   </w:num>
   <w:num w:numId="1005">
+    <w:abstractNumId w:val="991"/>
+  </w:num>
+  <w:num w:numId="1006">
     <w:abstractNumId w:val="99411"/>
     <w:lvlOverride w:ilvl="0">
       <w:startOverride w:val="1"/>
@@ -7053,10 +6552,16 @@
       <w:startOverride w:val="1"/>
     </w:lvlOverride>
   </w:num>
-  <w:num w:numId="1006">
+  <w:num w:numId="1007">
     <w:abstractNumId w:val="991"/>
   </w:num>
-  <w:num w:numId="1007">
+  <w:num w:numId="1008">
+    <w:abstractNumId w:val="991"/>
+  </w:num>
+  <w:num w:numId="1009">
+    <w:abstractNumId w:val="991"/>
+  </w:num>
+  <w:num w:numId="1010">
     <w:abstractNumId w:val="99411"/>
     <w:lvlOverride w:ilvl="0">
       <w:startOverride w:val="1"/>
@@ -7086,44 +6591,8 @@
       <w:startOverride w:val="1"/>
     </w:lvlOverride>
   </w:num>
-  <w:num w:numId="1008">
+  <w:num w:numId="1011">
     <w:abstractNumId w:val="991"/>
-  </w:num>
-  <w:num w:numId="1009">
-    <w:abstractNumId w:val="991"/>
-  </w:num>
-  <w:num w:numId="1010">
-    <w:abstractNumId w:val="991"/>
-  </w:num>
-  <w:num w:numId="1011">
-    <w:abstractNumId w:val="99411"/>
-    <w:lvlOverride w:ilvl="0">
-      <w:startOverride w:val="1"/>
-    </w:lvlOverride>
-    <w:lvlOverride w:ilvl="1">
-      <w:startOverride w:val="1"/>
-    </w:lvlOverride>
-    <w:lvlOverride w:ilvl="2">
-      <w:startOverride w:val="1"/>
-    </w:lvlOverride>
-    <w:lvlOverride w:ilvl="3">
-      <w:startOverride w:val="1"/>
-    </w:lvlOverride>
-    <w:lvlOverride w:ilvl="4">
-      <w:startOverride w:val="1"/>
-    </w:lvlOverride>
-    <w:lvlOverride w:ilvl="5">
-      <w:startOverride w:val="1"/>
-    </w:lvlOverride>
-    <w:lvlOverride w:ilvl="6">
-      <w:startOverride w:val="1"/>
-    </w:lvlOverride>
-    <w:lvlOverride w:ilvl="7">
-      <w:startOverride w:val="1"/>
-    </w:lvlOverride>
-    <w:lvlOverride w:ilvl="8">
-      <w:startOverride w:val="1"/>
-    </w:lvlOverride>
   </w:num>
   <w:num w:numId="1012">
     <w:abstractNumId w:val="991"/>
@@ -7138,9 +6607,6 @@
     <w:abstractNumId w:val="991"/>
   </w:num>
   <w:num w:numId="1016">
-    <w:abstractNumId w:val="991"/>
-  </w:num>
-  <w:num w:numId="1017">
     <w:abstractNumId w:val="991"/>
   </w:num>
 </w:numbering>

</xml_diff>

<commit_message>
feat(training): add Qwen3-1.7B as Protocol B working architecture
Made-with: Cursor
</commit_message>
<xml_diff>
--- a/docs/Incepedia-Overview.docx
+++ b/docs/Incepedia-Overview.docx
@@ -280,7 +280,7 @@
       </w:r>
     </w:p>
     <w:bookmarkEnd w:id="21"/>
-    <w:bookmarkStart w:id="25" w:name="incepedia-项目愿景与终极目标"/>
+    <w:bookmarkStart w:id="26" w:name="incepedia-项目愿景与终极目标"/>
     <w:p>
       <w:pPr>
         <w:pStyle w:val="Heading1"/>
@@ -465,19 +465,19 @@
               <w:jc w:val="left"/>
             </w:pPr>
             <w:r>
-              <w:t xml:space="preserve">复现 Cosmopedia v2 在 Track 2 + Cosmopedia v1 在 Track 1 的基线</w:t>
-            </w:r>
-          </w:p>
-        </w:tc>
-        <w:tc>
-          <w:tcPr/>
-          <w:p>
-            <w:pPr>
-              <w:pStyle w:val="Compact"/>
-              <w:jc w:val="left"/>
-            </w:pPr>
-            <w:r>
-              <w:t xml:space="preserve">分数对齐公开数字 ±0.5pp</w:t>
+              <w:t xml:space="preserve">复现 Cosmopedia v2 在 Protocol A(Llama2-1.82B)和 Protocol B(Qwen3-1.7B)上的基线</w:t>
+            </w:r>
+          </w:p>
+        </w:tc>
+        <w:tc>
+          <w:tcPr/>
+          <w:p>
+            <w:pPr>
+              <w:pStyle w:val="Compact"/>
+              <w:jc w:val="left"/>
+            </w:pPr>
+            <w:r>
+              <w:t xml:space="preserve">Protocol A 分数对齐 SmolLM/FineWeb 公开数字 ±0.5pp;Protocol B 自建基线</w:t>
             </w:r>
           </w:p>
         </w:tc>
@@ -507,7 +507,7 @@
               <w:jc w:val="left"/>
             </w:pPr>
             <w:r>
-              <w:t xml:space="preserve">3B token Incepedia v0.1</w:t>
+              <w:t xml:space="preserve">3B token Incepedia v0.1,Protocol B 两轨跑通</w:t>
             </w:r>
           </w:p>
         </w:tc>
@@ -549,24 +549,224 @@
               <w:jc w:val="left"/>
             </w:pPr>
             <w:r>
-              <w:t xml:space="preserve">10B–30B token Incepedia v1.0</w:t>
-            </w:r>
-          </w:p>
-        </w:tc>
-        <w:tc>
-          <w:tcPr/>
-          <w:p>
-            <w:pPr>
-              <w:pStyle w:val="Compact"/>
-              <w:jc w:val="left"/>
-            </w:pPr>
-            <w:r>
-              <w:t xml:space="preserve">两轨显著超越,逼近 SmolLM2</w:t>
+              <w:t xml:space="preserve">10B–30B token Incepedia v1.0,Protocol B 主跑;P3 末期 Protocol A 100B 终验</w:t>
+            </w:r>
+          </w:p>
+        </w:tc>
+        <w:tc>
+          <w:tcPr/>
+          <w:p>
+            <w:pPr>
+              <w:pStyle w:val="Compact"/>
+              <w:jc w:val="left"/>
+            </w:pPr>
+            <w:r>
+              <w:t xml:space="preserve">两架构两轨均显著超越,逼近 SmolLM2</w:t>
             </w:r>
           </w:p>
         </w:tc>
       </w:tr>
     </w:tbl>
+    <w:bookmarkEnd w:id="24"/>
+    <w:bookmarkStart w:id="25" w:name="双协议架构adr-0007"/>
+    <w:p>
+      <w:pPr>
+        <w:pStyle w:val="Heading2"/>
+      </w:pPr>
+      <w:r>
+        <w:t xml:space="preserve">2.4 双协议架构(ADR 0007)</w:t>
+      </w:r>
+    </w:p>
+    <w:tbl>
+      <w:tblPr>
+        <w:tblStyle w:val="Table"/>
+        <w:tblW w:type="pct" w:w="5000"/>
+        <w:tblLook w:firstRow="1" w:lastRow="0" w:firstColumn="0" w:lastColumn="0" w:noHBand="0" w:noVBand="0" w:val="0020"/>
+        <w:jc w:val="start"/>
+      </w:tblPr>
+      <w:tblGrid>
+        <w:gridCol w:w="1980"/>
+        <w:gridCol w:w="1980"/>
+        <w:gridCol w:w="1980"/>
+        <w:gridCol w:w="1980"/>
+      </w:tblGrid>
+      <w:tr>
+        <w:trPr>
+          <w:tblHeader w:val="true"/>
+        </w:trPr>
+        <w:tc>
+          <w:tcPr/>
+          <w:p>
+            <w:pPr>
+              <w:pStyle w:val="Compact"/>
+              <w:jc w:val="left"/>
+            </w:pPr>
+            <w:r>
+              <w:t xml:space="preserve">协议</w:t>
+            </w:r>
+          </w:p>
+        </w:tc>
+        <w:tc>
+          <w:tcPr/>
+          <w:p>
+            <w:pPr>
+              <w:pStyle w:val="Compact"/>
+              <w:jc w:val="left"/>
+            </w:pPr>
+            <w:r>
+              <w:t xml:space="preserve">架构</w:t>
+            </w:r>
+          </w:p>
+        </w:tc>
+        <w:tc>
+          <w:tcPr/>
+          <w:p>
+            <w:pPr>
+              <w:pStyle w:val="Compact"/>
+              <w:jc w:val="left"/>
+            </w:pPr>
+            <w:r>
+              <w:t xml:space="preserve">作用</w:t>
+            </w:r>
+          </w:p>
+        </w:tc>
+        <w:tc>
+          <w:tcPr/>
+          <w:p>
+            <w:pPr>
+              <w:pStyle w:val="Compact"/>
+              <w:jc w:val="left"/>
+            </w:pPr>
+            <w:r>
+              <w:t xml:space="preserve">项目频率</w:t>
+            </w:r>
+          </w:p>
+        </w:tc>
+      </w:tr>
+      <w:tr>
+        <w:tc>
+          <w:tcPr/>
+          <w:p>
+            <w:pPr>
+              <w:pStyle w:val="Compact"/>
+              <w:jc w:val="left"/>
+            </w:pPr>
+            <w:r>
+              <w:rPr>
+                <w:bCs/>
+                <w:b/>
+              </w:rPr>
+              <w:t xml:space="preserve">Protocol A</w:t>
+            </w:r>
+          </w:p>
+        </w:tc>
+        <w:tc>
+          <w:tcPr/>
+          <w:p>
+            <w:pPr>
+              <w:pStyle w:val="Compact"/>
+              <w:jc w:val="left"/>
+            </w:pPr>
+            <w:r>
+              <w:t xml:space="preserve">Llama2-1.82B(全注意力 / RoPE θ=1e4)</w:t>
+            </w:r>
+          </w:p>
+        </w:tc>
+        <w:tc>
+          <w:tcPr/>
+          <w:p>
+            <w:pPr>
+              <w:pStyle w:val="Compact"/>
+              <w:jc w:val="left"/>
+            </w:pPr>
+            <w:r>
+              <w:t xml:space="preserve">外部锚 — 对齐 SmolLM/FineWeb 公开数字,验证 pipeline 正确性</w:t>
+            </w:r>
+          </w:p>
+        </w:tc>
+        <w:tc>
+          <w:tcPr/>
+          <w:p>
+            <w:pPr>
+              <w:pStyle w:val="Compact"/>
+              <w:jc w:val="left"/>
+            </w:pPr>
+            <w:r>
+              <w:t xml:space="preserve">2 次</w:t>
+            </w:r>
+          </w:p>
+        </w:tc>
+      </w:tr>
+      <w:tr>
+        <w:tc>
+          <w:tcPr/>
+          <w:p>
+            <w:pPr>
+              <w:pStyle w:val="Compact"/>
+              <w:jc w:val="left"/>
+            </w:pPr>
+            <w:r>
+              <w:rPr>
+                <w:bCs/>
+                <w:b/>
+              </w:rPr>
+              <w:t xml:space="preserve">Protocol B</w:t>
+            </w:r>
+          </w:p>
+        </w:tc>
+        <w:tc>
+          <w:tcPr/>
+          <w:p>
+            <w:pPr>
+              <w:pStyle w:val="Compact"/>
+              <w:jc w:val="left"/>
+            </w:pPr>
+            <w:r>
+              <w:t xml:space="preserve">Qwen3-style 1.7B(GQA 8 KV / RoPE θ=1e6 / QKV bias)</w:t>
+            </w:r>
+          </w:p>
+        </w:tc>
+        <w:tc>
+          <w:tcPr/>
+          <w:p>
+            <w:pPr>
+              <w:pStyle w:val="Compact"/>
+              <w:jc w:val="left"/>
+            </w:pPr>
+            <w:r>
+              <w:t xml:space="preserve">工作架构 — 承担所有 Incepedia 版本演进 + 配比 ablation</w:t>
+            </w:r>
+          </w:p>
+        </w:tc>
+        <w:tc>
+          <w:tcPr/>
+          <w:p>
+            <w:pPr>
+              <w:pStyle w:val="Compact"/>
+              <w:jc w:val="left"/>
+            </w:pPr>
+            <w:r>
+              <w:t xml:space="preserve">~40 次</w:t>
+            </w:r>
+          </w:p>
+        </w:tc>
+      </w:tr>
+    </w:tbl>
+    <w:p>
+      <w:pPr>
+        <w:pStyle w:val="BodyText"/>
+      </w:pPr>
+      <w:r>
+        <w:rPr>
+          <w:bCs/>
+          <w:b/>
+        </w:rPr>
+        <w:t xml:space="preserve">唯一变量是架构</w:t>
+      </w:r>
+      <w:r>
+        <w:t xml:space="preserve">:tokenizer / 数据 / lr / batch / seeds / 评测脚本两协议完全一致。</w:t>
+      </w:r>
+    </w:p>
     <w:p>
       <w:r>
         <w:pict>
@@ -574,9 +774,9 @@
         </w:pict>
       </w:r>
     </w:p>
-    <w:bookmarkEnd w:id="24"/>
     <w:bookmarkEnd w:id="25"/>
-    <w:bookmarkStart w:id="26" w:name="incepedia-执行方案总体战略"/>
+    <w:bookmarkEnd w:id="26"/>
+    <w:bookmarkStart w:id="27" w:name="incepedia-执行方案总体战略"/>
     <w:p>
       <w:pPr>
         <w:pStyle w:val="Heading1"/>
@@ -625,8 +825,8 @@
         </w:pict>
       </w:r>
     </w:p>
-    <w:bookmarkEnd w:id="26"/>
-    <w:bookmarkStart w:id="29" w:name="第一步-百分百复现-cosmopedia-的训练评测管线"/>
+    <w:bookmarkEnd w:id="27"/>
+    <w:bookmarkStart w:id="30" w:name="第一步-百分百复现-cosmopedia-的训练评测管线"/>
     <w:p>
       <w:pPr>
         <w:pStyle w:val="Heading1"/>
@@ -653,7 +853,7 @@
         <w:t xml:space="preserve">,后续所有实验都跑在它之上,排除非数据因素。</w:t>
       </w:r>
     </w:p>
-    <w:bookmarkStart w:id="27" w:name="Xa3bf52df37fc4912eb5043f7b443d16f489c21e"/>
+    <w:bookmarkStart w:id="28" w:name="Xa3bf52df37fc4912eb5043f7b443d16f489c21e"/>
     <w:p>
       <w:pPr>
         <w:pStyle w:val="Heading2"/>
@@ -1058,8 +1258,8 @@
         </w:tc>
       </w:tr>
     </w:tbl>
-    <w:bookmarkEnd w:id="27"/>
-    <w:bookmarkStart w:id="28" w:name="落地-checklist按顺序"/>
+    <w:bookmarkEnd w:id="28"/>
+    <w:bookmarkStart w:id="29" w:name="落地-checklist按顺序"/>
     <w:p>
       <w:pPr>
         <w:pStyle w:val="Heading2"/>
@@ -1442,9 +1642,9 @@
         </w:pict>
       </w:r>
     </w:p>
-    <w:bookmarkEnd w:id="28"/>
     <w:bookmarkEnd w:id="29"/>
-    <w:bookmarkStart w:id="32" w:name="第二步-生成-incepedia"/>
+    <w:bookmarkEnd w:id="30"/>
+    <w:bookmarkStart w:id="33" w:name="第二步-生成-incepedia"/>
     <w:p>
       <w:pPr>
         <w:pStyle w:val="Heading1"/>
@@ -1453,7 +1653,7 @@
         <w:t xml:space="preserve">5. 第二步 · 生成 Incepedia</w:t>
       </w:r>
     </w:p>
-    <w:bookmarkStart w:id="30" w:name="大方向吸取-cosmopedia-的教训-20252026-最新经验"/>
+    <w:bookmarkStart w:id="31" w:name="大方向吸取-cosmopedia-的教训-20252026-最新经验"/>
     <w:p>
       <w:pPr>
         <w:pStyle w:val="Heading2"/>
@@ -1964,8 +2164,8 @@
         </w:tc>
       </w:tr>
     </w:tbl>
-    <w:bookmarkEnd w:id="30"/>
-    <w:bookmarkStart w:id="31" w:name="质量控制与去重"/>
+    <w:bookmarkEnd w:id="31"/>
+    <w:bookmarkStart w:id="32" w:name="质量控制与去重"/>
     <w:p>
       <w:pPr>
         <w:pStyle w:val="Heading2"/>
@@ -2095,9 +2295,9 @@
         </w:pict>
       </w:r>
     </w:p>
-    <w:bookmarkEnd w:id="31"/>
     <w:bookmarkEnd w:id="32"/>
-    <w:bookmarkStart w:id="33" w:name="关于量级是不是定-10b"/>
+    <w:bookmarkEnd w:id="33"/>
+    <w:bookmarkStart w:id="34" w:name="关于量级是不是定-10b"/>
     <w:p>
       <w:pPr>
         <w:pStyle w:val="Heading1"/>
@@ -2385,8 +2585,8 @@
         </w:pict>
       </w:r>
     </w:p>
-    <w:bookmarkEnd w:id="33"/>
-    <w:bookmarkStart w:id="38" w:name="什么是-ablation-training怎么用到-incepedia-生成里"/>
+    <w:bookmarkEnd w:id="34"/>
+    <w:bookmarkStart w:id="39" w:name="什么是-ablation-training怎么用到-incepedia-生成里"/>
     <w:p>
       <w:pPr>
         <w:pStyle w:val="Heading1"/>
@@ -2395,7 +2595,7 @@
         <w:t xml:space="preserve">7. 什么是 Ablation Training?怎么用到 Incepedia 生成里</w:t>
       </w:r>
     </w:p>
-    <w:bookmarkStart w:id="34" w:name="严格定义"/>
+    <w:bookmarkStart w:id="35" w:name="严格定义"/>
     <w:p>
       <w:pPr>
         <w:pStyle w:val="Heading2"/>
@@ -2467,8 +2667,8 @@
         <w:t xml:space="preserve">,看下游模型 benchmark 的差异。</w:t>
       </w:r>
     </w:p>
-    <w:bookmarkEnd w:id="34"/>
-    <w:bookmarkStart w:id="35" w:name="它和训完一个模型测一下的本质区别"/>
+    <w:bookmarkEnd w:id="35"/>
+    <w:bookmarkStart w:id="36" w:name="它和训完一个模型测一下的本质区别"/>
     <w:p>
       <w:pPr>
         <w:pStyle w:val="Heading2"/>
@@ -2530,8 +2730,8 @@
         <w:t xml:space="preserve">”</w:t>
       </w:r>
     </w:p>
-    <w:bookmarkEnd w:id="35"/>
-    <w:bookmarkStart w:id="36" w:name="用到-incepedia-生成的具体场景"/>
+    <w:bookmarkEnd w:id="36"/>
+    <w:bookmarkStart w:id="37" w:name="用到-incepedia-生成的具体场景"/>
     <w:p>
       <w:pPr>
         <w:pStyle w:val="Heading2"/>
@@ -3258,8 +3458,8 @@
         </w:tc>
       </w:tr>
     </w:tbl>
-    <w:bookmarkEnd w:id="36"/>
-    <w:bookmarkStart w:id="37" w:name="两个降本关键技巧"/>
+    <w:bookmarkEnd w:id="37"/>
+    <w:bookmarkStart w:id="38" w:name="两个降本关键技巧"/>
     <w:p>
       <w:pPr>
         <w:pStyle w:val="Heading2"/>
@@ -3331,9 +3531,9 @@
         </w:pict>
       </w:r>
     </w:p>
-    <w:bookmarkEnd w:id="37"/>
     <w:bookmarkEnd w:id="38"/>
-    <w:bookmarkStart w:id="42" w:name="当前在做的复现-cosmopedia-v2-reference-baseline"/>
+    <w:bookmarkEnd w:id="39"/>
+    <w:bookmarkStart w:id="43" w:name="当前在做的复现-cosmopedia-v2-reference-baseline"/>
     <w:p>
       <w:pPr>
         <w:pStyle w:val="Heading1"/>
@@ -3342,7 +3542,22 @@
         <w:t xml:space="preserve">8. 当前在做的:复现 Cosmopedia v2 reference baseline</w:t>
       </w:r>
     </w:p>
-    <w:bookmarkStart w:id="39" w:name="track-1-standalone独立-corpus-能力"/>
+    <w:p>
+      <w:pPr>
+        <w:pStyle w:val="BlockText"/>
+      </w:pPr>
+      <w:r>
+        <w:rPr>
+          <w:bCs/>
+          <w:b/>
+        </w:rPr>
+        <w:t xml:space="preserve">双协议架构</w:t>
+      </w:r>
+      <w:r>
+        <w:t xml:space="preserve">(ADR 0007):每个 Track 的训练在两个架构上分别跑——Protocol A(Llama2-1.82B)只作外部锚 2 次,Protocol B(Qwen3-1.7B)是日常工作架构,承担所有 Incepedia 版本演进。Tokenizer 两协议同用 Mistral-7B-v0.1,确保唯一变量是架构。</w:t>
+      </w:r>
+    </w:p>
+    <w:bookmarkStart w:id="40" w:name="track-1-standalone独立-corpus-能力"/>
     <w:p>
       <w:pPr>
         <w:pStyle w:val="Heading2"/>
@@ -3400,19 +3615,19 @@
               <w:jc w:val="left"/>
             </w:pPr>
             <w:r>
-              <w:t xml:space="preserve">协议</w:t>
-            </w:r>
-          </w:p>
-        </w:tc>
-        <w:tc>
-          <w:tcPr/>
-          <w:p>
-            <w:pPr>
-              <w:pStyle w:val="Compact"/>
-              <w:jc w:val="left"/>
-            </w:pPr>
-            <w:r>
-              <w:t xml:space="preserve">1.82B Llama2 从头训 × 30B tokens × 2 seeds,纯数据集(零 backbone)</w:t>
+              <w:t xml:space="preserve">Protocol A 协议</w:t>
+            </w:r>
+          </w:p>
+        </w:tc>
+        <w:tc>
+          <w:tcPr/>
+          <w:p>
+            <w:pPr>
+              <w:pStyle w:val="Compact"/>
+              <w:jc w:val="left"/>
+            </w:pPr>
+            <w:r>
+              <w:t xml:space="preserve">1.82B Llama2(全注意力 / RoPE θ=1e4 / 无 bias)从头训 × 30B tokens × 2 seeds</w:t>
             </w:r>
           </w:p>
         </w:tc>
@@ -3426,19 +3641,19 @@
               <w:jc w:val="left"/>
             </w:pPr>
             <w:r>
-              <w:t xml:space="preserve">单次墙钟</w:t>
-            </w:r>
-          </w:p>
-        </w:tc>
-        <w:tc>
-          <w:tcPr/>
-          <w:p>
-            <w:pPr>
-              <w:pStyle w:val="Compact"/>
-              <w:jc w:val="left"/>
-            </w:pPr>
-            <w:r>
-              <w:t xml:space="preserve">~2.1 天(8×H100)× 2 seeds = ~4.2 天</w:t>
+              <w:t xml:space="preserve">Protocol B 协议</w:t>
+            </w:r>
+          </w:p>
+        </w:tc>
+        <w:tc>
+          <w:tcPr/>
+          <w:p>
+            <w:pPr>
+              <w:pStyle w:val="Compact"/>
+              <w:jc w:val="left"/>
+            </w:pPr>
+            <w:r>
+              <w:t xml:space="preserve">1.7B Qwen3-style(GQA 8 KV / RoPE θ=1e6 / QKV bias)从头训 × 30B tokens × 2 seeds</w:t>
             </w:r>
           </w:p>
         </w:tc>
@@ -3452,19 +3667,19 @@
               <w:jc w:val="left"/>
             </w:pPr>
             <w:r>
-              <w:t xml:space="preserve">Milestone scale-up</w:t>
-            </w:r>
-          </w:p>
-        </w:tc>
-        <w:tc>
-          <w:tcPr/>
-          <w:p>
-            <w:pPr>
-              <w:pStyle w:val="Compact"/>
-              <w:jc w:val="left"/>
-            </w:pPr>
-            <w:r>
-              <w:t xml:space="preserve">1.82B × 100B × 1 seed = ~7 天</w:t>
+              <w:t xml:space="preserve">单次墙钟(A / B)</w:t>
+            </w:r>
+          </w:p>
+        </w:tc>
+        <w:tc>
+          <w:tcPr/>
+          <w:p>
+            <w:pPr>
+              <w:pStyle w:val="Compact"/>
+              <w:jc w:val="left"/>
+            </w:pPr>
+            <w:r>
+              <w:t xml:space="preserve">~2.1 天 / ~2.0 天(8×H100)× 2 seeds = ~4.2 / ~4.0 天</w:t>
             </w:r>
           </w:p>
         </w:tc>
@@ -3478,25 +3693,19 @@
               <w:jc w:val="left"/>
             </w:pPr>
             <w:r>
-              <w:t xml:space="preserve">适用问题</w:t>
-            </w:r>
-          </w:p>
-        </w:tc>
-        <w:tc>
-          <w:tcPr/>
-          <w:p>
-            <w:pPr>
-              <w:pStyle w:val="Compact"/>
-              <w:jc w:val="left"/>
-            </w:pPr>
-            <w:r>
-              <w:t xml:space="preserve">“</w:t>
-            </w:r>
-            <w:r>
-              <w:t xml:space="preserve">数据集 X 作为独立 pretraining corpus,和数据集 Y 相比如何?</w:t>
-            </w:r>
-            <w:r>
-              <w:t xml:space="preserve">”</w:t>
+              <w:t xml:space="preserve">Milestone scale-up</w:t>
+            </w:r>
+          </w:p>
+        </w:tc>
+        <w:tc>
+          <w:tcPr/>
+          <w:p>
+            <w:pPr>
+              <w:pStyle w:val="Compact"/>
+              <w:jc w:val="left"/>
+            </w:pPr>
+            <w:r>
+              <w:t xml:space="preserve">1.82B / 1.7B × 100B × 1 seed = ~7 / ~6.5 天</w:t>
             </w:r>
           </w:p>
         </w:tc>
@@ -3510,6 +3719,38 @@
               <w:jc w:val="left"/>
             </w:pPr>
             <w:r>
+              <w:t xml:space="preserve">适用问题</w:t>
+            </w:r>
+          </w:p>
+        </w:tc>
+        <w:tc>
+          <w:tcPr/>
+          <w:p>
+            <w:pPr>
+              <w:pStyle w:val="Compact"/>
+              <w:jc w:val="left"/>
+            </w:pPr>
+            <w:r>
+              <w:t xml:space="preserve">“</w:t>
+            </w:r>
+            <w:r>
+              <w:t xml:space="preserve">数据集 X 作为独立 pretraining corpus,和数据集 Y 相比如何?</w:t>
+            </w:r>
+            <w:r>
+              <w:t xml:space="preserve">”</w:t>
+            </w:r>
+          </w:p>
+        </w:tc>
+      </w:tr>
+      <w:tr>
+        <w:tc>
+          <w:tcPr/>
+          <w:p>
+            <w:pPr>
+              <w:pStyle w:val="Compact"/>
+              <w:jc w:val="left"/>
+            </w:pPr>
+            <w:r>
               <w:t xml:space="preserve">论文血脉</w:t>
             </w:r>
           </w:p>
@@ -3522,14 +3763,14 @@
               <w:jc w:val="left"/>
             </w:pPr>
             <w:r>
-              <w:t xml:space="preserve">Cosmopedia‑v1 / Cosmo‑1B / FineWeb ablation 协议的直接继承</w:t>
+              <w:t xml:space="preserve">Cosmopedia‑v1 / Cosmo‑1B / FineWeb ablation 协议的直接继承(Protocol A);Qwen3 论文(Protocol B)</w:t>
             </w:r>
           </w:p>
         </w:tc>
       </w:tr>
     </w:tbl>
-    <w:bookmarkEnd w:id="39"/>
-    <w:bookmarkStart w:id="40" w:name="track-2-seasoningdecay-调料能力"/>
+    <w:bookmarkEnd w:id="40"/>
+    <w:bookmarkStart w:id="41" w:name="track-2-seasoningdecay-调料能力"/>
     <w:p>
       <w:pPr>
         <w:pStyle w:val="Heading2"/>
@@ -3755,8 +3996,8 @@
         </w:tc>
       </w:tr>
     </w:tbl>
-    <w:bookmarkEnd w:id="40"/>
-    <w:bookmarkStart w:id="41" w:name="当前阶段的具体实验单"/>
+    <w:bookmarkEnd w:id="41"/>
+    <w:bookmarkStart w:id="42" w:name="当前阶段的具体实验单"/>
     <w:p>
       <w:pPr>
         <w:pStyle w:val="Heading2"/>
@@ -3774,7 +4015,7 @@
           <w:bCs/>
           <w:b/>
         </w:rPr>
-        <w:t xml:space="preserve">Track 1(里程碑级):</w:t>
+        <w:t xml:space="preserve">Track 1 · Protocol A(Llama2-1.82B 外部锚,仅 2 次):</w:t>
       </w:r>
     </w:p>
     <w:tbl>
@@ -3880,43 +4121,43 @@
               <w:jc w:val="left"/>
             </w:pPr>
             <w:r>
-              <w:t xml:space="preserve">1.82B × 30B × 纯 Cosmopedia v2</w:t>
-            </w:r>
-          </w:p>
-        </w:tc>
-        <w:tc>
-          <w:tcPr/>
-          <w:p>
-            <w:pPr>
-              <w:pStyle w:val="Compact"/>
-              <w:jc w:val="left"/>
-            </w:pPr>
-            <w:r>
-              <w:t xml:space="preserve">2</w:t>
-            </w:r>
-          </w:p>
-        </w:tc>
-        <w:tc>
-          <w:tcPr/>
-          <w:p>
-            <w:pPr>
-              <w:pStyle w:val="Compact"/>
-              <w:jc w:val="left"/>
-            </w:pPr>
-            <w:r>
-              <w:t xml:space="preserve">4.2 天</w:t>
-            </w:r>
-          </w:p>
-        </w:tc>
-        <w:tc>
-          <w:tcPr/>
-          <w:p>
-            <w:pPr>
-              <w:pStyle w:val="Compact"/>
-              <w:jc w:val="left"/>
-            </w:pPr>
-            <w:r>
-              <w:t xml:space="preserve">reference 基线,对齐 SmolLM 公布数字</w:t>
+              <w:t xml:space="preserve">Llama2-1.82B × 30B × 纯 Cosmopedia v2</w:t>
+            </w:r>
+          </w:p>
+        </w:tc>
+        <w:tc>
+          <w:tcPr/>
+          <w:p>
+            <w:pPr>
+              <w:pStyle w:val="Compact"/>
+              <w:jc w:val="left"/>
+            </w:pPr>
+            <w:r>
+              <w:t xml:space="preserve">1</w:t>
+            </w:r>
+          </w:p>
+        </w:tc>
+        <w:tc>
+          <w:tcPr/>
+          <w:p>
+            <w:pPr>
+              <w:pStyle w:val="Compact"/>
+              <w:jc w:val="left"/>
+            </w:pPr>
+            <w:r>
+              <w:t xml:space="preserve">2.1 天</w:t>
+            </w:r>
+          </w:p>
+        </w:tc>
+        <w:tc>
+          <w:tcPr/>
+          <w:p>
+            <w:pPr>
+              <w:pStyle w:val="Compact"/>
+              <w:jc w:val="left"/>
+            </w:pPr>
+            <w:r>
+              <w:t xml:space="preserve">外部锚 seed1</w:t>
             </w:r>
           </w:p>
         </w:tc>
@@ -3933,279 +4174,19 @@
               <w:rPr>
                 <w:rStyle w:val="VerbatimChar"/>
               </w:rPr>
-              <w:t xml:space="preserve">exp_inc_v01</w:t>
-            </w:r>
-          </w:p>
-        </w:tc>
-        <w:tc>
-          <w:tcPr/>
-          <w:p>
-            <w:pPr>
-              <w:pStyle w:val="Compact"/>
-              <w:jc w:val="left"/>
-            </w:pPr>
-            <w:r>
-              <w:t xml:space="preserve">1.82B × 30B × 纯 Incepedia v0.1</w:t>
-            </w:r>
-          </w:p>
-        </w:tc>
-        <w:tc>
-          <w:tcPr/>
-          <w:p>
-            <w:pPr>
-              <w:pStyle w:val="Compact"/>
-              <w:jc w:val="left"/>
-            </w:pPr>
-            <w:r>
-              <w:t xml:space="preserve">2</w:t>
-            </w:r>
-          </w:p>
-        </w:tc>
-        <w:tc>
-          <w:tcPr/>
-          <w:p>
-            <w:pPr>
-              <w:pStyle w:val="Compact"/>
-              <w:jc w:val="left"/>
-            </w:pPr>
-            <w:r>
-              <w:t xml:space="preserve">4.2 天</w:t>
-            </w:r>
-          </w:p>
-        </w:tc>
-        <w:tc>
-          <w:tcPr/>
-          <w:p>
-            <w:pPr>
-              <w:pStyle w:val="Compact"/>
-              <w:jc w:val="left"/>
-            </w:pPr>
-            <w:r>
-              <w:t xml:space="preserve">首次对标</w:t>
-            </w:r>
-          </w:p>
-        </w:tc>
-      </w:tr>
-      <w:tr>
-        <w:tc>
-          <w:tcPr/>
-          <w:p>
-            <w:pPr>
-              <w:pStyle w:val="Compact"/>
-              <w:jc w:val="left"/>
-            </w:pPr>
-            <w:r>
-              <w:rPr>
-                <w:rStyle w:val="VerbatimChar"/>
-              </w:rPr>
-              <w:t xml:space="preserve">exp_inc_v02</w:t>
-            </w:r>
-          </w:p>
-        </w:tc>
-        <w:tc>
-          <w:tcPr/>
-          <w:p>
-            <w:pPr>
-              <w:pStyle w:val="Compact"/>
-              <w:jc w:val="left"/>
-            </w:pPr>
-            <w:r>
-              <w:t xml:space="preserve">1.82B × 30B × 纯 Incepedia v0.2</w:t>
-            </w:r>
-          </w:p>
-        </w:tc>
-        <w:tc>
-          <w:tcPr/>
-          <w:p>
-            <w:pPr>
-              <w:pStyle w:val="Compact"/>
-              <w:jc w:val="left"/>
-            </w:pPr>
-            <w:r>
-              <w:t xml:space="preserve">2</w:t>
-            </w:r>
-          </w:p>
-        </w:tc>
-        <w:tc>
-          <w:tcPr/>
-          <w:p>
-            <w:pPr>
-              <w:pStyle w:val="Compact"/>
-              <w:jc w:val="left"/>
-            </w:pPr>
-            <w:r>
-              <w:t xml:space="preserve">4.2 天</w:t>
-            </w:r>
-          </w:p>
-        </w:tc>
-        <w:tc>
-          <w:tcPr/>
-          <w:p>
-            <w:pPr>
-              <w:pStyle w:val="Compact"/>
-              <w:jc w:val="left"/>
-            </w:pPr>
-            <w:r>
-              <w:t xml:space="preserve">第二轮迭代</w:t>
-            </w:r>
-          </w:p>
-        </w:tc>
-      </w:tr>
-      <w:tr>
-        <w:tc>
-          <w:tcPr/>
-          <w:p>
-            <w:pPr>
-              <w:pStyle w:val="Compact"/>
-              <w:jc w:val="left"/>
-            </w:pPr>
-            <w:r>
-              <w:rPr>
-                <w:rStyle w:val="VerbatimChar"/>
-              </w:rPr>
-              <w:t xml:space="preserve">exp_inc_v03</w:t>
-            </w:r>
-          </w:p>
-        </w:tc>
-        <w:tc>
-          <w:tcPr/>
-          <w:p>
-            <w:pPr>
-              <w:pStyle w:val="Compact"/>
-              <w:jc w:val="left"/>
-            </w:pPr>
-            <w:r>
-              <w:t xml:space="preserve">1.82B × 30B × 纯 Incepedia v0.3</w:t>
-            </w:r>
-          </w:p>
-        </w:tc>
-        <w:tc>
-          <w:tcPr/>
-          <w:p>
-            <w:pPr>
-              <w:pStyle w:val="Compact"/>
-              <w:jc w:val="left"/>
-            </w:pPr>
-            <w:r>
-              <w:t xml:space="preserve">2</w:t>
-            </w:r>
-          </w:p>
-        </w:tc>
-        <w:tc>
-          <w:tcPr/>
-          <w:p>
-            <w:pPr>
-              <w:pStyle w:val="Compact"/>
-              <w:jc w:val="left"/>
-            </w:pPr>
-            <w:r>
-              <w:t xml:space="preserve">4.2 天</w:t>
-            </w:r>
-          </w:p>
-        </w:tc>
-        <w:tc>
-          <w:tcPr/>
-          <w:p>
-            <w:pPr>
-              <w:pStyle w:val="Compact"/>
-              <w:jc w:val="left"/>
-            </w:pPr>
-            <w:r>
-              <w:t xml:space="preserve">第三轮</w:t>
-            </w:r>
-          </w:p>
-        </w:tc>
-      </w:tr>
-      <w:tr>
-        <w:tc>
-          <w:tcPr/>
-          <w:p>
-            <w:pPr>
-              <w:pStyle w:val="Compact"/>
-              <w:jc w:val="left"/>
-            </w:pPr>
-            <w:r>
-              <w:rPr>
-                <w:rStyle w:val="VerbatimChar"/>
-              </w:rPr>
-              <w:t xml:space="preserve">exp_inc_v10</w:t>
-            </w:r>
-          </w:p>
-        </w:tc>
-        <w:tc>
-          <w:tcPr/>
-          <w:p>
-            <w:pPr>
-              <w:pStyle w:val="Compact"/>
-              <w:jc w:val="left"/>
-            </w:pPr>
-            <w:r>
-              <w:t xml:space="preserve">1.82B × 30B × 纯 Incepedia v1.0</w:t>
-            </w:r>
-          </w:p>
-        </w:tc>
-        <w:tc>
-          <w:tcPr/>
-          <w:p>
-            <w:pPr>
-              <w:pStyle w:val="Compact"/>
-              <w:jc w:val="left"/>
-            </w:pPr>
-            <w:r>
-              <w:t xml:space="preserve">2</w:t>
-            </w:r>
-          </w:p>
-        </w:tc>
-        <w:tc>
-          <w:tcPr/>
-          <w:p>
-            <w:pPr>
-              <w:pStyle w:val="Compact"/>
-              <w:jc w:val="left"/>
-            </w:pPr>
-            <w:r>
-              <w:t xml:space="preserve">4.2 天</w:t>
-            </w:r>
-          </w:p>
-        </w:tc>
-        <w:tc>
-          <w:tcPr/>
-          <w:p>
-            <w:pPr>
-              <w:pStyle w:val="Compact"/>
-              <w:jc w:val="left"/>
-            </w:pPr>
-            <w:r>
-              <w:t xml:space="preserve">最终版本</w:t>
-            </w:r>
-          </w:p>
-        </w:tc>
-      </w:tr>
-      <w:tr>
-        <w:tc>
-          <w:tcPr/>
-          <w:p>
-            <w:pPr>
-              <w:pStyle w:val="Compact"/>
-              <w:jc w:val="left"/>
-            </w:pPr>
-            <w:r>
-              <w:rPr>
-                <w:rStyle w:val="VerbatimChar"/>
-              </w:rPr>
-              <w:t xml:space="preserve">exp_inc_v10_scale</w:t>
-            </w:r>
-          </w:p>
-        </w:tc>
-        <w:tc>
-          <w:tcPr/>
-          <w:p>
-            <w:pPr>
-              <w:pStyle w:val="Compact"/>
-              <w:jc w:val="left"/>
-            </w:pPr>
-            <w:r>
-              <w:t xml:space="preserve">1.82B × 100B × 纯 Incepedia v1.0</w:t>
+              <w:t xml:space="preserve">exp_ref_cosmopedia_v2_seed1337</w:t>
+            </w:r>
+          </w:p>
+        </w:tc>
+        <w:tc>
+          <w:tcPr/>
+          <w:p>
+            <w:pPr>
+              <w:pStyle w:val="Compact"/>
+              <w:jc w:val="left"/>
+            </w:pPr>
+            <w:r>
+              <w:t xml:space="preserve">Llama2-1.82B × 30B × 纯 Cosmopedia v2</w:t>
             </w:r>
           </w:p>
         </w:tc>
@@ -4229,19 +4210,19 @@
               <w:jc w:val="left"/>
             </w:pPr>
             <w:r>
-              <w:t xml:space="preserve">7 天</w:t>
-            </w:r>
-          </w:p>
-        </w:tc>
-        <w:tc>
-          <w:tcPr/>
-          <w:p>
-            <w:pPr>
-              <w:pStyle w:val="Compact"/>
-              <w:jc w:val="left"/>
-            </w:pPr>
-            <w:r>
-              <w:t xml:space="preserve">放大验收</w:t>
+              <w:t xml:space="preserve">2.1 天</w:t>
+            </w:r>
+          </w:p>
+        </w:tc>
+        <w:tc>
+          <w:tcPr/>
+          <w:p>
+            <w:pPr>
+              <w:pStyle w:val="Compact"/>
+              <w:jc w:val="left"/>
+            </w:pPr>
+            <w:r>
+              <w:t xml:space="preserve">外部锚 seed2,与 seed42 平均 = 对齐 SmolLM</w:t>
             </w:r>
           </w:p>
         </w:tc>
@@ -4256,7 +4237,7 @@
           <w:bCs/>
           <w:b/>
         </w:rPr>
-        <w:t xml:space="preserve">Track 2(Seasoning,共享 backbone + cooldown forks):</w:t>
+        <w:t xml:space="preserve">Track 1 · Protocol B(Qwen3-1.7B 工作架构,承担所有版本演进):</w:t>
       </w:r>
     </w:p>
     <w:tbl>
@@ -4350,19 +4331,19 @@
               <w:rPr>
                 <w:rStyle w:val="VerbatimChar"/>
               </w:rPr>
-              <w:t xml:space="preserve">backbone_fineweb_edu</w:t>
-            </w:r>
-          </w:p>
-        </w:tc>
-        <w:tc>
-          <w:tcPr/>
-          <w:p>
-            <w:pPr>
-              <w:pStyle w:val="Compact"/>
-              <w:jc w:val="left"/>
-            </w:pPr>
-            <w:r>
-              <w:t xml:space="preserve">1.82B × 20B 纯 FineWeb-Edu</w:t>
+              <w:t xml:space="preserve">exp_ref_cosmopedia_v2_qwen3_seed42</w:t>
+            </w:r>
+          </w:p>
+        </w:tc>
+        <w:tc>
+          <w:tcPr/>
+          <w:p>
+            <w:pPr>
+              <w:pStyle w:val="Compact"/>
+              <w:jc w:val="left"/>
+            </w:pPr>
+            <w:r>
+              <w:t xml:space="preserve">Qwen3-1.7B × 30B × 纯 Cosmopedia v2</w:t>
             </w:r>
           </w:p>
         </w:tc>
@@ -4386,7 +4367,554 @@
               <w:jc w:val="left"/>
             </w:pPr>
             <w:r>
-              <w:t xml:space="preserve">1.4 天</w:t>
+              <w:t xml:space="preserve">2.0 天</w:t>
+            </w:r>
+          </w:p>
+        </w:tc>
+        <w:tc>
+          <w:tcPr/>
+          <w:p>
+            <w:pPr>
+              <w:pStyle w:val="Compact"/>
+              <w:jc w:val="left"/>
+            </w:pPr>
+            <w:r>
+              <w:t xml:space="preserve">Protocol B 基线 seed1</w:t>
+            </w:r>
+          </w:p>
+        </w:tc>
+      </w:tr>
+      <w:tr>
+        <w:tc>
+          <w:tcPr/>
+          <w:p>
+            <w:pPr>
+              <w:pStyle w:val="Compact"/>
+              <w:jc w:val="left"/>
+            </w:pPr>
+            <w:r>
+              <w:rPr>
+                <w:rStyle w:val="VerbatimChar"/>
+              </w:rPr>
+              <w:t xml:space="preserve">exp_ref_cosmopedia_v2_qwen3_seed1337</w:t>
+            </w:r>
+          </w:p>
+        </w:tc>
+        <w:tc>
+          <w:tcPr/>
+          <w:p>
+            <w:pPr>
+              <w:pStyle w:val="Compact"/>
+              <w:jc w:val="left"/>
+            </w:pPr>
+            <w:r>
+              <w:t xml:space="preserve">Qwen3-1.7B × 30B × 纯 Cosmopedia v2</w:t>
+            </w:r>
+          </w:p>
+        </w:tc>
+        <w:tc>
+          <w:tcPr/>
+          <w:p>
+            <w:pPr>
+              <w:pStyle w:val="Compact"/>
+              <w:jc w:val="left"/>
+            </w:pPr>
+            <w:r>
+              <w:t xml:space="preserve">1</w:t>
+            </w:r>
+          </w:p>
+        </w:tc>
+        <w:tc>
+          <w:tcPr/>
+          <w:p>
+            <w:pPr>
+              <w:pStyle w:val="Compact"/>
+              <w:jc w:val="left"/>
+            </w:pPr>
+            <w:r>
+              <w:t xml:space="preserve">2.0 天</w:t>
+            </w:r>
+          </w:p>
+        </w:tc>
+        <w:tc>
+          <w:tcPr/>
+          <w:p>
+            <w:pPr>
+              <w:pStyle w:val="Compact"/>
+              <w:jc w:val="left"/>
+            </w:pPr>
+            <w:r>
+              <w:t xml:space="preserve">Protocol B 基线 seed2</w:t>
+            </w:r>
+          </w:p>
+        </w:tc>
+      </w:tr>
+      <w:tr>
+        <w:tc>
+          <w:tcPr/>
+          <w:p>
+            <w:pPr>
+              <w:pStyle w:val="Compact"/>
+              <w:jc w:val="left"/>
+            </w:pPr>
+            <w:r>
+              <w:rPr>
+                <w:rStyle w:val="VerbatimChar"/>
+              </w:rPr>
+              <w:t xml:space="preserve">exp_inc_v01_qwen3_seed{42,1337}</w:t>
+            </w:r>
+          </w:p>
+        </w:tc>
+        <w:tc>
+          <w:tcPr/>
+          <w:p>
+            <w:pPr>
+              <w:pStyle w:val="Compact"/>
+              <w:jc w:val="left"/>
+            </w:pPr>
+            <w:r>
+              <w:t xml:space="preserve">Qwen3-1.7B × 30B × Incepedia v0.1</w:t>
+            </w:r>
+          </w:p>
+        </w:tc>
+        <w:tc>
+          <w:tcPr/>
+          <w:p>
+            <w:pPr>
+              <w:pStyle w:val="Compact"/>
+              <w:jc w:val="left"/>
+            </w:pPr>
+            <w:r>
+              <w:t xml:space="preserve">2</w:t>
+            </w:r>
+          </w:p>
+        </w:tc>
+        <w:tc>
+          <w:tcPr/>
+          <w:p>
+            <w:pPr>
+              <w:pStyle w:val="Compact"/>
+              <w:jc w:val="left"/>
+            </w:pPr>
+            <w:r>
+              <w:t xml:space="preserve">4.0 天</w:t>
+            </w:r>
+          </w:p>
+        </w:tc>
+        <w:tc>
+          <w:tcPr/>
+          <w:p>
+            <w:pPr>
+              <w:pStyle w:val="Compact"/>
+              <w:jc w:val="left"/>
+            </w:pPr>
+            <w:r>
+              <w:t xml:space="preserve">首次对标</w:t>
+            </w:r>
+          </w:p>
+        </w:tc>
+      </w:tr>
+      <w:tr>
+        <w:tc>
+          <w:tcPr/>
+          <w:p>
+            <w:pPr>
+              <w:pStyle w:val="Compact"/>
+              <w:jc w:val="left"/>
+            </w:pPr>
+            <w:r>
+              <w:rPr>
+                <w:rStyle w:val="VerbatimChar"/>
+              </w:rPr>
+              <w:t xml:space="preserve">exp_inc_v02_qwen3_*</w:t>
+            </w:r>
+          </w:p>
+        </w:tc>
+        <w:tc>
+          <w:tcPr/>
+          <w:p>
+            <w:pPr>
+              <w:pStyle w:val="Compact"/>
+              <w:jc w:val="left"/>
+            </w:pPr>
+            <w:r>
+              <w:t xml:space="preserve">Qwen3-1.7B × 30B × Incepedia v0.2</w:t>
+            </w:r>
+          </w:p>
+        </w:tc>
+        <w:tc>
+          <w:tcPr/>
+          <w:p>
+            <w:pPr>
+              <w:pStyle w:val="Compact"/>
+              <w:jc w:val="left"/>
+            </w:pPr>
+            <w:r>
+              <w:t xml:space="preserve">2</w:t>
+            </w:r>
+          </w:p>
+        </w:tc>
+        <w:tc>
+          <w:tcPr/>
+          <w:p>
+            <w:pPr>
+              <w:pStyle w:val="Compact"/>
+              <w:jc w:val="left"/>
+            </w:pPr>
+            <w:r>
+              <w:t xml:space="preserve">4.0 天</w:t>
+            </w:r>
+          </w:p>
+        </w:tc>
+        <w:tc>
+          <w:tcPr/>
+          <w:p>
+            <w:pPr>
+              <w:pStyle w:val="Compact"/>
+              <w:jc w:val="left"/>
+            </w:pPr>
+            <w:r>
+              <w:t xml:space="preserve">第二轮迭代</w:t>
+            </w:r>
+          </w:p>
+        </w:tc>
+      </w:tr>
+      <w:tr>
+        <w:tc>
+          <w:tcPr/>
+          <w:p>
+            <w:pPr>
+              <w:pStyle w:val="Compact"/>
+              <w:jc w:val="left"/>
+            </w:pPr>
+            <w:r>
+              <w:rPr>
+                <w:rStyle w:val="VerbatimChar"/>
+              </w:rPr>
+              <w:t xml:space="preserve">exp_inc_v03_qwen3_*</w:t>
+            </w:r>
+          </w:p>
+        </w:tc>
+        <w:tc>
+          <w:tcPr/>
+          <w:p>
+            <w:pPr>
+              <w:pStyle w:val="Compact"/>
+              <w:jc w:val="left"/>
+            </w:pPr>
+            <w:r>
+              <w:t xml:space="preserve">Qwen3-1.7B × 30B × Incepedia v0.3</w:t>
+            </w:r>
+          </w:p>
+        </w:tc>
+        <w:tc>
+          <w:tcPr/>
+          <w:p>
+            <w:pPr>
+              <w:pStyle w:val="Compact"/>
+              <w:jc w:val="left"/>
+            </w:pPr>
+            <w:r>
+              <w:t xml:space="preserve">2</w:t>
+            </w:r>
+          </w:p>
+        </w:tc>
+        <w:tc>
+          <w:tcPr/>
+          <w:p>
+            <w:pPr>
+              <w:pStyle w:val="Compact"/>
+              <w:jc w:val="left"/>
+            </w:pPr>
+            <w:r>
+              <w:t xml:space="preserve">4.0 天</w:t>
+            </w:r>
+          </w:p>
+        </w:tc>
+        <w:tc>
+          <w:tcPr/>
+          <w:p>
+            <w:pPr>
+              <w:pStyle w:val="Compact"/>
+              <w:jc w:val="left"/>
+            </w:pPr>
+            <w:r>
+              <w:t xml:space="preserve">第三轮</w:t>
+            </w:r>
+          </w:p>
+        </w:tc>
+      </w:tr>
+      <w:tr>
+        <w:tc>
+          <w:tcPr/>
+          <w:p>
+            <w:pPr>
+              <w:pStyle w:val="Compact"/>
+              <w:jc w:val="left"/>
+            </w:pPr>
+            <w:r>
+              <w:rPr>
+                <w:rStyle w:val="VerbatimChar"/>
+              </w:rPr>
+              <w:t xml:space="preserve">exp_inc_v10_qwen3_*</w:t>
+            </w:r>
+          </w:p>
+        </w:tc>
+        <w:tc>
+          <w:tcPr/>
+          <w:p>
+            <w:pPr>
+              <w:pStyle w:val="Compact"/>
+              <w:jc w:val="left"/>
+            </w:pPr>
+            <w:r>
+              <w:t xml:space="preserve">Qwen3-1.7B × 30B × Incepedia v1.0</w:t>
+            </w:r>
+          </w:p>
+        </w:tc>
+        <w:tc>
+          <w:tcPr/>
+          <w:p>
+            <w:pPr>
+              <w:pStyle w:val="Compact"/>
+              <w:jc w:val="left"/>
+            </w:pPr>
+            <w:r>
+              <w:t xml:space="preserve">2</w:t>
+            </w:r>
+          </w:p>
+        </w:tc>
+        <w:tc>
+          <w:tcPr/>
+          <w:p>
+            <w:pPr>
+              <w:pStyle w:val="Compact"/>
+              <w:jc w:val="left"/>
+            </w:pPr>
+            <w:r>
+              <w:t xml:space="preserve">4.0 天</w:t>
+            </w:r>
+          </w:p>
+        </w:tc>
+        <w:tc>
+          <w:tcPr/>
+          <w:p>
+            <w:pPr>
+              <w:pStyle w:val="Compact"/>
+              <w:jc w:val="left"/>
+            </w:pPr>
+            <w:r>
+              <w:t xml:space="preserve">最终版本</w:t>
+            </w:r>
+          </w:p>
+        </w:tc>
+      </w:tr>
+      <w:tr>
+        <w:tc>
+          <w:tcPr/>
+          <w:p>
+            <w:pPr>
+              <w:pStyle w:val="Compact"/>
+              <w:jc w:val="left"/>
+            </w:pPr>
+            <w:r>
+              <w:rPr>
+                <w:rStyle w:val="VerbatimChar"/>
+              </w:rPr>
+              <w:t xml:space="preserve">exp_inc_v10_qwen3_scale</w:t>
+            </w:r>
+          </w:p>
+        </w:tc>
+        <w:tc>
+          <w:tcPr/>
+          <w:p>
+            <w:pPr>
+              <w:pStyle w:val="Compact"/>
+              <w:jc w:val="left"/>
+            </w:pPr>
+            <w:r>
+              <w:t xml:space="preserve">Qwen3-1.7B × 100B × Incepedia v1.0</w:t>
+            </w:r>
+          </w:p>
+        </w:tc>
+        <w:tc>
+          <w:tcPr/>
+          <w:p>
+            <w:pPr>
+              <w:pStyle w:val="Compact"/>
+              <w:jc w:val="left"/>
+            </w:pPr>
+            <w:r>
+              <w:t xml:space="preserve">1</w:t>
+            </w:r>
+          </w:p>
+        </w:tc>
+        <w:tc>
+          <w:tcPr/>
+          <w:p>
+            <w:pPr>
+              <w:pStyle w:val="Compact"/>
+              <w:jc w:val="left"/>
+            </w:pPr>
+            <w:r>
+              <w:t xml:space="preserve">6.5 天</w:t>
+            </w:r>
+          </w:p>
+        </w:tc>
+        <w:tc>
+          <w:tcPr/>
+          <w:p>
+            <w:pPr>
+              <w:pStyle w:val="Compact"/>
+              <w:jc w:val="left"/>
+            </w:pPr>
+            <w:r>
+              <w:t xml:space="preserve">放大验收</w:t>
+            </w:r>
+          </w:p>
+        </w:tc>
+      </w:tr>
+    </w:tbl>
+    <w:p>
+      <w:pPr>
+        <w:pStyle w:val="BodyText"/>
+      </w:pPr>
+      <w:r>
+        <w:rPr>
+          <w:bCs/>
+          <w:b/>
+        </w:rPr>
+        <w:t xml:space="preserve">Track 2 · Protocol B(Seasoning,共享 backbone + cooldown forks):</w:t>
+      </w:r>
+    </w:p>
+    <w:tbl>
+      <w:tblPr>
+        <w:tblStyle w:val="Table"/>
+        <w:tblW w:type="pct" w:w="5000"/>
+        <w:tblLook w:firstRow="1" w:lastRow="0" w:firstColumn="0" w:lastColumn="0" w:noHBand="0" w:noVBand="0" w:val="0020"/>
+        <w:jc w:val="start"/>
+      </w:tblPr>
+      <w:tblGrid>
+        <w:gridCol w:w="1584"/>
+        <w:gridCol w:w="1584"/>
+        <w:gridCol w:w="1584"/>
+        <w:gridCol w:w="1584"/>
+        <w:gridCol w:w="1584"/>
+      </w:tblGrid>
+      <w:tr>
+        <w:trPr>
+          <w:tblHeader w:val="true"/>
+        </w:trPr>
+        <w:tc>
+          <w:tcPr/>
+          <w:p>
+            <w:pPr>
+              <w:pStyle w:val="Compact"/>
+              <w:jc w:val="left"/>
+            </w:pPr>
+            <w:r>
+              <w:t xml:space="preserve">exp_id</w:t>
+            </w:r>
+          </w:p>
+        </w:tc>
+        <w:tc>
+          <w:tcPr/>
+          <w:p>
+            <w:pPr>
+              <w:pStyle w:val="Compact"/>
+              <w:jc w:val="left"/>
+            </w:pPr>
+            <w:r>
+              <w:t xml:space="preserve">协议</w:t>
+            </w:r>
+          </w:p>
+        </w:tc>
+        <w:tc>
+          <w:tcPr/>
+          <w:p>
+            <w:pPr>
+              <w:pStyle w:val="Compact"/>
+              <w:jc w:val="left"/>
+            </w:pPr>
+            <w:r>
+              <w:t xml:space="preserve">seeds</w:t>
+            </w:r>
+          </w:p>
+        </w:tc>
+        <w:tc>
+          <w:tcPr/>
+          <w:p>
+            <w:pPr>
+              <w:pStyle w:val="Compact"/>
+              <w:jc w:val="left"/>
+            </w:pPr>
+            <w:r>
+              <w:t xml:space="preserve">墙钟</w:t>
+            </w:r>
+          </w:p>
+        </w:tc>
+        <w:tc>
+          <w:tcPr/>
+          <w:p>
+            <w:pPr>
+              <w:pStyle w:val="Compact"/>
+              <w:jc w:val="left"/>
+            </w:pPr>
+            <w:r>
+              <w:t xml:space="preserve">目的</w:t>
+            </w:r>
+          </w:p>
+        </w:tc>
+      </w:tr>
+      <w:tr>
+        <w:tc>
+          <w:tcPr/>
+          <w:p>
+            <w:pPr>
+              <w:pStyle w:val="Compact"/>
+              <w:jc w:val="left"/>
+            </w:pPr>
+            <w:r>
+              <w:rPr>
+                <w:rStyle w:val="VerbatimChar"/>
+              </w:rPr>
+              <w:t xml:space="preserve">backbone_fineweb_edu_qwen3</w:t>
+            </w:r>
+          </w:p>
+        </w:tc>
+        <w:tc>
+          <w:tcPr/>
+          <w:p>
+            <w:pPr>
+              <w:pStyle w:val="Compact"/>
+              <w:jc w:val="left"/>
+            </w:pPr>
+            <w:r>
+              <w:t xml:space="preserve">Qwen3-1.7B × 20B 纯 FineWeb-Edu</w:t>
+            </w:r>
+          </w:p>
+        </w:tc>
+        <w:tc>
+          <w:tcPr/>
+          <w:p>
+            <w:pPr>
+              <w:pStyle w:val="Compact"/>
+              <w:jc w:val="left"/>
+            </w:pPr>
+            <w:r>
+              <w:t xml:space="preserve">1</w:t>
+            </w:r>
+          </w:p>
+        </w:tc>
+        <w:tc>
+          <w:tcPr/>
+          <w:p>
+            <w:pPr>
+              <w:pStyle w:val="Compact"/>
+              <w:jc w:val="left"/>
+            </w:pPr>
+            <w:r>
+              <w:t xml:space="preserve">1.3 天</w:t>
             </w:r>
           </w:p>
         </w:tc>
@@ -4422,7 +4950,7 @@
               <w:rPr>
                 <w:rStyle w:val="VerbatimChar"/>
               </w:rPr>
-              <w:t xml:space="preserve">fork_cosmopedia_v2</w:t>
+              <w:t xml:space="preserve">fork_cosmopedia_v2_qwen3</w:t>
             </w:r>
           </w:p>
         </w:tc>
@@ -4458,7 +4986,7 @@
               <w:jc w:val="left"/>
             </w:pPr>
             <w:r>
-              <w:t xml:space="preserve">20 h</w:t>
+              <w:t xml:space="preserve">18 h</w:t>
             </w:r>
           </w:p>
         </w:tc>
@@ -4487,7 +5015,7 @@
               <w:rPr>
                 <w:rStyle w:val="VerbatimChar"/>
               </w:rPr>
-              <w:t xml:space="preserve">fork_inc_v01</w:t>
+              <w:t xml:space="preserve">fork_inc_v01_qwen3</w:t>
             </w:r>
           </w:p>
         </w:tc>
@@ -4523,7 +5051,7 @@
               <w:jc w:val="left"/>
             </w:pPr>
             <w:r>
-              <w:t xml:space="preserve">20 h</w:t>
+              <w:t xml:space="preserve">18 h</w:t>
             </w:r>
           </w:p>
         </w:tc>
@@ -4594,7 +5122,7 @@
               <w:jc w:val="left"/>
             </w:pPr>
             <w:r>
-              <w:t xml:space="preserve">10 h each</w:t>
+              <w:t xml:space="preserve">9 h each</w:t>
             </w:r>
           </w:p>
         </w:tc>
@@ -4612,6 +5140,34 @@
         </w:tc>
       </w:tr>
     </w:tbl>
+    <w:p>
+      <w:pPr>
+        <w:pStyle w:val="BodyText"/>
+      </w:pPr>
+      <w:r>
+        <w:rPr>
+          <w:bCs/>
+          <w:b/>
+        </w:rPr>
+        <w:t xml:space="preserve">项目训练总墙钟</w:t>
+      </w:r>
+      <w:r>
+        <w:t xml:space="preserve">:Protocol A ~4.2 天 + Protocol B ~40 天 ≈</w:t>
+      </w:r>
+      <w:r>
+        <w:t xml:space="preserve"> </w:t>
+      </w:r>
+      <w:r>
+        <w:rPr>
+          <w:bCs/>
+          <w:b/>
+        </w:rPr>
+        <w:t xml:space="preserve">~44 天</w:t>
+      </w:r>
+      <w:r>
+        <w:t xml:space="preserve">(8×H100,3 个月日历内有充裕余量)</w:t>
+      </w:r>
+    </w:p>
     <w:p>
       <w:r>
         <w:pict>
@@ -4619,9 +5175,9 @@
         </w:pict>
       </w:r>
     </w:p>
-    <w:bookmarkEnd w:id="41"/>
     <w:bookmarkEnd w:id="42"/>
-    <w:bookmarkStart w:id="50" w:name="修正后的-step-c-决策清单c1-c16"/>
+    <w:bookmarkEnd w:id="43"/>
+    <w:bookmarkStart w:id="51" w:name="修正后的-step-c-决策清单c1-c16"/>
     <w:p>
       <w:pPr>
         <w:pStyle w:val="Heading1"/>
@@ -4630,7 +5186,7 @@
         <w:t xml:space="preserve">9. 修正后的 Step C 决策清单(C1 – C16)</w:t>
       </w:r>
     </w:p>
-    <w:bookmarkStart w:id="43" w:name="基础策略c1-c4"/>
+    <w:bookmarkStart w:id="44" w:name="基础策略c1-c4"/>
     <w:p>
       <w:pPr>
         <w:pStyle w:val="Heading2"/>
@@ -4913,8 +5469,8 @@
         </w:tc>
       </w:tr>
     </w:tbl>
-    <w:bookmarkEnd w:id="43"/>
-    <w:bookmarkStart w:id="44" w:name="生成器-生产线c5-c12"/>
+    <w:bookmarkEnd w:id="44"/>
+    <w:bookmarkStart w:id="45" w:name="生成器-生产线c5-c12"/>
     <w:p>
       <w:pPr>
         <w:pStyle w:val="Heading2"/>
@@ -5258,8 +5814,8 @@
         </w:tc>
       </w:tr>
     </w:tbl>
-    <w:bookmarkEnd w:id="44"/>
-    <w:bookmarkStart w:id="49" w:name="关键超越点c13-c16新增"/>
+    <w:bookmarkEnd w:id="45"/>
+    <w:bookmarkStart w:id="50" w:name="关键超越点c13-c16新增"/>
     <w:p>
       <w:pPr>
         <w:pStyle w:val="Heading2"/>
@@ -5283,7 +5839,7 @@
         <w:t xml:space="preserve">。</w:t>
       </w:r>
     </w:p>
-    <w:bookmarkStart w:id="45" w:name="c13-instruction-reversalphi-4-方法"/>
+    <w:bookmarkStart w:id="46" w:name="c13-instruction-reversalphi-4-方法"/>
     <w:p>
       <w:pPr>
         <w:pStyle w:val="Heading3"/>
@@ -5355,8 +5911,8 @@
         <w:t xml:space="preserve">占 Incepedia 总量 ~10–15%</w:t>
       </w:r>
     </w:p>
-    <w:bookmarkEnd w:id="45"/>
-    <w:bookmarkStart w:id="46" w:name="c14-风格反单调化anti-monotone"/>
+    <w:bookmarkEnd w:id="46"/>
+    <w:bookmarkStart w:id="47" w:name="c14-风格反单调化anti-monotone"/>
     <w:p>
       <w:pPr>
         <w:pStyle w:val="Heading3"/>
@@ -5506,8 +6062,8 @@
         <w:t xml:space="preserve">成本极低(每 1000 条 &lt;$0.1 审计),但对防塌方至关重要</w:t>
       </w:r>
     </w:p>
-    <w:bookmarkEnd w:id="46"/>
-    <w:bookmarkStart w:id="47" w:name="X8bb167a5b9582493873401e17e5011e36d8d06f"/>
+    <w:bookmarkEnd w:id="47"/>
+    <w:bookmarkStart w:id="48" w:name="X8bb167a5b9582493873401e17e5011e36d8d06f"/>
     <w:p>
       <w:pPr>
         <w:pStyle w:val="Heading3"/>
@@ -5691,8 +6247,8 @@
         <w:t xml:space="preserve">)</w:t>
       </w:r>
     </w:p>
-    <w:bookmarkEnd w:id="47"/>
-    <w:bookmarkStart w:id="48" w:name="c16-synthetic-贯穿-pretrain-全程phi-4-路线"/>
+    <w:bookmarkEnd w:id="48"/>
+    <w:bookmarkStart w:id="49" w:name="c16-synthetic-贯穿-pretrain-全程phi-4-路线"/>
     <w:p>
       <w:pPr>
         <w:pStyle w:val="Heading3"/>
@@ -5773,10 +6329,10 @@
         </w:pict>
       </w:r>
     </w:p>
-    <w:bookmarkEnd w:id="48"/>
     <w:bookmarkEnd w:id="49"/>
     <w:bookmarkEnd w:id="50"/>
-    <w:bookmarkStart w:id="52" w:name="为什么两条-track-互补一个都不能少"/>
+    <w:bookmarkEnd w:id="51"/>
+    <w:bookmarkStart w:id="53" w:name="为什么两条-track-互补一个都不能少"/>
     <w:p>
       <w:pPr>
         <w:pStyle w:val="Heading1"/>
@@ -6080,7 +6636,7 @@
         <w:t xml:space="preserve">(独立 corpus 与 decay 调料双场景)。少任何一个都不对等。</w:t>
       </w:r>
     </w:p>
-    <w:bookmarkStart w:id="51" w:name="协议选择规则自适应非配额"/>
+    <w:bookmarkStart w:id="52" w:name="协议选择规则自适应非配额"/>
     <w:p>
       <w:pPr>
         <w:pStyle w:val="Heading2"/>
@@ -6181,8 +6737,8 @@
         <w:t xml:space="preserve">预估自然分布:Track 1 ~15%、Track 2 ~85%(约 6 + 33 ≈ 40 次 ablation)</w:t>
       </w:r>
     </w:p>
-    <w:bookmarkEnd w:id="51"/>
     <w:bookmarkEnd w:id="52"/>
+    <w:bookmarkEnd w:id="53"/>
     <w:sectPr/>
   </w:body>
 </w:document>

</xml_diff>